<commit_message>
feat: add automation scripts and updated Activity 4 Quarto document and deliveries
</commit_message>
<xml_diff>
--- a/Entregas/Actividad 4/TP4_Ayarachi_Fuentes.docx
+++ b/Entregas/Actividad 4/TP4_Ayarachi_Fuentes.docx
@@ -1640,7 +1640,7 @@
           <w:b/>
           <w:sz w:val="26"/>
         </w:rPr>
-        <w:t>Evaluación del Desempeño Docente y Factibilidad de Implementación de un Modelo de Retroalimentación 360° en el Departamento de Administración Pública del CURZAS-UNCo (2025–2026)</w:t>
+        <w:t>Evaluación del Desempeño Docente y Factibilidad de Implementación de un Modelo de Retroalimentación 360° en el Departamento de Administración Pública del CURZAS-UNCo (2027)</w:t>
       </w:r>
     </w:p>
     <w:p>
@@ -2205,7 +2205,7 @@
         <w:t xml:space="preserve"> </w:t>
       </w:r>
       <w:r>
-        <w:t xml:space="preserve">Bienio 2025–2026, período lectivo que enmarca la formulación del TFG bajo la vigencia del nuevo Estatuto UNCo (Ord. CS N° 0988/2025).</w:t>
+        <w:t xml:space="preserve">Ciclo lectivo 2027 (mayo a noviembre de 2027), período en el que se llevará a cabo el trabajo de campo empírico, la recolección y análisis de datos y la redacción final del TFG, bajo la plena vigencia del nuevo Estatuto UNCo (Ord. CS N° 0988/2025).</w:t>
       </w:r>
     </w:p>
     <w:p>
@@ -2398,7 +2398,7 @@
         <w:pStyle w:val="BlockText"/>
       </w:pPr>
       <w:r>
-        <w:t xml:space="preserve">¿Cuáles son las condiciones de factibilidad organizacional, técnica, normativa y de gobernanza multinivel para la implementación de un modelo de retroalimentación multiactoral (360°) en la evaluación del desempeño docente en el Departamento de Administración Pública del CURZAS-UNCo durante el período 2025–2026?</w:t>
+        <w:t xml:space="preserve">¿Cuáles son las condiciones de factibilidad organizacional, técnica, normativa y de gobernanza multinivel para la implementación de un modelo de retroalimentación multiactoral (360°) en la evaluación del desempeño docente en el Departamento de Administración Pública del CURZAS-UNCo durante el año 2027?</w:t>
       </w:r>
     </w:p>
     <w:bookmarkEnd w:id="22"/>
@@ -2554,7 +2554,7 @@
         </w:numPr>
       </w:pPr>
       <w:r>
-        <w:t xml:space="preserve">Determinar las condiciones de factibilidad organizacional, técnica, normativa y de gobernanza multinivel para la implementación de un modelo de retroalimentación multiactoral (360°) en la evaluación del desempeño docente en el Departamento de Administración Pública del CURZAS-UNCo (2025–2026).</w:t>
+        <w:t xml:space="preserve">Determinar las condiciones de factibilidad organizacional, técnica, normativa y de gobernanza multinivel para la implementación de un modelo de retroalimentación multiactoral (360°) en la evaluación del desempeño docente en el Departamento de Administración Pública del CURZAS-UNCo (2027).</w:t>
       </w:r>
     </w:p>
     <w:bookmarkEnd w:id="25"/>
@@ -4890,7 +4890,7 @@
         <w:t xml:space="preserve">(Hernández Sampieri et al., 2014)</w:t>
       </w:r>
       <w:r>
-        <w:t xml:space="preserve">, delimitado temporalmente al bienio 2025–2026.</w:t>
+        <w:t xml:space="preserve">, delimitado temporalmente al ciclo lectivo 2027.</w:t>
       </w:r>
     </w:p>
     <w:bookmarkEnd w:id="46"/>
@@ -6356,7 +6356,7 @@
         <w:pStyle w:val="FirstParagraph"/>
       </w:pPr>
       <w:r>
-        <w:t xml:space="preserve">Las actividades de investigación se estructuran en seis fases secuenciales coordinadas a lo largo de los 18 meses del cronograma:</w:t>
+        <w:t xml:space="preserve">Las actividades de investigación se estructuran en seis fases secuenciales coordinadas a lo largo de un lapso intensivo y viable de 7 meses de ejecución proyectados para el año 2027:</w:t>
       </w:r>
     </w:p>
     <w:p>
@@ -6372,7 +6372,7 @@
           <w:b/>
           <w:bCs/>
         </w:rPr>
-        <w:t xml:space="preserve">Fase 1: Preparación, diseño y avales (Meses 1–4 / Bim 1–2):</w:t>
+        <w:t xml:space="preserve">Fase 1: Preparación, diseño y avales (Mes 1 / Mayo 2027):</w:t>
       </w:r>
       <w:r>
         <w:t xml:space="preserve"> </w:t>
@@ -6410,7 +6410,7 @@
           <w:b/>
           <w:bCs/>
         </w:rPr>
-        <w:t xml:space="preserve">Fase 2: Relevamiento normativo y entrevistas (Meses 5–8 / Bim 3–4):</w:t>
+        <w:t xml:space="preserve">Fase 2: Relevamiento normativo y entrevistas (Mes 2 / Junio 2027):</w:t>
       </w:r>
       <w:r>
         <w:t xml:space="preserve"> </w:t>
@@ -6448,7 +6448,7 @@
           <w:b/>
           <w:bCs/>
         </w:rPr>
-        <w:t xml:space="preserve">Fase 3: Aplicación del sondeo exploratorio (Meses 8–10 / Bim 4–5):</w:t>
+        <w:t xml:space="preserve">Fase 3: Aplicación del sondeo exploratorio (Mes 3 / Julio 2027):</w:t>
       </w:r>
       <w:r>
         <w:t xml:space="preserve"> </w:t>
@@ -6486,7 +6486,7 @@
           <w:b/>
           <w:bCs/>
         </w:rPr>
-        <w:t xml:space="preserve">Fase 4: Procesamiento analítico y triangulación (Meses 10–12 / Bim 5–6):</w:t>
+        <w:t xml:space="preserve">Fase 4: Procesamiento analítico y triangulación (Mes 4 / Agosto 2027):</w:t>
       </w:r>
       <w:r>
         <w:t xml:space="preserve"> </w:t>
@@ -6524,7 +6524,7 @@
           <w:b/>
           <w:bCs/>
         </w:rPr>
-        <w:t xml:space="preserve">Fase 5: Formulación de lineamientos y redacción (Meses 12–15 / Bim 6–7):</w:t>
+        <w:t xml:space="preserve">Fase 5: Formulación de lineamientos y redacción (Meses 5–6 / Septiembre–Octubre 2027):</w:t>
       </w:r>
       <w:r>
         <w:t xml:space="preserve"> </w:t>
@@ -6562,7 +6562,7 @@
           <w:b/>
           <w:bCs/>
         </w:rPr>
-        <w:t xml:space="preserve">Fase 6: Revisión final, tramitación y defensa oral (Meses 16–18 / Bim 8):</w:t>
+        <w:t xml:space="preserve">Fase 6: Revisión final, tramitación y defensa oral (Mes 7 / Noviembre 2027):</w:t>
       </w:r>
       <w:r>
         <w:t xml:space="preserve"> </w:t>
@@ -6830,7 +6830,7 @@
         <w:pStyle w:val="FirstParagraph"/>
       </w:pPr>
       <w:r>
-        <w:t xml:space="preserve">El proyecto se planifica en un lapso de 18 meses distribuidos en ocho etapas bimestrales articuladas con las seis fases de investigación:</w:t>
+        <w:t xml:space="preserve">El proyecto se planifica en un lapso de 7 meses continuos distribuidos en etapas mensuales articuladas con las seis fases de investigación para su desarrollo durante el año 2027:</w:t>
       </w:r>
     </w:p>
     <w:tbl>
@@ -6849,15 +6849,14 @@
         </w:tblBorders>
       </w:tblPr>
       <w:tblGrid>
-        <w:gridCol w:w="720"/>
-        <w:gridCol w:w="900"/>
-        <w:gridCol w:w="900"/>
-        <w:gridCol w:w="900"/>
-        <w:gridCol w:w="900"/>
-        <w:gridCol w:w="900"/>
-        <w:gridCol w:w="900"/>
-        <w:gridCol w:w="900"/>
-        <w:gridCol w:w="900"/>
+        <w:gridCol w:w="812"/>
+        <w:gridCol w:w="1015"/>
+        <w:gridCol w:w="1015"/>
+        <w:gridCol w:w="1015"/>
+        <w:gridCol w:w="1015"/>
+        <w:gridCol w:w="1015"/>
+        <w:gridCol w:w="1015"/>
+        <w:gridCol w:w="1015"/>
       </w:tblGrid>
       <w:tr>
         <w:trPr>
@@ -6891,7 +6890,7 @@
               <w:jc w:val="center"/>
             </w:pPr>
             <w:r>
-              <w:t xml:space="preserve">Bim 1 (May-Jun 25)</w:t>
+              <w:t xml:space="preserve">Mes 1 (May 27)</w:t>
             </w:r>
           </w:p>
         </w:tc>
@@ -6907,7 +6906,7 @@
               <w:jc w:val="center"/>
             </w:pPr>
             <w:r>
-              <w:t xml:space="preserve">Bim 2 (Jul-Ago 25)</w:t>
+              <w:t xml:space="preserve">Mes 2 (Jun 27)</w:t>
             </w:r>
           </w:p>
         </w:tc>
@@ -6923,7 +6922,7 @@
               <w:jc w:val="center"/>
             </w:pPr>
             <w:r>
-              <w:t xml:space="preserve">Bim 3 (Sep-Oct 25)</w:t>
+              <w:t xml:space="preserve">Mes 3 (Jul 27)</w:t>
             </w:r>
           </w:p>
         </w:tc>
@@ -6939,7 +6938,7 @@
               <w:jc w:val="center"/>
             </w:pPr>
             <w:r>
-              <w:t xml:space="preserve">Bim 4 (Nov-Dic 25)</w:t>
+              <w:t xml:space="preserve">Mes 4 (Ago 27)</w:t>
             </w:r>
           </w:p>
         </w:tc>
@@ -6955,7 +6954,7 @@
               <w:jc w:val="center"/>
             </w:pPr>
             <w:r>
-              <w:t xml:space="preserve">Bim 5 (Feb-Mar 26)</w:t>
+              <w:t xml:space="preserve">Mes 5 (Sep 27)</w:t>
             </w:r>
           </w:p>
         </w:tc>
@@ -6971,7 +6970,7 @@
               <w:jc w:val="center"/>
             </w:pPr>
             <w:r>
-              <w:t xml:space="preserve">Bim 6 (Abr-May 26)</w:t>
+              <w:t xml:space="preserve">Mes 6 (Oct 27)</w:t>
             </w:r>
           </w:p>
         </w:tc>
@@ -6987,23 +6986,7 @@
               <w:jc w:val="center"/>
             </w:pPr>
             <w:r>
-              <w:t xml:space="preserve">Bim 7 (Jun-Jul 26)</w:t>
-            </w:r>
-          </w:p>
-        </w:tc>
-        <w:tc>
-          <w:tcPr>
-            <w:tcBorders>
-              <w:bottom w:val="single" w:sz="6" w:space="0" w:color="000000"/>
-            </w:tcBorders>
-          </w:tcPr>
-          <w:p>
-            <w:pPr>
-              <w:pStyle w:val="Compact"/>
-              <w:jc w:val="center"/>
-            </w:pPr>
-            <w:r>
-              <w:t xml:space="preserve">Bim 8 (Ago-Sep 26)</w:t>
+              <w:t xml:space="preserve">Mes 7 (Nov 27)</w:t>
             </w:r>
           </w:p>
         </w:tc>
@@ -7085,14 +7068,6 @@
             </w:pPr>
           </w:p>
         </w:tc>
-        <w:tc>
-          <w:tcPr/>
-          <w:p>
-            <w:pPr>
-              <w:pStyle w:val="Compact"/>
-            </w:pPr>
-          </w:p>
-        </w:tc>
       </w:tr>
       <w:tr>
         <w:tc>
@@ -7105,14 +7080,6 @@
             <w:r>
               <w:t xml:space="preserve">2. Gestión de avales y diseño de instrumentos (Fase 1)</w:t>
             </w:r>
-          </w:p>
-        </w:tc>
-        <w:tc>
-          <w:tcPr/>
-          <w:p>
-            <w:pPr>
-              <w:pStyle w:val="Compact"/>
-            </w:pPr>
           </w:p>
         </w:tc>
         <w:tc>
@@ -7198,14 +7165,6 @@
           <w:p>
             <w:pPr>
               <w:pStyle w:val="Compact"/>
-            </w:pPr>
-          </w:p>
-        </w:tc>
-        <w:tc>
-          <w:tcPr/>
-          <w:p>
-            <w:pPr>
-              <w:pStyle w:val="Compact"/>
               <w:jc w:val="center"/>
             </w:pPr>
             <w:r>
@@ -7222,6 +7181,76 @@
           <w:p>
             <w:pPr>
               <w:pStyle w:val="Compact"/>
+            </w:pPr>
+          </w:p>
+        </w:tc>
+        <w:tc>
+          <w:tcPr/>
+          <w:p>
+            <w:pPr>
+              <w:pStyle w:val="Compact"/>
+            </w:pPr>
+          </w:p>
+        </w:tc>
+        <w:tc>
+          <w:tcPr/>
+          <w:p>
+            <w:pPr>
+              <w:pStyle w:val="Compact"/>
+            </w:pPr>
+          </w:p>
+        </w:tc>
+        <w:tc>
+          <w:tcPr/>
+          <w:p>
+            <w:pPr>
+              <w:pStyle w:val="Compact"/>
+            </w:pPr>
+          </w:p>
+        </w:tc>
+        <w:tc>
+          <w:tcPr/>
+          <w:p>
+            <w:pPr>
+              <w:pStyle w:val="Compact"/>
+            </w:pPr>
+          </w:p>
+        </w:tc>
+        <w:tc>
+          <w:tcPr/>
+          <w:p>
+            <w:pPr>
+              <w:pStyle w:val="Compact"/>
+            </w:pPr>
+          </w:p>
+        </w:tc>
+      </w:tr>
+      <w:tr>
+        <w:tc>
+          <w:tcPr/>
+          <w:p>
+            <w:pPr>
+              <w:pStyle w:val="Compact"/>
+              <w:jc w:val="left"/>
+            </w:pPr>
+            <w:r>
+              <w:t xml:space="preserve">4. Trabajo de campo: normativa y entrevistas (Fase 2)</w:t>
+            </w:r>
+          </w:p>
+        </w:tc>
+        <w:tc>
+          <w:tcPr/>
+          <w:p>
+            <w:pPr>
+              <w:pStyle w:val="Compact"/>
+            </w:pPr>
+          </w:p>
+        </w:tc>
+        <w:tc>
+          <w:tcPr/>
+          <w:p>
+            <w:pPr>
+              <w:pStyle w:val="Compact"/>
               <w:jc w:val="center"/>
             </w:pPr>
             <w:r>
@@ -7283,7 +7312,7 @@
               <w:jc w:val="left"/>
             </w:pPr>
             <w:r>
-              <w:t xml:space="preserve">4. Trabajo de campo: normativa y entrevistas (Fase 2)</w:t>
+              <w:t xml:space="preserve">5. Trabajo de campo: sondeo en Viedma y Nodos (Fase 3)</w:t>
             </w:r>
           </w:p>
         </w:tc>
@@ -7324,6 +7353,76 @@
           <w:p>
             <w:pPr>
               <w:pStyle w:val="Compact"/>
+            </w:pPr>
+          </w:p>
+        </w:tc>
+        <w:tc>
+          <w:tcPr/>
+          <w:p>
+            <w:pPr>
+              <w:pStyle w:val="Compact"/>
+            </w:pPr>
+          </w:p>
+        </w:tc>
+        <w:tc>
+          <w:tcPr/>
+          <w:p>
+            <w:pPr>
+              <w:pStyle w:val="Compact"/>
+            </w:pPr>
+          </w:p>
+        </w:tc>
+        <w:tc>
+          <w:tcPr/>
+          <w:p>
+            <w:pPr>
+              <w:pStyle w:val="Compact"/>
+            </w:pPr>
+          </w:p>
+        </w:tc>
+      </w:tr>
+      <w:tr>
+        <w:tc>
+          <w:tcPr/>
+          <w:p>
+            <w:pPr>
+              <w:pStyle w:val="Compact"/>
+              <w:jc w:val="left"/>
+            </w:pPr>
+            <w:r>
+              <w:t xml:space="preserve">6. Procesamiento de datos y triangulación (Fase 4)</w:t>
+            </w:r>
+          </w:p>
+        </w:tc>
+        <w:tc>
+          <w:tcPr/>
+          <w:p>
+            <w:pPr>
+              <w:pStyle w:val="Compact"/>
+            </w:pPr>
+          </w:p>
+        </w:tc>
+        <w:tc>
+          <w:tcPr/>
+          <w:p>
+            <w:pPr>
+              <w:pStyle w:val="Compact"/>
+            </w:pPr>
+          </w:p>
+        </w:tc>
+        <w:tc>
+          <w:tcPr/>
+          <w:p>
+            <w:pPr>
+              <w:pStyle w:val="Compact"/>
+            </w:pPr>
+          </w:p>
+        </w:tc>
+        <w:tc>
+          <w:tcPr/>
+          <w:p>
+            <w:pPr>
+              <w:pStyle w:val="Compact"/>
               <w:jc w:val="center"/>
             </w:pPr>
             <w:r>
@@ -7359,14 +7458,6 @@
             </w:pPr>
           </w:p>
         </w:tc>
-        <w:tc>
-          <w:tcPr/>
-          <w:p>
-            <w:pPr>
-              <w:pStyle w:val="Compact"/>
-            </w:pPr>
-          </w:p>
-        </w:tc>
       </w:tr>
       <w:tr>
         <w:tc>
@@ -7377,8 +7468,16 @@
               <w:jc w:val="left"/>
             </w:pPr>
             <w:r>
-              <w:t xml:space="preserve">5. Trabajo de campo: sondeo en Viedma y Nodos (Fase 3)</w:t>
-            </w:r>
+              <w:t xml:space="preserve">7. Redacción de Tesina y lineamientos (Fase 5)</w:t>
+            </w:r>
+          </w:p>
+        </w:tc>
+        <w:tc>
+          <w:tcPr/>
+          <w:p>
+            <w:pPr>
+              <w:pStyle w:val="Compact"/>
+            </w:pPr>
           </w:p>
         </w:tc>
         <w:tc>
@@ -7445,22 +7544,6 @@
             </w:pPr>
           </w:p>
         </w:tc>
-        <w:tc>
-          <w:tcPr/>
-          <w:p>
-            <w:pPr>
-              <w:pStyle w:val="Compact"/>
-            </w:pPr>
-          </w:p>
-        </w:tc>
-        <w:tc>
-          <w:tcPr/>
-          <w:p>
-            <w:pPr>
-              <w:pStyle w:val="Compact"/>
-            </w:pPr>
-          </w:p>
-        </w:tc>
       </w:tr>
       <w:tr>
         <w:tc>
@@ -7471,8 +7554,24 @@
               <w:jc w:val="left"/>
             </w:pPr>
             <w:r>
-              <w:t xml:space="preserve">6. Procesamiento de datos y triangulación (Fase 4)</w:t>
-            </w:r>
+              <w:t xml:space="preserve">8. Revisión final, tramitación y defensa de TFG (Fase 6)</w:t>
+            </w:r>
+          </w:p>
+        </w:tc>
+        <w:tc>
+          <w:tcPr/>
+          <w:p>
+            <w:pPr>
+              <w:pStyle w:val="Compact"/>
+            </w:pPr>
+          </w:p>
+        </w:tc>
+        <w:tc>
+          <w:tcPr/>
+          <w:p>
+            <w:pPr>
+              <w:pStyle w:val="Compact"/>
+            </w:pPr>
           </w:p>
         </w:tc>
         <w:tc>
@@ -7523,218 +7622,6 @@
             </w:r>
           </w:p>
         </w:tc>
-        <w:tc>
-          <w:tcPr/>
-          <w:p>
-            <w:pPr>
-              <w:pStyle w:val="Compact"/>
-              <w:jc w:val="center"/>
-            </w:pPr>
-            <w:r>
-              <w:rPr>
-                <w:b/>
-                <w:bCs/>
-              </w:rPr>
-              <w:t xml:space="preserve">X</w:t>
-            </w:r>
-          </w:p>
-        </w:tc>
-        <w:tc>
-          <w:tcPr/>
-          <w:p>
-            <w:pPr>
-              <w:pStyle w:val="Compact"/>
-            </w:pPr>
-          </w:p>
-        </w:tc>
-        <w:tc>
-          <w:tcPr/>
-          <w:p>
-            <w:pPr>
-              <w:pStyle w:val="Compact"/>
-            </w:pPr>
-          </w:p>
-        </w:tc>
-      </w:tr>
-      <w:tr>
-        <w:tc>
-          <w:tcPr/>
-          <w:p>
-            <w:pPr>
-              <w:pStyle w:val="Compact"/>
-              <w:jc w:val="left"/>
-            </w:pPr>
-            <w:r>
-              <w:t xml:space="preserve">7. Redacción de Tesina y lineamientos (Fase 5)</w:t>
-            </w:r>
-          </w:p>
-        </w:tc>
-        <w:tc>
-          <w:tcPr/>
-          <w:p>
-            <w:pPr>
-              <w:pStyle w:val="Compact"/>
-            </w:pPr>
-          </w:p>
-        </w:tc>
-        <w:tc>
-          <w:tcPr/>
-          <w:p>
-            <w:pPr>
-              <w:pStyle w:val="Compact"/>
-            </w:pPr>
-          </w:p>
-        </w:tc>
-        <w:tc>
-          <w:tcPr/>
-          <w:p>
-            <w:pPr>
-              <w:pStyle w:val="Compact"/>
-            </w:pPr>
-          </w:p>
-        </w:tc>
-        <w:tc>
-          <w:tcPr/>
-          <w:p>
-            <w:pPr>
-              <w:pStyle w:val="Compact"/>
-            </w:pPr>
-          </w:p>
-        </w:tc>
-        <w:tc>
-          <w:tcPr/>
-          <w:p>
-            <w:pPr>
-              <w:pStyle w:val="Compact"/>
-            </w:pPr>
-          </w:p>
-        </w:tc>
-        <w:tc>
-          <w:tcPr/>
-          <w:p>
-            <w:pPr>
-              <w:pStyle w:val="Compact"/>
-              <w:jc w:val="center"/>
-            </w:pPr>
-            <w:r>
-              <w:rPr>
-                <w:b/>
-                <w:bCs/>
-              </w:rPr>
-              <w:t xml:space="preserve">X</w:t>
-            </w:r>
-          </w:p>
-        </w:tc>
-        <w:tc>
-          <w:tcPr/>
-          <w:p>
-            <w:pPr>
-              <w:pStyle w:val="Compact"/>
-              <w:jc w:val="center"/>
-            </w:pPr>
-            <w:r>
-              <w:rPr>
-                <w:b/>
-                <w:bCs/>
-              </w:rPr>
-              <w:t xml:space="preserve">X</w:t>
-            </w:r>
-          </w:p>
-        </w:tc>
-        <w:tc>
-          <w:tcPr/>
-          <w:p>
-            <w:pPr>
-              <w:pStyle w:val="Compact"/>
-            </w:pPr>
-          </w:p>
-        </w:tc>
-      </w:tr>
-      <w:tr>
-        <w:tc>
-          <w:tcPr/>
-          <w:p>
-            <w:pPr>
-              <w:pStyle w:val="Compact"/>
-              <w:jc w:val="left"/>
-            </w:pPr>
-            <w:r>
-              <w:t xml:space="preserve">8. Revisión final, tramitación y defensa de TFG (Fase 6)</w:t>
-            </w:r>
-          </w:p>
-        </w:tc>
-        <w:tc>
-          <w:tcPr/>
-          <w:p>
-            <w:pPr>
-              <w:pStyle w:val="Compact"/>
-            </w:pPr>
-          </w:p>
-        </w:tc>
-        <w:tc>
-          <w:tcPr/>
-          <w:p>
-            <w:pPr>
-              <w:pStyle w:val="Compact"/>
-            </w:pPr>
-          </w:p>
-        </w:tc>
-        <w:tc>
-          <w:tcPr/>
-          <w:p>
-            <w:pPr>
-              <w:pStyle w:val="Compact"/>
-            </w:pPr>
-          </w:p>
-        </w:tc>
-        <w:tc>
-          <w:tcPr/>
-          <w:p>
-            <w:pPr>
-              <w:pStyle w:val="Compact"/>
-            </w:pPr>
-          </w:p>
-        </w:tc>
-        <w:tc>
-          <w:tcPr/>
-          <w:p>
-            <w:pPr>
-              <w:pStyle w:val="Compact"/>
-            </w:pPr>
-          </w:p>
-        </w:tc>
-        <w:tc>
-          <w:tcPr/>
-          <w:p>
-            <w:pPr>
-              <w:pStyle w:val="Compact"/>
-            </w:pPr>
-          </w:p>
-        </w:tc>
-        <w:tc>
-          <w:tcPr/>
-          <w:p>
-            <w:pPr>
-              <w:pStyle w:val="Compact"/>
-            </w:pPr>
-          </w:p>
-        </w:tc>
-        <w:tc>
-          <w:tcPr/>
-          <w:p>
-            <w:pPr>
-              <w:pStyle w:val="Compact"/>
-              <w:jc w:val="center"/>
-            </w:pPr>
-            <w:r>
-              <w:rPr>
-                <w:b/>
-                <w:bCs/>
-              </w:rPr>
-              <w:t xml:space="preserve">X</w:t>
-            </w:r>
-          </w:p>
-        </w:tc>
       </w:tr>
     </w:tbl>
     <w:p>
@@ -7752,7 +7639,7 @@
         <w:t xml:space="preserve"> </w:t>
       </w:r>
       <w:r>
-        <w:t xml:space="preserve">Elaboración propia. La planificación contempla los recesos de invierno y verano reglamentados por la UNCo.</w:t>
+        <w:t xml:space="preserve">Elaboración propia. La planificación mensual de 7 meses proyectada para el año 2027 se adecua a la escala operativa de un investigador individual y a los plazos académicos reglamentados por el CURZAS-UNCo.</w:t>
       </w:r>
     </w:p>
     <w:p>
@@ -9597,7 +9484,7 @@
           <w:i/>
           <w:iCs/>
         </w:rPr>
-        <w:t xml:space="preserve">Evaluación del Desempeño Docente y Factibilidad de un Modelo de Retroalimentación 360° en el Departamento de Administración Pública del CURZAS-UNCo (2025–2026)</w:t>
+        <w:t xml:space="preserve">Evaluación del Desempeño Docente y Factibilidad de un Modelo de Retroalimentación 360° en el Departamento de Administración Pública del CURZAS-UNCo (2027)</w:t>
       </w:r>
       <w:r>
         <w:br/>
@@ -11342,7 +11229,7 @@
         <w:jc w:val="left"/>
       </w:pPr>
       <w:r>
-        <w:t xml:space="preserve">Viedma, Río Negro, ______ de ________________ de 2025</w:t>
+        <w:t xml:space="preserve">Viedma, Río Negro, ______ de ________________ de 202__</w:t>
       </w:r>
     </w:p>
     <w:p>
@@ -11420,7 +11307,7 @@
           <w:b/>
           <w:bCs/>
         </w:rPr>
-        <w:t xml:space="preserve">“Evaluación del Desempeño Docente y Factibilidad de Implementación de un Modelo de Retroalimentación 360° en el Departamento de Administración Pública del CURZAS-UNCo (2025–2026)”</w:t>
+        <w:t xml:space="preserve">“Evaluación del Desempeño Docente y Factibilidad de Implementación de un Modelo de Retroalimentación 360° en el Departamento de Administración Pública del CURZAS-UNCo (2027)”</w:t>
       </w:r>
     </w:p>
     <w:p>
@@ -11586,7 +11473,7 @@
           <w:i/>
           <w:iCs/>
         </w:rPr>
-        <w:t xml:space="preserve">Evaluación del Desempeño Docente y Factibilidad de Implementación de un Modelo de Retroalimentación 360° en el Departamento de Administración Pública del CURZAS-UNCo (2025–2026)</w:t>
+        <w:t xml:space="preserve">Evaluación del Desempeño Docente y Factibilidad de Implementación de un Modelo de Retroalimentación 360° en el Departamento de Administración Pública del CURZAS-UNCo (2027)</w:t>
       </w:r>
       <w:r>
         <w:t xml:space="preserve">.</w:t>

</xml_diff>

<commit_message>
feat: add TFG integral project draft and configuration files for Actividad 4
</commit_message>
<xml_diff>
--- a/Entregas/Actividad 4/TP4_Ayarachi_Fuentes.docx
+++ b/Entregas/Actividad 4/TP4_Ayarachi_Fuentes.docx
@@ -1478,6 +1478,60 @@
     </w:p>
     <w:p>
       <w:pPr>
+        <w:pStyle w:val="TOC1"/>
+        <w:tabs>
+          <w:tab w:val="right" w:leader="dot" w:pos="9026"/>
+        </w:tabs>
+        <w:ind w:left="0"/>
+        <w:spacing w:after="60"/>
+      </w:pPr>
+      <w:r>
+        <w:rPr>
+          <w:rFonts w:ascii="Arial" w:hAnsi="Arial"/>
+          <w:sz w:val="22"/>
+        </w:rPr>
+        <w:t>Referencias Bibliográficas</w:t>
+      </w:r>
+      <w:r>
+        <w:tab/>
+      </w:r>
+      <w:r>
+        <w:rPr>
+          <w:rFonts w:ascii="Arial" w:hAnsi="Arial"/>
+          <w:sz w:val="22"/>
+        </w:rPr>
+        <w:t>24</w:t>
+      </w:r>
+    </w:p>
+    <w:p>
+      <w:pPr>
+        <w:pStyle w:val="TOC1"/>
+        <w:tabs>
+          <w:tab w:val="right" w:leader="dot" w:pos="9026"/>
+        </w:tabs>
+        <w:ind w:left="0"/>
+        <w:spacing w:after="60"/>
+      </w:pPr>
+      <w:r>
+        <w:rPr>
+          <w:rFonts w:ascii="Arial" w:hAnsi="Arial"/>
+          <w:sz w:val="22"/>
+        </w:rPr>
+        <w:t>Anexos Metodológicos</w:t>
+      </w:r>
+      <w:r>
+        <w:tab/>
+      </w:r>
+      <w:r>
+        <w:rPr>
+          <w:rFonts w:ascii="Arial" w:hAnsi="Arial"/>
+          <w:sz w:val="22"/>
+        </w:rPr>
+        <w:t>27</w:t>
+      </w:r>
+    </w:p>
+    <w:p>
+      <w:pPr>
         <w:pStyle w:val="TOC2"/>
         <w:tabs>
           <w:tab w:val="right" w:leader="dot" w:pos="9026"/>
@@ -1490,7 +1544,7 @@
           <w:rFonts w:ascii="Arial" w:hAnsi="Arial"/>
           <w:sz w:val="22"/>
         </w:rPr>
-        <w:t>Anexos Metodológicos</w:t>
+        <w:t>Anexo I: Guía Temática de Entrevista Semiestructurada</w:t>
       </w:r>
       <w:r>
         <w:tab/>
@@ -1500,16 +1554,16 @@
           <w:rFonts w:ascii="Arial" w:hAnsi="Arial"/>
           <w:sz w:val="22"/>
         </w:rPr>
-        <w:t>24</w:t>
-      </w:r>
-    </w:p>
-    <w:p>
-      <w:pPr>
-        <w:pStyle w:val="TOC3"/>
+        <w:t>27</w:t>
+      </w:r>
+    </w:p>
+    <w:p>
+      <w:pPr>
+        <w:pStyle w:val="TOC2"/>
         <w:tabs>
           <w:tab w:val="right" w:leader="dot" w:pos="9026"/>
         </w:tabs>
-        <w:ind w:left="560"/>
+        <w:ind w:left="280"/>
         <w:spacing w:after="60"/>
       </w:pPr>
       <w:r>
@@ -1517,7 +1571,7 @@
           <w:rFonts w:ascii="Arial" w:hAnsi="Arial"/>
           <w:sz w:val="22"/>
         </w:rPr>
-        <w:t>Anexo I: Guía Temática de Entrevista Semiestructurada</w:t>
+        <w:t>Anexo II: Cuestionario Exploratorio de Factibilidad (Escala Likert)</w:t>
       </w:r>
       <w:r>
         <w:tab/>
@@ -1527,16 +1581,16 @@
           <w:rFonts w:ascii="Arial" w:hAnsi="Arial"/>
           <w:sz w:val="22"/>
         </w:rPr>
-        <w:t>24</w:t>
-      </w:r>
-    </w:p>
-    <w:p>
-      <w:pPr>
-        <w:pStyle w:val="TOC3"/>
+        <w:t>28</w:t>
+      </w:r>
+    </w:p>
+    <w:p>
+      <w:pPr>
+        <w:pStyle w:val="TOC2"/>
         <w:tabs>
           <w:tab w:val="right" w:leader="dot" w:pos="9026"/>
         </w:tabs>
-        <w:ind w:left="560"/>
+        <w:ind w:left="280"/>
         <w:spacing w:after="60"/>
       </w:pPr>
       <w:r>
@@ -1544,7 +1598,7 @@
           <w:rFonts w:ascii="Arial" w:hAnsi="Arial"/>
           <w:sz w:val="22"/>
         </w:rPr>
-        <w:t>Anexo II: Cuestionario Exploratorio de Factibilidad (Escala Likert)</w:t>
+        <w:t>Anexo III: Modelo de Nota Institucional de Solicitud de Aval Académico</w:t>
       </w:r>
       <w:r>
         <w:tab/>
@@ -1554,16 +1608,16 @@
           <w:rFonts w:ascii="Arial" w:hAnsi="Arial"/>
           <w:sz w:val="22"/>
         </w:rPr>
-        <w:t>24</w:t>
-      </w:r>
-    </w:p>
-    <w:p>
-      <w:pPr>
-        <w:pStyle w:val="TOC3"/>
+        <w:t>31</w:t>
+      </w:r>
+    </w:p>
+    <w:p>
+      <w:pPr>
+        <w:pStyle w:val="TOC2"/>
         <w:tabs>
           <w:tab w:val="right" w:leader="dot" w:pos="9026"/>
         </w:tabs>
-        <w:ind w:left="560"/>
+        <w:ind w:left="280"/>
         <w:spacing w:after="60"/>
       </w:pPr>
       <w:r>
@@ -1571,7 +1625,7 @@
           <w:rFonts w:ascii="Arial" w:hAnsi="Arial"/>
           <w:sz w:val="22"/>
         </w:rPr>
-        <w:t>Anexo III: Modelo de Nota Institucional y Consentimiento Informado</w:t>
+        <w:t>Anexo IV: Formulario de Consentimiento Informado</w:t>
       </w:r>
       <w:r>
         <w:tab/>
@@ -1581,34 +1635,7 @@
           <w:rFonts w:ascii="Arial" w:hAnsi="Arial"/>
           <w:sz w:val="22"/>
         </w:rPr>
-        <w:t>27</w:t>
-      </w:r>
-    </w:p>
-    <w:p>
-      <w:pPr>
-        <w:pStyle w:val="TOC1"/>
-        <w:tabs>
-          <w:tab w:val="right" w:leader="dot" w:pos="9026"/>
-        </w:tabs>
-        <w:ind w:left="0"/>
-        <w:spacing w:after="60"/>
-      </w:pPr>
-      <w:r>
-        <w:rPr>
-          <w:rFonts w:ascii="Arial" w:hAnsi="Arial"/>
-          <w:sz w:val="22"/>
-        </w:rPr>
-        <w:t>Referencias Bibliográficas</w:t>
-      </w:r>
-      <w:r>
-        <w:tab/>
-      </w:r>
-      <w:r>
-        <w:rPr>
-          <w:rFonts w:ascii="Arial" w:hAnsi="Arial"/>
-          <w:sz w:val="22"/>
-        </w:rPr>
-        <w:t>28</w:t>
+        <w:t>32</w:t>
       </w:r>
     </w:p>
     <w:p>
@@ -6777,7 +6804,7 @@
         <w:t xml:space="preserve"> </w:t>
       </w:r>
       <w:r>
-        <w:t xml:space="preserve">La participación en entrevistas y sondeos es libre y voluntaria. Cada participante valida digitalmente el formulario de consentimiento informado (Anexo III) previo a responder.</w:t>
+        <w:t xml:space="preserve">La participación en entrevistas y sondeos es libre y voluntaria. Cada participante valida digitalmente el formulario de consentimiento informado (Anexo IV) previo a responder.</w:t>
       </w:r>
       <w:r>
         <w:t xml:space="preserve"> </w:t>
@@ -8352,7 +8379,7 @@
     <w:bookmarkEnd w:id="58"/>
     <w:bookmarkEnd w:id="59"/>
     <w:bookmarkEnd w:id="60"/>
-    <w:bookmarkStart w:id="109" w:name="referencias-bibliográficas"/>
+    <w:bookmarkStart w:id="105" w:name="referencias-bibliográficas"/>
     <w:p>
       <w:pPr>
         <w:pStyle w:val="Heading1"/>
@@ -9425,12 +9452,13 @@
         <w:br w:type="page"/>
       </w:r>
     </w:p>
-    <w:bookmarkStart w:id="108" w:name="anexos-metodológicos"/>
-    <w:p>
-      <w:pPr>
-        <w:pStyle w:val="Heading2"/>
+    <w:bookmarkEnd w:id="105"/>
+    <w:bookmarkStart w:id="110" w:name="anexos-metodológicos"/>
+    <w:p>
+      <w:pPr>
+        <w:pStyle w:val="Heading1"/>
         <w:keepNext/>
-        <w:spacing w:before="200" w:after="120" w:line="300" w:lineRule="auto"/>
+        <w:spacing w:before="240" w:after="120" w:line="300" w:lineRule="auto"/>
         <w:ind w:left="720" w:hanging="720"/>
         <w:jc w:val="left"/>
       </w:pPr>
@@ -9438,12 +9466,12 @@
         <w:rPr>
           <w:rFonts w:ascii="Arial" w:hAnsi="Arial"/>
           <w:b/>
-          <w:sz w:val="24"/>
+          <w:sz w:val="28"/>
         </w:rPr>
         <w:t xml:space="preserve">Anexos Metodológicos</w:t>
       </w:r>
     </w:p>
-    <w:bookmarkStart w:id="105" w:name="X8a4bd6135b680293145e26a5b92e72f8957a555"/>
+    <w:bookmarkStart w:id="106" w:name="X8a4bd6135b680293145e26a5b92e72f8957a555"/>
     <w:p>
       <w:pPr>
         <w:pStyle w:val="Heading3"/>
@@ -9701,13 +9729,11 @@
     </w:p>
     <w:p>
       <w:r>
-        <w:pict>
-          <v:rect style="width:0;height:1.5pt" o:hralign="center" o:hrstd="t" o:hr="t"/>
-        </w:pict>
-      </w:r>
-    </w:p>
-    <w:bookmarkEnd w:id="105"/>
-    <w:bookmarkStart w:id="106" w:name="Xed927c32308fb922173a9e4e6308883f42ff086"/>
+        <w:br w:type="page"/>
+      </w:r>
+    </w:p>
+    <w:bookmarkEnd w:id="106"/>
+    <w:bookmarkStart w:id="107" w:name="Xed927c32308fb922173a9e4e6308883f42ff086"/>
     <w:p>
       <w:pPr>
         <w:pStyle w:val="Heading3"/>
@@ -11181,13 +11207,11 @@
     </w:tbl>
     <w:p>
       <w:r>
-        <w:pict>
-          <v:rect style="width:0;height:1.5pt" o:hralign="center" o:hrstd="t" o:hr="t"/>
-        </w:pict>
-      </w:r>
-    </w:p>
-    <w:bookmarkEnd w:id="106"/>
-    <w:bookmarkStart w:id="107" w:name="X22a92d53062c3dffa2a361c91dd61631182eab8"/>
+        <w:br w:type="page"/>
+      </w:r>
+    </w:p>
+    <w:bookmarkEnd w:id="107"/>
+    <w:bookmarkStart w:id="108" w:name="X2fe5c967a6121280ba4c78ad136dc18f1f34381"/>
     <w:p>
       <w:pPr>
         <w:pStyle w:val="Heading3"/>
@@ -11203,7 +11227,7 @@
           <w:i/>
           <w:sz w:val="24"/>
         </w:rPr>
-        <w:t xml:space="preserve">Anexo III: Modelo de Nota Institucional y Consentimiento Informado</w:t>
+        <w:t xml:space="preserve">Anexo III: Modelo de Nota Institucional de Solicitud de Aval Académico</w:t>
       </w:r>
     </w:p>
     <w:p>
@@ -11229,7 +11253,7 @@
         <w:jc w:val="left"/>
       </w:pPr>
       <w:r>
-        <w:t xml:space="preserve">Viedma, Río Negro, ______ de ________________ de 202__</w:t>
+        <w:t xml:space="preserve">Viedma, Río Negro, ______ de ________________ de 202___</w:t>
       </w:r>
     </w:p>
     <w:p>
@@ -11384,12 +11408,6 @@
       <w:r>
         <w:br/>
       </w:r>
-      <w:r>
-        <w:t xml:space="preserve"> </w:t>
-      </w:r>
-      <w:r>
-        <w:br/>
-      </w:r>
     </w:p>
     <w:p>
       <w:r>
@@ -11427,9 +11445,27 @@
     </w:p>
     <w:p>
       <w:r>
-        <w:pict>
-          <v:rect style="width:0;height:1.5pt" o:hralign="center" o:hrstd="t" o:hr="t"/>
-        </w:pict>
+        <w:br w:type="page"/>
+      </w:r>
+    </w:p>
+    <w:bookmarkEnd w:id="108"/>
+    <w:bookmarkStart w:id="109" w:name="Xdd43486170bd3838ba53edb989ff446467f8d87"/>
+    <w:p>
+      <w:pPr>
+        <w:pStyle w:val="Heading3"/>
+        <w:keepNext/>
+        <w:spacing w:before="160" w:after="120" w:line="300" w:lineRule="auto"/>
+        <w:ind w:left="720" w:hanging="720"/>
+        <w:jc w:val="left"/>
+      </w:pPr>
+      <w:r>
+        <w:rPr>
+          <w:rFonts w:ascii="Arial" w:hAnsi="Arial"/>
+          <w:b/>
+          <w:i/>
+          <w:sz w:val="24"/>
+        </w:rPr>
+        <w:t xml:space="preserve">Anexo IV: Formulario de Consentimiento Informado</w:t>
       </w:r>
     </w:p>
     <w:p>
@@ -11545,7 +11581,7 @@
           <w:b/>
           <w:bCs/>
         </w:rPr>
-        <w:t xml:space="preserve">Constancia:</w:t>
+        <w:t xml:space="preserve">Constancia y Declaración del Participante:</w:t>
       </w:r>
     </w:p>
     <w:p>
@@ -11560,7 +11596,7 @@
         <w:jc w:val="left"/>
       </w:pPr>
       <w:r>
-        <w:t xml:space="preserve">Declaro haber recibido información clara sobre los objetivos de la investigación.</w:t>
+        <w:t xml:space="preserve">Declaro haber recibido información clara y suficiente sobre los objetivos de la investigación.</w:t>
       </w:r>
     </w:p>
     <w:p>
@@ -11590,7 +11626,7 @@
         <w:jc w:val="left"/>
       </w:pPr>
       <w:r>
-        <w:t xml:space="preserve">Se me garantiza el anonimato estricto y la confidencialidad de mis respuestas (Ley N° 25.326).</w:t>
+        <w:t xml:space="preserve">Se me garantiza el anonimato estricto y la confidencialidad de mis respuestas (Ley N° 25.326 de Protección de los Datos Personales).</w:t>
       </w:r>
     </w:p>
     <w:p>
@@ -11611,29 +11647,190 @@
     <w:p>
       <w:pPr>
         <w:pStyle w:val="FirstParagraph"/>
-        <w:spacing w:after="120"/>
-        <w:ind w:left="720" w:hanging="720"/>
-        <w:jc w:val="left"/>
-      </w:pPr>
-      <w:r>
-        <w:t xml:space="preserve">Lugar y Fecha: ____________________________________________________________________</w:t>
-      </w:r>
+      </w:pPr>
       <w:r>
         <w:br/>
       </w:r>
-      <w:r>
-        <w:t xml:space="preserve">Firma (o validación digital): ________________________________________________________</w:t>
-      </w:r>
-      <w:r>
-        <w:br/>
-      </w:r>
-      <w:r>
-        <w:t xml:space="preserve">Aclaración: _______________________________________________________________________</w:t>
-      </w:r>
-    </w:p>
-    <w:bookmarkEnd w:id="107"/>
-    <w:bookmarkEnd w:id="108"/>
+    </w:p>
+    <w:tbl>
+      <w:tblPr>
+        <w:tblStyle w:val="Table"/>
+        <w:tblW w:type="pct" w:w="5000"/>
+        <w:tblLayout w:type="fixed"/>
+        <w:tblLook w:firstRow="1" w:lastRow="0" w:firstColumn="0" w:lastColumn="0" w:noHBand="0" w:noVBand="0" w:val="0020"/>
+        <w:tblBorders>
+          <w:top w:val="single" w:sz="8" w:space="0" w:color="000000"/>
+          <w:left w:val="none"/>
+          <w:bottom w:val="single" w:sz="8" w:space="0" w:color="000000"/>
+          <w:right w:val="none"/>
+          <w:insideH w:val="none"/>
+          <w:insideV w:val="none"/>
+        </w:tblBorders>
+      </w:tblPr>
+      <w:tblGrid>
+        <w:gridCol w:w="3960"/>
+        <w:gridCol w:w="3960"/>
+      </w:tblGrid>
+      <w:tr>
+        <w:trPr>
+          <w:tblHeader w:val="on"/>
+        </w:trPr>
+        <w:tc>
+          <w:tcPr>
+            <w:tcBorders>
+              <w:bottom w:val="single" w:sz="6" w:space="0" w:color="000000"/>
+            </w:tcBorders>
+          </w:tcPr>
+          <w:p>
+            <w:pPr>
+              <w:pStyle w:val="Compact"/>
+              <w:jc w:val="left"/>
+            </w:pPr>
+            <w:r>
+              <w:t xml:space="preserve">Campo</w:t>
+            </w:r>
+          </w:p>
+        </w:tc>
+        <w:tc>
+          <w:tcPr>
+            <w:tcBorders>
+              <w:bottom w:val="single" w:sz="6" w:space="0" w:color="000000"/>
+            </w:tcBorders>
+          </w:tcPr>
+          <w:p>
+            <w:pPr>
+              <w:pStyle w:val="Compact"/>
+              <w:jc w:val="left"/>
+            </w:pPr>
+            <w:r>
+              <w:t xml:space="preserve">Registro del Participante</w:t>
+            </w:r>
+          </w:p>
+        </w:tc>
+      </w:tr>
+      <w:tr>
+        <w:tc>
+          <w:tcPr/>
+          <w:p>
+            <w:pPr>
+              <w:pStyle w:val="Compact"/>
+              <w:jc w:val="left"/>
+            </w:pPr>
+            <w:r>
+              <w:rPr>
+                <w:b/>
+                <w:bCs/>
+              </w:rPr>
+              <w:t xml:space="preserve">Lugar y Fecha:</w:t>
+            </w:r>
+          </w:p>
+        </w:tc>
+        <w:tc>
+          <w:tcPr/>
+          <w:p>
+            <w:pPr>
+              <w:pStyle w:val="Compact"/>
+              <w:jc w:val="left"/>
+            </w:pPr>
+            <w:r>
+              <w:t xml:space="preserve">__________________________________________________</w:t>
+            </w:r>
+          </w:p>
+        </w:tc>
+      </w:tr>
+      <w:tr>
+        <w:tc>
+          <w:tcPr/>
+          <w:p>
+            <w:pPr>
+              <w:pStyle w:val="Compact"/>
+              <w:jc w:val="left"/>
+            </w:pPr>
+            <w:r>
+              <w:rPr>
+                <w:b/>
+                <w:bCs/>
+              </w:rPr>
+              <w:t xml:space="preserve">Firma (o validación digital):</w:t>
+            </w:r>
+          </w:p>
+        </w:tc>
+        <w:tc>
+          <w:tcPr/>
+          <w:p>
+            <w:pPr>
+              <w:pStyle w:val="Compact"/>
+              <w:jc w:val="left"/>
+            </w:pPr>
+            <w:r>
+              <w:t xml:space="preserve">__________________________________________________</w:t>
+            </w:r>
+          </w:p>
+        </w:tc>
+      </w:tr>
+      <w:tr>
+        <w:tc>
+          <w:tcPr/>
+          <w:p>
+            <w:pPr>
+              <w:pStyle w:val="Compact"/>
+              <w:jc w:val="left"/>
+            </w:pPr>
+            <w:r>
+              <w:rPr>
+                <w:b/>
+                <w:bCs/>
+              </w:rPr>
+              <w:t xml:space="preserve">Aclaración de Firma:</w:t>
+            </w:r>
+          </w:p>
+        </w:tc>
+        <w:tc>
+          <w:tcPr/>
+          <w:p>
+            <w:pPr>
+              <w:pStyle w:val="Compact"/>
+              <w:jc w:val="left"/>
+            </w:pPr>
+            <w:r>
+              <w:t xml:space="preserve">__________________________________________________</w:t>
+            </w:r>
+          </w:p>
+        </w:tc>
+      </w:tr>
+      <w:tr>
+        <w:tc>
+          <w:tcPr/>
+          <w:p>
+            <w:pPr>
+              <w:pStyle w:val="Compact"/>
+              <w:jc w:val="left"/>
+            </w:pPr>
+            <w:r>
+              <w:rPr>
+                <w:b/>
+                <w:bCs/>
+              </w:rPr>
+              <w:t xml:space="preserve">Estamento / Rol:</w:t>
+            </w:r>
+          </w:p>
+        </w:tc>
+        <w:tc>
+          <w:tcPr/>
+          <w:p>
+            <w:pPr>
+              <w:pStyle w:val="Compact"/>
+              <w:jc w:val="left"/>
+            </w:pPr>
+            <w:r>
+              <w:t xml:space="preserve">[ ] Docente      [ ] Estudiante      [ ] Autoridad</w:t>
+            </w:r>
+          </w:p>
+        </w:tc>
+      </w:tr>
+    </w:tbl>
     <w:bookmarkEnd w:id="109"/>
+    <w:bookmarkEnd w:id="110"/>
     <w:sectPr>
       <w:footerReference w:type="default" r:id="rId11"/>
       <w:footnotePr>

</xml_diff>

<commit_message>
feat: add research project draft for TFG activity 4 in Quarto, Word, and PDF formats
</commit_message>
<xml_diff>
--- a/Entregas/Actividad 4/TP4_Ayarachi_Fuentes.docx
+++ b/Entregas/Actividad 4/TP4_Ayarachi_Fuentes.docx
@@ -1185,7 +1185,7 @@
         <w:tabs>
           <w:tab w:val="right" w:leader="dot" w:pos="9026"/>
         </w:tabs>
-        <w:ind w:left="560"/>
+        <w:ind w:left="840"/>
         <w:spacing w:after="60"/>
       </w:pPr>
       <w:r>
@@ -1193,7 +1193,7 @@
           <w:rFonts w:ascii="Arial" w:hAnsi="Arial"/>
           <w:sz w:val="22"/>
         </w:rPr>
-        <w:t>Técnicas e Instrumentos de Recolección de Datos</w:t>
+        <w:t>Población o Universo de Estudio (N)</w:t>
       </w:r>
       <w:r>
         <w:tab/>
@@ -1203,7 +1203,88 @@
           <w:rFonts w:ascii="Arial" w:hAnsi="Arial"/>
           <w:sz w:val="22"/>
         </w:rPr>
+        <w:t>15</w:t>
+      </w:r>
+    </w:p>
+    <w:p>
+      <w:pPr>
+        <w:pStyle w:val="TOC3"/>
+        <w:tabs>
+          <w:tab w:val="right" w:leader="dot" w:pos="9026"/>
+        </w:tabs>
+        <w:ind w:left="840"/>
+        <w:spacing w:after="60"/>
+      </w:pPr>
+      <w:r>
+        <w:rPr>
+          <w:rFonts w:ascii="Arial" w:hAnsi="Arial"/>
+          <w:sz w:val="22"/>
+        </w:rPr>
+        <w:t>Precisión Epistemológica: Unidad de Análisis frente a Unidades de Observación</w:t>
+      </w:r>
+      <w:r>
+        <w:tab/>
+      </w:r>
+      <w:r>
+        <w:rPr>
+          <w:rFonts w:ascii="Arial" w:hAnsi="Arial"/>
+          <w:sz w:val="22"/>
+        </w:rPr>
         <w:t>16</w:t>
+      </w:r>
+    </w:p>
+    <w:p>
+      <w:pPr>
+        <w:pStyle w:val="TOC3"/>
+        <w:tabs>
+          <w:tab w:val="right" w:leader="dot" w:pos="9026"/>
+        </w:tabs>
+        <w:ind w:left="840"/>
+        <w:spacing w:after="60"/>
+      </w:pPr>
+      <w:r>
+        <w:rPr>
+          <w:rFonts w:ascii="Arial" w:hAnsi="Arial"/>
+          <w:sz w:val="22"/>
+        </w:rPr>
+        <w:t>Muestra y Tipos de Muestreo (N)</w:t>
+      </w:r>
+      <w:r>
+        <w:tab/>
+      </w:r>
+      <w:r>
+        <w:rPr>
+          <w:rFonts w:ascii="Arial" w:hAnsi="Arial"/>
+          <w:sz w:val="22"/>
+        </w:rPr>
+        <w:t>17</w:t>
+      </w:r>
+    </w:p>
+    <w:p>
+      <w:pPr>
+        <w:pStyle w:val="TOC3"/>
+        <w:tabs>
+          <w:tab w:val="right" w:leader="dot" w:pos="9026"/>
+        </w:tabs>
+        <w:ind w:left="840"/>
+        <w:spacing w:after="60"/>
+      </w:pPr>
+      <w:r>
+        <w:rPr>
+          <w:rFonts w:ascii="Arial" w:hAnsi="Arial"/>
+          <w:sz w:val="22"/>
+        </w:rPr>
+        <w:t>Criterios Taxativos de Inclusión y Exclusión</w:t>
+      </w:r>
+      <w:r>
+        <w:tab/>
+      </w:r>
+      <w:r>
+        <w:rPr>
+          <w:rFonts w:ascii="Arial" w:hAnsi="Arial"/>
+          <w:sz w:val="22"/>
+        </w:rPr>
+        <w:t>17</w:t>
       </w:r>
     </w:p>
     <w:p>
@@ -1220,7 +1301,7 @@
           <w:rFonts w:ascii="Arial" w:hAnsi="Arial"/>
           <w:sz w:val="22"/>
         </w:rPr>
-        <w:t>Matriz de Operacionalización</w:t>
+        <w:t>Técnicas e Instrumentos de Recolección de Datos</w:t>
       </w:r>
       <w:r>
         <w:tab/>
@@ -1230,7 +1311,7 @@
           <w:rFonts w:ascii="Arial" w:hAnsi="Arial"/>
           <w:sz w:val="22"/>
         </w:rPr>
-        <w:t>17</w:t>
+        <w:t>18</w:t>
       </w:r>
     </w:p>
     <w:p>
@@ -1247,7 +1328,7 @@
           <w:rFonts w:ascii="Arial" w:hAnsi="Arial"/>
           <w:sz w:val="22"/>
         </w:rPr>
-        <w:t>Procedimiento y Fases del Trabajo de Campo</w:t>
+        <w:t>Matriz de Operacionalización</w:t>
       </w:r>
       <w:r>
         <w:tab/>
@@ -1274,7 +1355,7 @@
           <w:rFonts w:ascii="Arial" w:hAnsi="Arial"/>
           <w:sz w:val="22"/>
         </w:rPr>
-        <w:t>Procesamiento y Análisis de Datos</w:t>
+        <w:t>Procedimiento y Fases del Trabajo de Campo</w:t>
       </w:r>
       <w:r>
         <w:tab/>
@@ -1284,7 +1365,7 @@
           <w:rFonts w:ascii="Arial" w:hAnsi="Arial"/>
           <w:sz w:val="22"/>
         </w:rPr>
-        <w:t>19</w:t>
+        <w:t>21</w:t>
       </w:r>
     </w:p>
     <w:p>
@@ -1301,6 +1382,33 @@
           <w:rFonts w:ascii="Arial" w:hAnsi="Arial"/>
           <w:sz w:val="22"/>
         </w:rPr>
+        <w:t>Procesamiento y Análisis de Datos</w:t>
+      </w:r>
+      <w:r>
+        <w:tab/>
+      </w:r>
+      <w:r>
+        <w:rPr>
+          <w:rFonts w:ascii="Arial" w:hAnsi="Arial"/>
+          <w:sz w:val="22"/>
+        </w:rPr>
+        <w:t>21</w:t>
+      </w:r>
+    </w:p>
+    <w:p>
+      <w:pPr>
+        <w:pStyle w:val="TOC3"/>
+        <w:tabs>
+          <w:tab w:val="right" w:leader="dot" w:pos="9026"/>
+        </w:tabs>
+        <w:ind w:left="560"/>
+        <w:spacing w:after="60"/>
+      </w:pPr>
+      <w:r>
+        <w:rPr>
+          <w:rFonts w:ascii="Arial" w:hAnsi="Arial"/>
+          <w:sz w:val="22"/>
+        </w:rPr>
         <w:t>Consideraciones Éticas</w:t>
       </w:r>
       <w:r>
@@ -1311,7 +1419,7 @@
           <w:rFonts w:ascii="Arial" w:hAnsi="Arial"/>
           <w:sz w:val="22"/>
         </w:rPr>
-        <w:t>20</w:t>
+        <w:t>22</w:t>
       </w:r>
     </w:p>
     <w:p>
@@ -1338,7 +1446,7 @@
           <w:rFonts w:ascii="Arial" w:hAnsi="Arial"/>
           <w:sz w:val="22"/>
         </w:rPr>
-        <w:t>21</w:t>
+        <w:t>23</w:t>
       </w:r>
     </w:p>
     <w:p>
@@ -1365,7 +1473,7 @@
           <w:rFonts w:ascii="Arial" w:hAnsi="Arial"/>
           <w:sz w:val="22"/>
         </w:rPr>
-        <w:t>23</w:t>
+        <w:t>25</w:t>
       </w:r>
     </w:p>
     <w:p>
@@ -1392,7 +1500,7 @@
           <w:rFonts w:ascii="Arial" w:hAnsi="Arial"/>
           <w:sz w:val="22"/>
         </w:rPr>
-        <w:t>23</w:t>
+        <w:t>25</w:t>
       </w:r>
     </w:p>
     <w:p>
@@ -1419,7 +1527,7 @@
           <w:rFonts w:ascii="Arial" w:hAnsi="Arial"/>
           <w:sz w:val="22"/>
         </w:rPr>
-        <w:t>23</w:t>
+        <w:t>25</w:t>
       </w:r>
     </w:p>
     <w:p>
@@ -1446,7 +1554,7 @@
           <w:rFonts w:ascii="Arial" w:hAnsi="Arial"/>
           <w:sz w:val="22"/>
         </w:rPr>
-        <w:t>23</w:t>
+        <w:t>25</w:t>
       </w:r>
     </w:p>
     <w:p>
@@ -1473,7 +1581,7 @@
           <w:rFonts w:ascii="Arial" w:hAnsi="Arial"/>
           <w:sz w:val="22"/>
         </w:rPr>
-        <w:t>24</w:t>
+        <w:t>26</w:t>
       </w:r>
     </w:p>
     <w:p>
@@ -1500,7 +1608,7 @@
           <w:rFonts w:ascii="Arial" w:hAnsi="Arial"/>
           <w:sz w:val="22"/>
         </w:rPr>
-        <w:t>25</w:t>
+        <w:t>27</w:t>
       </w:r>
     </w:p>
     <w:p>
@@ -1527,7 +1635,7 @@
           <w:rFonts w:ascii="Arial" w:hAnsi="Arial"/>
           <w:sz w:val="22"/>
         </w:rPr>
-        <w:t>28</w:t>
+        <w:t>30</w:t>
       </w:r>
     </w:p>
     <w:p>
@@ -1554,7 +1662,7 @@
           <w:rFonts w:ascii="Arial" w:hAnsi="Arial"/>
           <w:sz w:val="22"/>
         </w:rPr>
-        <w:t>28</w:t>
+        <w:t>30</w:t>
       </w:r>
     </w:p>
     <w:p>
@@ -1581,7 +1689,7 @@
           <w:rFonts w:ascii="Arial" w:hAnsi="Arial"/>
           <w:sz w:val="22"/>
         </w:rPr>
-        <w:t>28</w:t>
+        <w:t>30</w:t>
       </w:r>
     </w:p>
     <w:p>
@@ -1608,7 +1716,7 @@
           <w:rFonts w:ascii="Arial" w:hAnsi="Arial"/>
           <w:sz w:val="22"/>
         </w:rPr>
-        <w:t>28</w:t>
+        <w:t>30</w:t>
       </w:r>
     </w:p>
     <w:p>
@@ -1635,7 +1743,7 @@
           <w:rFonts w:ascii="Arial" w:hAnsi="Arial"/>
           <w:sz w:val="22"/>
         </w:rPr>
-        <w:t>29</w:t>
+        <w:t>31</w:t>
       </w:r>
     </w:p>
     <w:p>
@@ -1662,7 +1770,7 @@
           <w:rFonts w:ascii="Arial" w:hAnsi="Arial"/>
           <w:sz w:val="22"/>
         </w:rPr>
-        <w:t>30</w:t>
+        <w:t>32</w:t>
       </w:r>
     </w:p>
     <w:p>
@@ -1689,7 +1797,7 @@
           <w:rFonts w:ascii="Arial" w:hAnsi="Arial"/>
           <w:sz w:val="22"/>
         </w:rPr>
-        <w:t>31</w:t>
+        <w:t>33</w:t>
       </w:r>
     </w:p>
     <w:p>
@@ -1716,7 +1824,7 @@
           <w:rFonts w:ascii="Arial" w:hAnsi="Arial"/>
           <w:sz w:val="22"/>
         </w:rPr>
-        <w:t>32</w:t>
+        <w:t>34</w:t>
       </w:r>
     </w:p>
     <w:p>
@@ -4826,7 +4934,7 @@
     <w:bookmarkEnd w:id="43"/>
     <w:bookmarkEnd w:id="44"/>
     <w:bookmarkEnd w:id="45"/>
-    <w:bookmarkStart w:id="60" w:name="X939220d599d9f2e6ec6ec3fcbd9b7f02ab2b703"/>
+    <w:bookmarkStart w:id="64" w:name="X939220d599d9f2e6ec6ec3fcbd9b7f02ab2b703"/>
     <w:p>
       <w:pPr>
         <w:pStyle w:val="Heading1"/>
@@ -4842,7 +4950,7 @@
         <w:t xml:space="preserve">Tercera parte de la estructura del Proyecto de investigación de TFG</w:t>
       </w:r>
     </w:p>
-    <w:bookmarkStart w:id="53" w:name="X22c16082f4fb76f7871fc247d0300beb3151369"/>
+    <w:bookmarkStart w:id="57" w:name="X22c16082f4fb76f7871fc247d0300beb3151369"/>
     <w:p>
       <w:pPr>
         <w:pStyle w:val="Heading2"/>
@@ -5036,7 +5144,7 @@
       </w:r>
     </w:p>
     <w:bookmarkEnd w:id="46"/>
-    <w:bookmarkStart w:id="47" w:name="población-muestra-y-unidades-de-análisis"/>
+    <w:bookmarkStart w:id="51" w:name="población-muestra-y-unidades-de-análisis"/>
     <w:p>
       <w:pPr>
         <w:pStyle w:val="Heading3"/>
@@ -5058,15 +5166,55 @@
         <w:pStyle w:val="FirstParagraph"/>
       </w:pPr>
       <w:r>
-        <w:t xml:space="preserve">La unidad de análisis institucional es el Departamento de Administración Pública del CURZAS-UNCo. Las unidades de observación comprenden cuatro colectivos: docentes regulares e interinos, estudiantes regulares, autoridades académicas y representantes gremiales paritarios.</w:t>
-      </w:r>
-    </w:p>
-    <w:p>
-      <w:pPr>
-        <w:pStyle w:val="BodyText"/>
-      </w:pPr>
-      <w:r>
-        <w:t xml:space="preserve">Considerando que el proyecto es ejecutado por un único investigador y no persigue generalización estadística inferencial, el muestreo se diseña bajo criterios de rigurosidad y viabilidad operativa:</w:t>
+        <w:t xml:space="preserve">Conforme a las pautas metodológicas de la cátedra y a los criterios de</w:t>
+      </w:r>
+      <w:r>
+        <w:t xml:space="preserve"> </w:t>
+      </w:r>
+      <w:r>
+        <w:t xml:space="preserve">Sautu (2005)</w:t>
+      </w:r>
+      <w:r>
+        <w:t xml:space="preserve"> </w:t>
+      </w:r>
+      <w:r>
+        <w:t xml:space="preserve">y</w:t>
+      </w:r>
+      <w:r>
+        <w:t xml:space="preserve"> </w:t>
+      </w:r>
+      <w:r>
+        <w:t xml:space="preserve">Hernández Sampieri et al. (2014)</w:t>
+      </w:r>
+      <w:r>
+        <w:t xml:space="preserve">, los componentes empíricos del estudio se definen de manera taxativa y cuantitativamente delimitada:</w:t>
+      </w:r>
+    </w:p>
+    <w:bookmarkStart w:id="47" w:name="población-o-universo-de-estudio-n"/>
+    <w:p>
+      <w:pPr>
+        <w:pStyle w:val="Heading4"/>
+      </w:pPr>
+      <w:r>
+        <w:t xml:space="preserve">Población o Universo de Estudio (</w:t>
+      </w:r>
+      <w:r>
+        <w:rPr>
+          <w:i/>
+          <w:iCs/>
+        </w:rPr>
+        <w:t xml:space="preserve">N</w:t>
+      </w:r>
+      <w:r>
+        <w:t xml:space="preserve">)</w:t>
+      </w:r>
+    </w:p>
+    <w:p>
+      <w:pPr>
+        <w:pStyle w:val="FirstParagraph"/>
+      </w:pPr>
+      <w:r>
+        <w:t xml:space="preserve">El universo poblacional comprende a la totalidad de los agentes que integran la comunidad académica del Departamento de Administración Pública del CURZAS-UNCo (sede Viedma y Nodos Territoriales):</w:t>
       </w:r>
     </w:p>
     <w:p>
@@ -5082,85 +5230,44 @@
           <w:b/>
           <w:bCs/>
         </w:rPr>
-        <w:t xml:space="preserve">Muestra cualitativa:</w:t>
-      </w:r>
-      <w:r>
-        <w:t xml:space="preserve"> </w:t>
-      </w:r>
-      <w:r>
-        <w:t xml:space="preserve">Muestreo intencional no probabilístico por criterios teóricos</w:t>
-      </w:r>
-      <w:r>
-        <w:t xml:space="preserve"> </w:t>
-      </w:r>
-      <w:r>
-        <w:t xml:space="preserve">(Sautu, 2005)</w:t>
-      </w:r>
-      <w:r>
-        <w:t xml:space="preserve">. Comprende 8 entrevistas semiestructuradas a informantes clave:</w:t>
-      </w:r>
-    </w:p>
-    <w:p>
-      <w:pPr>
-        <w:pStyle w:val="Compact"/>
-        <w:numPr>
-          <w:ilvl w:val="1"/>
-          <w:numId w:val="1019"/>
-        </w:numPr>
-      </w:pPr>
-      <w:r>
-        <w:t xml:space="preserve">4 docentes de cátedra con diversas categorías, dedicaciones y modalidades (presencial en Viedma y tutoría híbrida en Nodos).</w:t>
-      </w:r>
-    </w:p>
-    <w:p>
-      <w:pPr>
-        <w:pStyle w:val="Compact"/>
-        <w:numPr>
-          <w:ilvl w:val="1"/>
-          <w:numId w:val="1019"/>
-        </w:numPr>
-      </w:pPr>
-      <w:r>
-        <w:t xml:space="preserve">2 autoridades académicas (Dirección departamental y Coordinación de carrera).</w:t>
-      </w:r>
-    </w:p>
-    <w:p>
-      <w:pPr>
-        <w:pStyle w:val="Compact"/>
-        <w:numPr>
-          <w:ilvl w:val="1"/>
-          <w:numId w:val="1019"/>
-        </w:numPr>
-      </w:pPr>
-      <w:r>
-        <w:t xml:space="preserve">1 representante gremial docente de la mesa paritaria local (ADUNC).</w:t>
-      </w:r>
-    </w:p>
-    <w:p>
-      <w:pPr>
-        <w:pStyle w:val="Compact"/>
-        <w:numPr>
-          <w:ilvl w:val="1"/>
-          <w:numId w:val="1019"/>
-        </w:numPr>
-      </w:pPr>
-      <w:r>
-        <w:t xml:space="preserve">1 estudiante avanzado con experiencia en cursadas presenciales y virtuales.</w:t>
-      </w:r>
-      <w:r>
-        <w:t xml:space="preserve"> </w:t>
-      </w:r>
-      <w:r>
-        <w:t xml:space="preserve">El número final se ajustará conforme al criterio de saturación temática</w:t>
-      </w:r>
-      <w:r>
-        <w:t xml:space="preserve"> </w:t>
-      </w:r>
-      <w:r>
-        <w:t xml:space="preserve">(Glaser &amp; Strauss, 1967)</w:t>
-      </w:r>
-      <w:r>
-        <w:t xml:space="preserve">.</w:t>
+        <w:t xml:space="preserve">Población Docente (</w:t>
+      </w:r>
+      <w:r>
+        <w:rPr>
+          <w:b/>
+          <w:bCs/>
+          <w:i/>
+          <w:iCs/>
+        </w:rPr>
+        <w:t xml:space="preserve">N</w:t>
+      </w:r>
+      <w:r>
+        <w:rPr>
+          <w:b/>
+          <w:bCs/>
+          <w:vertAlign w:val="subscript"/>
+        </w:rPr>
+        <w:t xml:space="preserve">doc</w:t>
+      </w:r>
+      <w:r>
+        <w:rPr>
+          <w:b/>
+          <w:bCs/>
+        </w:rPr>
+        <w:t xml:space="preserve"> </w:t>
+      </w:r>
+      <w:r>
+        <w:rPr>
+          <w:b/>
+          <w:bCs/>
+        </w:rPr>
+        <w:t xml:space="preserve">≈ 38 docentes):</w:t>
+      </w:r>
+      <w:r>
+        <w:t xml:space="preserve"> </w:t>
+      </w:r>
+      <w:r>
+        <w:t xml:space="preserve">Totalidad de los profesores y auxiliares docentes (regulares e interinos) con designación activa frente a cátedra en el Departamento de Administración Pública, distribuidos entre las asignaturas presenciales de sede Viedma y los espacios con mediación tecnológica y tutoría en la Red de Nodos Universitarios (Sierra Grande, Valcheta, Los Menucos y Ramos Mexía).</w:t>
       </w:r>
     </w:p>
     <w:p>
@@ -5176,22 +5283,341 @@
           <w:b/>
           <w:bCs/>
         </w:rPr>
-        <w:t xml:space="preserve">Sondeo cuantitativo exploratorio:</w:t>
-      </w:r>
-      <w:r>
-        <w:t xml:space="preserve"> </w:t>
-      </w:r>
-      <w:r>
-        <w:t xml:space="preserve">Muestreo no probabilístico por accesibilidad y participación voluntaria</w:t>
-      </w:r>
-      <w:r>
-        <w:t xml:space="preserve"> </w:t>
-      </w:r>
-      <w:r>
-        <w:t xml:space="preserve">(Hernández Sampieri et al., 2014)</w:t>
-      </w:r>
-      <w:r>
-        <w:t xml:space="preserve">. Se aplicará un cuestionario digital autoadministrado a una muestra diagnóstica acotada:</w:t>
+        <w:t xml:space="preserve">Población Estudiantil (</w:t>
+      </w:r>
+      <w:r>
+        <w:rPr>
+          <w:b/>
+          <w:bCs/>
+          <w:i/>
+          <w:iCs/>
+        </w:rPr>
+        <w:t xml:space="preserve">N</w:t>
+      </w:r>
+      <w:r>
+        <w:rPr>
+          <w:b/>
+          <w:bCs/>
+          <w:vertAlign w:val="subscript"/>
+        </w:rPr>
+        <w:t xml:space="preserve">est</w:t>
+      </w:r>
+      <w:r>
+        <w:rPr>
+          <w:b/>
+          <w:bCs/>
+        </w:rPr>
+        <w:t xml:space="preserve"> </w:t>
+      </w:r>
+      <w:r>
+        <w:rPr>
+          <w:b/>
+          <w:bCs/>
+        </w:rPr>
+        <w:t xml:space="preserve">≈ 130 estudiantes):</w:t>
+      </w:r>
+      <w:r>
+        <w:t xml:space="preserve"> </w:t>
+      </w:r>
+      <w:r>
+        <w:t xml:space="preserve">Total de estudiantes con condición regular activa matriculados en los tramos formativos avanzados de las dos carreras del Departamento: 3° y 4° año de la Licenciatura en Administración Pública (LAP) y la cohorte activa del Ciclo de Complementación Curricular de la Licenciatura en Gestión de Recursos Humanos (CCC-LGRH).</w:t>
+      </w:r>
+    </w:p>
+    <w:p>
+      <w:pPr>
+        <w:pStyle w:val="Compact"/>
+        <w:numPr>
+          <w:ilvl w:val="0"/>
+          <w:numId w:val="1018"/>
+        </w:numPr>
+      </w:pPr>
+      <w:r>
+        <w:rPr>
+          <w:b/>
+          <w:bCs/>
+        </w:rPr>
+        <w:t xml:space="preserve">Población de Gestión y Representación Institucional (</w:t>
+      </w:r>
+      <w:r>
+        <w:rPr>
+          <w:b/>
+          <w:bCs/>
+          <w:i/>
+          <w:iCs/>
+        </w:rPr>
+        <w:t xml:space="preserve">N</w:t>
+      </w:r>
+      <w:r>
+        <w:rPr>
+          <w:b/>
+          <w:bCs/>
+          <w:vertAlign w:val="subscript"/>
+        </w:rPr>
+        <w:t xml:space="preserve">inst</w:t>
+      </w:r>
+      <w:r>
+        <w:rPr>
+          <w:b/>
+          <w:bCs/>
+        </w:rPr>
+        <w:t xml:space="preserve"> </w:t>
+      </w:r>
+      <w:r>
+        <w:rPr>
+          <w:b/>
+          <w:bCs/>
+        </w:rPr>
+        <w:t xml:space="preserve">= 5 actores clave):</w:t>
+      </w:r>
+      <w:r>
+        <w:t xml:space="preserve"> </w:t>
+      </w:r>
+      <w:r>
+        <w:t xml:space="preserve">Integrada por la Dirección del Departamento de Administración Pública, las dos Coordinaciones de Carrera (LAP y CCC-LGRH) y dos representantes docentes paritarios de la asociación gremial de base (ADUNC) con competencia en la mesa local del CURZAS.</w:t>
+      </w:r>
+    </w:p>
+    <w:p>
+      <w:pPr>
+        <w:pStyle w:val="FirstParagraph"/>
+      </w:pPr>
+      <w:r>
+        <w:rPr>
+          <w:i/>
+          <w:iCs/>
+        </w:rPr>
+        <w:t xml:space="preserve">Nota metodológica sobre la cuantificación poblacional:</w:t>
+      </w:r>
+      <w:r>
+        <w:t xml:space="preserve"> </w:t>
+      </w:r>
+      <w:r>
+        <w:t xml:space="preserve">Dado que el presente documento constituye el Proyecto de TFG y el trabajo de campo empírico se proyecta para el ciclo lectivo 2027, las cifras poblacionales consignadas revisten carácter de</w:t>
+      </w:r>
+      <w:r>
+        <w:t xml:space="preserve"> </w:t>
+      </w:r>
+      <w:r>
+        <w:rPr>
+          <w:b/>
+          <w:bCs/>
+        </w:rPr>
+        <w:t xml:space="preserve">estimación preliminar de referencia</w:t>
+      </w:r>
+      <w:r>
+        <w:t xml:space="preserve">, calculadas a partir de la planta funcional docente habitual del Departamento y la matrícula histórica de las cursadas de tramos superiores. La determinación del número censal nominal exacto (</w:t>
+      </w:r>
+      <w:r>
+        <w:rPr>
+          <w:i/>
+          <w:iCs/>
+        </w:rPr>
+        <w:t xml:space="preserve">N</w:t>
+      </w:r>
+      <w:r>
+        <w:t xml:space="preserve">) se llevará a cabo formalmente en la</w:t>
+      </w:r>
+      <w:r>
+        <w:t xml:space="preserve"> </w:t>
+      </w:r>
+      <w:r>
+        <w:rPr>
+          <w:b/>
+          <w:bCs/>
+        </w:rPr>
+        <w:t xml:space="preserve">Fase 1 del trabajo de campo</w:t>
+      </w:r>
+      <w:r>
+        <w:t xml:space="preserve"> </w:t>
+      </w:r>
+      <w:r>
+        <w:t xml:space="preserve">(Mayo 2027), mediante el acceso a los registros oficiales del Departamento de Alumnos, la Secretaría Académica del CURZAS y las actas de cursada del sistema SIU-Guaraní, previa autorización formal de las autoridades departamentales a través de la solicitud de aval académico (Anexo III).</w:t>
+      </w:r>
+    </w:p>
+    <w:bookmarkEnd w:id="47"/>
+    <w:bookmarkStart w:id="48" w:name="Xc8ab29830eeae3f4bf036160f98f9333e6ab7f4"/>
+    <w:p>
+      <w:pPr>
+        <w:pStyle w:val="Heading4"/>
+      </w:pPr>
+      <w:r>
+        <w:t xml:space="preserve">Precisión Epistemológica: Unidad de Análisis frente a Unidades de Observación</w:t>
+      </w:r>
+    </w:p>
+    <w:p>
+      <w:pPr>
+        <w:pStyle w:val="FirstParagraph"/>
+      </w:pPr>
+      <w:r>
+        <w:t xml:space="preserve">Para evitar ambigüedades metodológicas</w:t>
+      </w:r>
+      <w:r>
+        <w:t xml:space="preserve"> </w:t>
+      </w:r>
+      <w:r>
+        <w:t xml:space="preserve">(Wainerman &amp; Sautu, 2011)</w:t>
+      </w:r>
+      <w:r>
+        <w:t xml:space="preserve">, se establece una clara diferenciación analítica:</w:t>
+      </w:r>
+    </w:p>
+    <w:p>
+      <w:pPr>
+        <w:pStyle w:val="Compact"/>
+        <w:numPr>
+          <w:ilvl w:val="0"/>
+          <w:numId w:val="1019"/>
+        </w:numPr>
+      </w:pPr>
+      <w:r>
+        <w:rPr>
+          <w:b/>
+          <w:bCs/>
+        </w:rPr>
+        <w:t xml:space="preserve">Unidad de Análisis (objeto central de estudio):</w:t>
+      </w:r>
+      <w:r>
+        <w:t xml:space="preserve"> </w:t>
+      </w:r>
+      <w:r>
+        <w:t xml:space="preserve">El sistema de evaluación del desempeño docente y las condiciones de factibilidad organizacional, técnica, normativa y de gobernanza multinivel para la eventual implementación de un circuito de retroalimentación 360° en el Departamento de Administración Pública del CURZAS-UNCo.</w:t>
+      </w:r>
+    </w:p>
+    <w:p>
+      <w:pPr>
+        <w:pStyle w:val="Compact"/>
+        <w:numPr>
+          <w:ilvl w:val="0"/>
+          <w:numId w:val="1019"/>
+        </w:numPr>
+      </w:pPr>
+      <w:r>
+        <w:rPr>
+          <w:b/>
+          <w:bCs/>
+        </w:rPr>
+        <w:t xml:space="preserve">Unidades de Observación (fuentes de recolección y respuesta):</w:t>
+      </w:r>
+      <w:r>
+        <w:t xml:space="preserve"> </w:t>
+      </w:r>
+      <w:r>
+        <w:t xml:space="preserve">Los actores situados individuales y colectivos que experimentan cotidianamente la práctica formativa y de gestión (docentes en ejercicio, directivos académicos, estudiantes avanzados y dirigentes paritarios).</w:t>
+      </w:r>
+    </w:p>
+    <w:bookmarkEnd w:id="48"/>
+    <w:bookmarkStart w:id="49" w:name="muestra-y-tipos-de-muestreo-n"/>
+    <w:p>
+      <w:pPr>
+        <w:pStyle w:val="Heading4"/>
+      </w:pPr>
+      <w:r>
+        <w:t xml:space="preserve">Muestra y Tipos de Muestreo (</w:t>
+      </w:r>
+      <w:r>
+        <w:rPr>
+          <w:i/>
+          <w:iCs/>
+        </w:rPr>
+        <w:t xml:space="preserve">N</w:t>
+      </w:r>
+      <w:r>
+        <w:t xml:space="preserve">)</w:t>
+      </w:r>
+    </w:p>
+    <w:p>
+      <w:pPr>
+        <w:pStyle w:val="FirstParagraph"/>
+      </w:pPr>
+      <w:r>
+        <w:t xml:space="preserve">Tratándose de una investigación con diseño mixto de predominio cualitativo (CUAL → cuan) ejecutada por un único tesista, se implementa un</w:t>
+      </w:r>
+      <w:r>
+        <w:t xml:space="preserve"> </w:t>
+      </w:r>
+      <w:r>
+        <w:rPr>
+          <w:b/>
+          <w:bCs/>
+        </w:rPr>
+        <w:t xml:space="preserve">muestreo no probabilístico</w:t>
+      </w:r>
+      <w:r>
+        <w:t xml:space="preserve"> </w:t>
+      </w:r>
+      <w:r>
+        <w:t xml:space="preserve">orientado a la representatividad sustantiva y teórica</w:t>
+      </w:r>
+      <w:r>
+        <w:t xml:space="preserve"> </w:t>
+      </w:r>
+      <w:r>
+        <w:t xml:space="preserve">(Glaser &amp; Strauss, 1967; Sautu, 2005)</w:t>
+      </w:r>
+      <w:r>
+        <w:t xml:space="preserve">:</w:t>
+      </w:r>
+    </w:p>
+    <w:p>
+      <w:pPr>
+        <w:pStyle w:val="Compact"/>
+        <w:numPr>
+          <w:ilvl w:val="0"/>
+          <w:numId w:val="1020"/>
+        </w:numPr>
+      </w:pPr>
+      <w:r>
+        <w:rPr>
+          <w:b/>
+          <w:bCs/>
+        </w:rPr>
+        <w:t xml:space="preserve">Submuestra Cualitativa (</w:t>
+      </w:r>
+      <w:r>
+        <w:rPr>
+          <w:b/>
+          <w:bCs/>
+          <w:i/>
+          <w:iCs/>
+        </w:rPr>
+        <w:t xml:space="preserve">n</w:t>
+      </w:r>
+      <w:r>
+        <w:rPr>
+          <w:b/>
+          <w:bCs/>
+        </w:rPr>
+        <w:t xml:space="preserve"> </w:t>
+      </w:r>
+      <w:r>
+        <w:rPr>
+          <w:b/>
+          <w:bCs/>
+        </w:rPr>
+        <w:t xml:space="preserve">= 8 informantes clave):</w:t>
+      </w:r>
+      <w:r>
+        <w:t xml:space="preserve"> </w:t>
+      </w:r>
+      <w:r>
+        <w:t xml:space="preserve">Muestreo intencional o por criterios teóricos</w:t>
+      </w:r>
+      <w:r>
+        <w:t xml:space="preserve"> </w:t>
+      </w:r>
+      <w:r>
+        <w:t xml:space="preserve">(Sautu, 2005)</w:t>
+      </w:r>
+      <w:r>
+        <w:t xml:space="preserve">, cuyo tamaño se ajustará durante el trabajo de campo bajo el principio de saturación temática</w:t>
+      </w:r>
+      <w:r>
+        <w:t xml:space="preserve"> </w:t>
+      </w:r>
+      <w:r>
+        <w:t xml:space="preserve">(Glaser &amp; Strauss, 1967)</w:t>
+      </w:r>
+      <w:r>
+        <w:t xml:space="preserve">:</w:t>
       </w:r>
     </w:p>
     <w:p>
@@ -5199,11 +5625,11 @@
         <w:pStyle w:val="Compact"/>
         <w:numPr>
           <w:ilvl w:val="1"/>
-          <w:numId w:val="1020"/>
+          <w:numId w:val="1021"/>
         </w:numPr>
       </w:pPr>
       <w:r>
-        <w:t xml:space="preserve">15 docentes del Departamento.</w:t>
+        <w:t xml:space="preserve">4 docentes de cátedra (seleccionados buscando heterogeneidad: cátedras unipersonales vs. colegiadas, dedicaciones simples vs. exclusivas, y modalidad presencial Viedma vs. tutoría virtual en Nodos).</w:t>
       </w:r>
     </w:p>
     <w:p>
@@ -5211,21 +5637,273 @@
         <w:pStyle w:val="Compact"/>
         <w:numPr>
           <w:ilvl w:val="1"/>
+          <w:numId w:val="1021"/>
+        </w:numPr>
+      </w:pPr>
+      <w:r>
+        <w:t xml:space="preserve">2 autoridades académicas (Dirección del Departamento y Coordinación de Carrera).</w:t>
+      </w:r>
+    </w:p>
+    <w:p>
+      <w:pPr>
+        <w:pStyle w:val="Compact"/>
+        <w:numPr>
+          <w:ilvl w:val="1"/>
+          <w:numId w:val="1021"/>
+        </w:numPr>
+      </w:pPr>
+      <w:r>
+        <w:t xml:space="preserve">1 representante paritario de ADUNC.</w:t>
+      </w:r>
+    </w:p>
+    <w:p>
+      <w:pPr>
+        <w:pStyle w:val="Compact"/>
+        <w:numPr>
+          <w:ilvl w:val="1"/>
+          <w:numId w:val="1021"/>
+        </w:numPr>
+      </w:pPr>
+      <w:r>
+        <w:t xml:space="preserve">1 estudiante avanzado con experiencia transitada en cursadas presenciales y virtuales.</w:t>
+      </w:r>
+    </w:p>
+    <w:p>
+      <w:pPr>
+        <w:pStyle w:val="Compact"/>
+        <w:numPr>
+          <w:ilvl w:val="0"/>
           <w:numId w:val="1020"/>
         </w:numPr>
       </w:pPr>
       <w:r>
-        <w:t xml:space="preserve">30 estudiantes de asignaturas de los últimos años de ambas carreras.</w:t>
-      </w:r>
-      <w:r>
-        <w:t xml:space="preserve"> </w:t>
-      </w:r>
-      <w:r>
-        <w:t xml:space="preserve">Este tamaño muestral (45 participantes en total) resulta plenamente manejable para un investigador individual y provee frecuencias descriptivas consistentes para triangular con las entrevistas.</w:t>
-      </w:r>
-    </w:p>
-    <w:bookmarkEnd w:id="47"/>
-    <w:bookmarkStart w:id="48" w:name="X8096e9b2347bf8942081b47ccb7c360d1ea8f9f"/>
+        <w:rPr>
+          <w:b/>
+          <w:bCs/>
+        </w:rPr>
+        <w:t xml:space="preserve">Submuestra Cuantitativa Diagnóstica (</w:t>
+      </w:r>
+      <w:r>
+        <w:rPr>
+          <w:b/>
+          <w:bCs/>
+          <w:i/>
+          <w:iCs/>
+        </w:rPr>
+        <w:t xml:space="preserve">n</w:t>
+      </w:r>
+      <w:r>
+        <w:rPr>
+          <w:b/>
+          <w:bCs/>
+        </w:rPr>
+        <w:t xml:space="preserve"> </w:t>
+      </w:r>
+      <w:r>
+        <w:rPr>
+          <w:b/>
+          <w:bCs/>
+        </w:rPr>
+        <w:t xml:space="preserve">= 45 participantes):</w:t>
+      </w:r>
+      <w:r>
+        <w:t xml:space="preserve"> </w:t>
+      </w:r>
+      <w:r>
+        <w:t xml:space="preserve">Muestreo por accesibilidad y participación voluntaria</w:t>
+      </w:r>
+      <w:r>
+        <w:t xml:space="preserve"> </w:t>
+      </w:r>
+      <w:r>
+        <w:t xml:space="preserve">(Hernández Sampieri et al., 2014)</w:t>
+      </w:r>
+      <w:r>
+        <w:t xml:space="preserve"> </w:t>
+      </w:r>
+      <w:r>
+        <w:t xml:space="preserve">para el cuestionario exploratorio autoadministrado:</w:t>
+      </w:r>
+    </w:p>
+    <w:p>
+      <w:pPr>
+        <w:pStyle w:val="Compact"/>
+        <w:numPr>
+          <w:ilvl w:val="1"/>
+          <w:numId w:val="1022"/>
+        </w:numPr>
+      </w:pPr>
+      <w:r>
+        <w:t xml:space="preserve">15 docentes del Departamento (representa aproximadamente el 40% del universo docente departamental).</w:t>
+      </w:r>
+    </w:p>
+    <w:p>
+      <w:pPr>
+        <w:pStyle w:val="Compact"/>
+        <w:numPr>
+          <w:ilvl w:val="1"/>
+          <w:numId w:val="1022"/>
+        </w:numPr>
+      </w:pPr>
+      <w:r>
+        <w:t xml:space="preserve">30 estudiantes regulares de tramos avanzados (representa cerca del 23% de la matrícula activa de ciclos superiores).</w:t>
+      </w:r>
+    </w:p>
+    <w:bookmarkEnd w:id="49"/>
+    <w:bookmarkStart w:id="50" w:name="X998a09b61a83e90f29025d20db168181e35de2d"/>
+    <w:p>
+      <w:pPr>
+        <w:pStyle w:val="Heading4"/>
+      </w:pPr>
+      <w:r>
+        <w:t xml:space="preserve">Criterios Taxativos de Inclusión y Exclusión</w:t>
+      </w:r>
+    </w:p>
+    <w:p>
+      <w:pPr>
+        <w:pStyle w:val="Compact"/>
+        <w:numPr>
+          <w:ilvl w:val="0"/>
+          <w:numId w:val="1023"/>
+        </w:numPr>
+      </w:pPr>
+      <w:r>
+        <w:rPr>
+          <w:b/>
+          <w:bCs/>
+        </w:rPr>
+        <w:t xml:space="preserve">Criterios de Inclusión:</w:t>
+      </w:r>
+    </w:p>
+    <w:p>
+      <w:pPr>
+        <w:pStyle w:val="Compact"/>
+        <w:numPr>
+          <w:ilvl w:val="1"/>
+          <w:numId w:val="1024"/>
+        </w:numPr>
+      </w:pPr>
+      <w:r>
+        <w:rPr>
+          <w:i/>
+          <w:iCs/>
+        </w:rPr>
+        <w:t xml:space="preserve">Docentes:</w:t>
+      </w:r>
+      <w:r>
+        <w:t xml:space="preserve"> </w:t>
+      </w:r>
+      <w:r>
+        <w:t xml:space="preserve">Designación vigente frente a cátedra con una antigüedad mínima de un (1) año en el Departamento, garantizando conocimiento situado de las prácticas evaluativas institucionales.</w:t>
+      </w:r>
+    </w:p>
+    <w:p>
+      <w:pPr>
+        <w:pStyle w:val="Compact"/>
+        <w:numPr>
+          <w:ilvl w:val="1"/>
+          <w:numId w:val="1024"/>
+        </w:numPr>
+      </w:pPr>
+      <w:r>
+        <w:rPr>
+          <w:i/>
+          <w:iCs/>
+        </w:rPr>
+        <w:t xml:space="preserve">Estudiantes:</w:t>
+      </w:r>
+      <w:r>
+        <w:t xml:space="preserve"> </w:t>
+      </w:r>
+      <w:r>
+        <w:t xml:space="preserve">Alumnos regulares activos con al menos el 50% de materias aprobadas en LAP o cursando el segundo cuatrimestre en el CCC-LGRH, asegurando experiencia previa en las encuestas y cursadas.</w:t>
+      </w:r>
+    </w:p>
+    <w:p>
+      <w:pPr>
+        <w:pStyle w:val="Compact"/>
+        <w:numPr>
+          <w:ilvl w:val="1"/>
+          <w:numId w:val="1024"/>
+        </w:numPr>
+      </w:pPr>
+      <w:r>
+        <w:rPr>
+          <w:i/>
+          <w:iCs/>
+        </w:rPr>
+        <w:t xml:space="preserve">Autoridades y dirigentes:</w:t>
+      </w:r>
+      <w:r>
+        <w:t xml:space="preserve"> </w:t>
+      </w:r>
+      <w:r>
+        <w:t xml:space="preserve">Ejercicio activo de funciones de gestión o representación paritaria durante el ciclo 2027.</w:t>
+      </w:r>
+    </w:p>
+    <w:p>
+      <w:pPr>
+        <w:pStyle w:val="Compact"/>
+        <w:numPr>
+          <w:ilvl w:val="0"/>
+          <w:numId w:val="1023"/>
+        </w:numPr>
+      </w:pPr>
+      <w:r>
+        <w:rPr>
+          <w:b/>
+          <w:bCs/>
+        </w:rPr>
+        <w:t xml:space="preserve">Criterios de Exclusión:</w:t>
+      </w:r>
+    </w:p>
+    <w:p>
+      <w:pPr>
+        <w:pStyle w:val="Compact"/>
+        <w:numPr>
+          <w:ilvl w:val="1"/>
+          <w:numId w:val="1025"/>
+        </w:numPr>
+      </w:pPr>
+      <w:r>
+        <w:rPr>
+          <w:i/>
+          <w:iCs/>
+        </w:rPr>
+        <w:t xml:space="preserve">Estudiantes ingresantes (1° año):</w:t>
+      </w:r>
+      <w:r>
+        <w:t xml:space="preserve"> </w:t>
+      </w:r>
+      <w:r>
+        <w:t xml:space="preserve">Quienes carecen de trayectoria en los circuitos de evaluación docente universitaria.</w:t>
+      </w:r>
+    </w:p>
+    <w:p>
+      <w:pPr>
+        <w:pStyle w:val="Compact"/>
+        <w:numPr>
+          <w:ilvl w:val="1"/>
+          <w:numId w:val="1025"/>
+        </w:numPr>
+      </w:pPr>
+      <w:r>
+        <w:rPr>
+          <w:i/>
+          <w:iCs/>
+        </w:rPr>
+        <w:t xml:space="preserve">Docentes en licencia reglamentaria prolongada:</w:t>
+      </w:r>
+      <w:r>
+        <w:t xml:space="preserve"> </w:t>
+      </w:r>
+      <w:r>
+        <w:t xml:space="preserve">Aquellos con licencia total (año sabático, maternidad o enfermedad prolongada) durante todo el período del relevamiento de campo.</w:t>
+      </w:r>
+    </w:p>
+    <w:bookmarkEnd w:id="50"/>
+    <w:bookmarkEnd w:id="51"/>
+    <w:bookmarkStart w:id="52" w:name="X8096e9b2347bf8942081b47ccb7c360d1ea8f9f"/>
     <w:p>
       <w:pPr>
         <w:pStyle w:val="Heading3"/>
@@ -5255,7 +5933,7 @@
         <w:pStyle w:val="Compact"/>
         <w:numPr>
           <w:ilvl w:val="0"/>
-          <w:numId w:val="1021"/>
+          <w:numId w:val="1026"/>
         </w:numPr>
       </w:pPr>
       <w:r>
@@ -5293,7 +5971,7 @@
         <w:pStyle w:val="Compact"/>
         <w:numPr>
           <w:ilvl w:val="0"/>
-          <w:numId w:val="1021"/>
+          <w:numId w:val="1026"/>
         </w:numPr>
       </w:pPr>
       <w:r>
@@ -5331,7 +6009,7 @@
         <w:pStyle w:val="Compact"/>
         <w:numPr>
           <w:ilvl w:val="0"/>
-          <w:numId w:val="1021"/>
+          <w:numId w:val="1026"/>
         </w:numPr>
       </w:pPr>
       <w:r>
@@ -5398,8 +6076,8 @@
         <w:br w:type="page"/>
       </w:r>
     </w:p>
-    <w:bookmarkEnd w:id="48"/>
-    <w:bookmarkStart w:id="49" w:name="matriz-de-operacionalización"/>
+    <w:bookmarkEnd w:id="52"/>
+    <w:bookmarkStart w:id="53" w:name="matriz-de-operacionalización"/>
     <w:p>
       <w:pPr>
         <w:pStyle w:val="Heading3"/>
@@ -6487,8 +7165,8 @@
         <w:br w:type="page"/>
       </w:r>
     </w:p>
-    <w:bookmarkEnd w:id="49"/>
-    <w:bookmarkStart w:id="50" w:name="X9c80af5c4be12b01258364981172ba0e73926b7"/>
+    <w:bookmarkEnd w:id="53"/>
+    <w:bookmarkStart w:id="54" w:name="X9c80af5c4be12b01258364981172ba0e73926b7"/>
     <w:p>
       <w:pPr>
         <w:pStyle w:val="Heading3"/>
@@ -6518,7 +7196,7 @@
         <w:pStyle w:val="Compact"/>
         <w:numPr>
           <w:ilvl w:val="0"/>
-          <w:numId w:val="1022"/>
+          <w:numId w:val="1027"/>
         </w:numPr>
       </w:pPr>
       <w:r>
@@ -6556,7 +7234,7 @@
         <w:pStyle w:val="Compact"/>
         <w:numPr>
           <w:ilvl w:val="0"/>
-          <w:numId w:val="1022"/>
+          <w:numId w:val="1027"/>
         </w:numPr>
       </w:pPr>
       <w:r>
@@ -6594,7 +7272,7 @@
         <w:pStyle w:val="Compact"/>
         <w:numPr>
           <w:ilvl w:val="0"/>
-          <w:numId w:val="1022"/>
+          <w:numId w:val="1027"/>
         </w:numPr>
       </w:pPr>
       <w:r>
@@ -6632,7 +7310,7 @@
         <w:pStyle w:val="Compact"/>
         <w:numPr>
           <w:ilvl w:val="0"/>
-          <w:numId w:val="1022"/>
+          <w:numId w:val="1027"/>
         </w:numPr>
       </w:pPr>
       <w:r>
@@ -6670,7 +7348,7 @@
         <w:pStyle w:val="Compact"/>
         <w:numPr>
           <w:ilvl w:val="0"/>
-          <w:numId w:val="1022"/>
+          <w:numId w:val="1027"/>
         </w:numPr>
       </w:pPr>
       <w:r>
@@ -6708,7 +7386,7 @@
         <w:pStyle w:val="Compact"/>
         <w:numPr>
           <w:ilvl w:val="0"/>
-          <w:numId w:val="1022"/>
+          <w:numId w:val="1027"/>
         </w:numPr>
       </w:pPr>
       <w:r>
@@ -6741,8 +7419,8 @@
         <w:t xml:space="preserve">Trabajo Final de Graduación aprobado.</w:t>
       </w:r>
     </w:p>
-    <w:bookmarkEnd w:id="50"/>
-    <w:bookmarkStart w:id="51" w:name="procesamiento-y-análisis-de-datos"/>
+    <w:bookmarkEnd w:id="54"/>
+    <w:bookmarkStart w:id="55" w:name="procesamiento-y-análisis-de-datos"/>
     <w:p>
       <w:pPr>
         <w:pStyle w:val="Heading3"/>
@@ -6764,7 +7442,7 @@
         <w:pStyle w:val="Compact"/>
         <w:numPr>
           <w:ilvl w:val="0"/>
-          <w:numId w:val="1023"/>
+          <w:numId w:val="1028"/>
         </w:numPr>
       </w:pPr>
       <w:r>
@@ -6795,7 +7473,7 @@
         <w:pStyle w:val="Compact"/>
         <w:numPr>
           <w:ilvl w:val="0"/>
-          <w:numId w:val="1023"/>
+          <w:numId w:val="1028"/>
         </w:numPr>
       </w:pPr>
       <w:r>
@@ -6817,7 +7495,7 @@
         <w:pStyle w:val="Compact"/>
         <w:numPr>
           <w:ilvl w:val="0"/>
-          <w:numId w:val="1023"/>
+          <w:numId w:val="1028"/>
         </w:numPr>
       </w:pPr>
       <w:r>
@@ -6855,8 +7533,8 @@
         <w:t xml:space="preserve">, se contrastan de manera sistemática los tres corpus de datos: las prescripciones estatutarias, los testimonios en profundidad y las frecuencias del sondeo. El propósito consiste en ponderar la coherencia entre lo normado, lo viable técnicamente y lo aceptado culturalmente por la comunidad académica.</w:t>
       </w:r>
     </w:p>
-    <w:bookmarkEnd w:id="51"/>
-    <w:bookmarkStart w:id="52" w:name="consideraciones-éticas"/>
+    <w:bookmarkEnd w:id="55"/>
+    <w:bookmarkStart w:id="56" w:name="consideraciones-éticas"/>
     <w:p>
       <w:pPr>
         <w:pStyle w:val="Heading3"/>
@@ -6886,7 +7564,7 @@
         <w:pStyle w:val="Compact"/>
         <w:numPr>
           <w:ilvl w:val="0"/>
-          <w:numId w:val="1024"/>
+          <w:numId w:val="1029"/>
         </w:numPr>
       </w:pPr>
       <w:r>
@@ -6933,7 +7611,7 @@
         <w:pStyle w:val="Compact"/>
         <w:numPr>
           <w:ilvl w:val="0"/>
-          <w:numId w:val="1024"/>
+          <w:numId w:val="1029"/>
         </w:numPr>
       </w:pPr>
       <w:r>
@@ -6955,7 +7633,7 @@
         <w:pStyle w:val="Compact"/>
         <w:numPr>
           <w:ilvl w:val="0"/>
-          <w:numId w:val="1024"/>
+          <w:numId w:val="1029"/>
         </w:numPr>
       </w:pPr>
       <w:r>
@@ -6977,9 +7655,9 @@
         <w:br w:type="page"/>
       </w:r>
     </w:p>
-    <w:bookmarkEnd w:id="52"/>
-    <w:bookmarkEnd w:id="53"/>
-    <w:bookmarkStart w:id="54" w:name="cronograma-de-actividades"/>
+    <w:bookmarkEnd w:id="56"/>
+    <w:bookmarkEnd w:id="57"/>
+    <w:bookmarkStart w:id="58" w:name="cronograma-de-actividades"/>
     <w:p>
       <w:pPr>
         <w:pStyle w:val="Heading2"/>
@@ -7817,8 +8495,8 @@
         <w:br w:type="page"/>
       </w:r>
     </w:p>
-    <w:bookmarkEnd w:id="54"/>
-    <w:bookmarkStart w:id="59" w:name="viabilidad-del-proyecto"/>
+    <w:bookmarkEnd w:id="58"/>
+    <w:bookmarkStart w:id="63" w:name="viabilidad-del-proyecto"/>
     <w:p>
       <w:pPr>
         <w:pStyle w:val="Heading2"/>
@@ -7842,7 +8520,7 @@
         <w:t xml:space="preserve">Conforme a la Resolución CD-CURZAS N° 266/23, se especifican los recursos económicos, humanos y técnicos requeridos:</w:t>
       </w:r>
     </w:p>
-    <w:bookmarkStart w:id="55" w:name="recursos-económicos-y-presupuesto"/>
+    <w:bookmarkStart w:id="59" w:name="recursos-económicos-y-presupuesto"/>
     <w:p>
       <w:pPr>
         <w:pStyle w:val="Heading3"/>
@@ -8312,8 +8990,8 @@
         <w:t xml:space="preserve">El relevamiento en los Nodos Universitarios (Sierra Grande, Valcheta, Los Menucos y Ramos Mexía) se realizará mediante formularios digitales y salas de videoconferencia institucionales, sin generar costos extraordinarios de traslado físico.</w:t>
       </w:r>
     </w:p>
-    <w:bookmarkEnd w:id="55"/>
-    <w:bookmarkStart w:id="56" w:name="recursos-humanos-y-dedicación"/>
+    <w:bookmarkEnd w:id="59"/>
+    <w:bookmarkStart w:id="60" w:name="recursos-humanos-y-dedicación"/>
     <w:p>
       <w:pPr>
         <w:pStyle w:val="Heading3"/>
@@ -8335,7 +9013,7 @@
         <w:pStyle w:val="Compact"/>
         <w:numPr>
           <w:ilvl w:val="0"/>
-          <w:numId w:val="1025"/>
+          <w:numId w:val="1030"/>
         </w:numPr>
       </w:pPr>
       <w:r>
@@ -8357,7 +9035,7 @@
         <w:pStyle w:val="Compact"/>
         <w:numPr>
           <w:ilvl w:val="0"/>
-          <w:numId w:val="1025"/>
+          <w:numId w:val="1030"/>
         </w:numPr>
       </w:pPr>
       <w:r>
@@ -8379,7 +9057,7 @@
         <w:pStyle w:val="Compact"/>
         <w:numPr>
           <w:ilvl w:val="0"/>
-          <w:numId w:val="1025"/>
+          <w:numId w:val="1030"/>
         </w:numPr>
       </w:pPr>
       <w:r>
@@ -8401,7 +9079,7 @@
         <w:pStyle w:val="Compact"/>
         <w:numPr>
           <w:ilvl w:val="0"/>
-          <w:numId w:val="1025"/>
+          <w:numId w:val="1030"/>
         </w:numPr>
       </w:pPr>
       <w:r>
@@ -8418,8 +9096,8 @@
         <w:t xml:space="preserve">Docentes, autoridades de departamento, consejeros y estudiantes que colaboren voluntariamente en entrevistas y sondeos.</w:t>
       </w:r>
     </w:p>
-    <w:bookmarkEnd w:id="56"/>
-    <w:bookmarkStart w:id="57" w:name="recursos-técnicos-y-materiales"/>
+    <w:bookmarkEnd w:id="60"/>
+    <w:bookmarkStart w:id="61" w:name="recursos-técnicos-y-materiales"/>
     <w:p>
       <w:pPr>
         <w:pStyle w:val="Heading3"/>
@@ -8441,7 +9119,7 @@
         <w:pStyle w:val="Compact"/>
         <w:numPr>
           <w:ilvl w:val="0"/>
-          <w:numId w:val="1026"/>
+          <w:numId w:val="1031"/>
         </w:numPr>
       </w:pPr>
       <w:r>
@@ -8453,7 +9131,7 @@
         <w:pStyle w:val="Compact"/>
         <w:numPr>
           <w:ilvl w:val="0"/>
-          <w:numId w:val="1026"/>
+          <w:numId w:val="1031"/>
         </w:numPr>
       </w:pPr>
       <w:r>
@@ -8465,7 +9143,7 @@
         <w:pStyle w:val="Compact"/>
         <w:numPr>
           <w:ilvl w:val="0"/>
-          <w:numId w:val="1026"/>
+          <w:numId w:val="1031"/>
         </w:numPr>
       </w:pPr>
       <w:r>
@@ -8488,8 +9166,8 @@
         <w:t xml:space="preserve">(Quarto, Typst, Pandoc) con estándares de formato APA 7ma Edición.</w:t>
       </w:r>
     </w:p>
-    <w:bookmarkEnd w:id="57"/>
-    <w:bookmarkStart w:id="58" w:name="X1839fa070b0cddb93485950ba93c69de9c2c78d"/>
+    <w:bookmarkEnd w:id="61"/>
+    <w:bookmarkStart w:id="62" w:name="X1839fa070b0cddb93485950ba93c69de9c2c78d"/>
     <w:p>
       <w:pPr>
         <w:pStyle w:val="Heading3"/>
@@ -8519,10 +9197,10 @@
         <w:br w:type="page"/>
       </w:r>
     </w:p>
-    <w:bookmarkEnd w:id="58"/>
-    <w:bookmarkEnd w:id="59"/>
-    <w:bookmarkEnd w:id="60"/>
-    <w:bookmarkStart w:id="105" w:name="referencias-bibliográficas"/>
+    <w:bookmarkEnd w:id="62"/>
+    <w:bookmarkEnd w:id="63"/>
+    <w:bookmarkEnd w:id="64"/>
+    <w:bookmarkStart w:id="109" w:name="referencias-bibliográficas"/>
     <w:p>
       <w:pPr>
         <w:pStyle w:val="Heading1"/>
@@ -8539,8 +9217,8 @@
         <w:t xml:space="preserve">Referencias Bibliográficas</w:t>
       </w:r>
     </w:p>
-    <w:bookmarkStart w:id="104" w:name="refs"/>
-    <w:bookmarkStart w:id="61" w:name="ref-aguilar2006"/>
+    <w:bookmarkStart w:id="108" w:name="refs"/>
+    <w:bookmarkStart w:id="65" w:name="ref-aguilar2006"/>
     <w:p>
       <w:pPr>
         <w:pStyle w:val="Bibliography"/>
@@ -8565,8 +9243,8 @@
         <w:t xml:space="preserve">. Fondo de Cultura Económica.</w:t>
       </w:r>
     </w:p>
-    <w:bookmarkEnd w:id="61"/>
-    <w:bookmarkStart w:id="63" w:name="ref-alvarado2019"/>
+    <w:bookmarkEnd w:id="65"/>
+    <w:bookmarkStart w:id="67" w:name="ref-alvarado2019"/>
     <w:p>
       <w:pPr>
         <w:pStyle w:val="Bibliography"/>
@@ -8593,7 +9271,7 @@
       <w:r>
         <w:t xml:space="preserve"> </w:t>
       </w:r>
-      <w:hyperlink r:id="rId62">
+      <w:hyperlink r:id="rId66">
         <w:r>
           <w:rPr>
             <w:rStyle w:val="Hyperlink"/>
@@ -8602,8 +9280,8 @@
         </w:r>
       </w:hyperlink>
     </w:p>
-    <w:bookmarkEnd w:id="63"/>
-    <w:bookmarkStart w:id="64" w:name="ref-bardin2002"/>
+    <w:bookmarkEnd w:id="67"/>
+    <w:bookmarkStart w:id="68" w:name="ref-bardin2002"/>
     <w:p>
       <w:pPr>
         <w:pStyle w:val="Bibliography"/>
@@ -8628,8 +9306,8 @@
         <w:t xml:space="preserve">. Ediciones Akal.</w:t>
       </w:r>
     </w:p>
-    <w:bookmarkEnd w:id="64"/>
-    <w:bookmarkStart w:id="65" w:name="ref-cao2021"/>
+    <w:bookmarkEnd w:id="68"/>
+    <w:bookmarkStart w:id="69" w:name="ref-cao2021"/>
     <w:p>
       <w:pPr>
         <w:pStyle w:val="Bibliography"/>
@@ -8654,8 +9332,8 @@
         <w:t xml:space="preserve">. Instituto Nacional de la Administración Pública (INAP).</w:t>
       </w:r>
     </w:p>
-    <w:bookmarkEnd w:id="65"/>
-    <w:bookmarkStart w:id="67" w:name="ref-cao2023"/>
+    <w:bookmarkEnd w:id="69"/>
+    <w:bookmarkStart w:id="71" w:name="ref-cao2023"/>
     <w:p>
       <w:pPr>
         <w:pStyle w:val="Bibliography"/>
@@ -8695,7 +9373,7 @@
       <w:r>
         <w:t xml:space="preserve"> </w:t>
       </w:r>
-      <w:hyperlink r:id="rId66">
+      <w:hyperlink r:id="rId70">
         <w:r>
           <w:rPr>
             <w:rStyle w:val="Hyperlink"/>
@@ -8704,8 +9382,8 @@
         </w:r>
       </w:hyperlink>
     </w:p>
-    <w:bookmarkEnd w:id="67"/>
-    <w:bookmarkStart w:id="68" w:name="ref-chiavenato2020"/>
+    <w:bookmarkEnd w:id="71"/>
+    <w:bookmarkStart w:id="72" w:name="ref-chiavenato2020"/>
     <w:p>
       <w:pPr>
         <w:pStyle w:val="Bibliography"/>
@@ -8733,8 +9411,8 @@
         <w:t xml:space="preserve">(5.ª ed.). McGraw-Hill Interamericana.</w:t>
       </w:r>
     </w:p>
-    <w:bookmarkEnd w:id="68"/>
-    <w:bookmarkStart w:id="70" w:name="ref-curza2022"/>
+    <w:bookmarkEnd w:id="72"/>
+    <w:bookmarkStart w:id="74" w:name="ref-curza2022"/>
     <w:p>
       <w:pPr>
         <w:pStyle w:val="Bibliography"/>
@@ -8761,7 +9439,7 @@
       <w:r>
         <w:t xml:space="preserve"> </w:t>
       </w:r>
-      <w:hyperlink r:id="rId69">
+      <w:hyperlink r:id="rId73">
         <w:r>
           <w:rPr>
             <w:rStyle w:val="Hyperlink"/>
@@ -8770,8 +9448,8 @@
         </w:r>
       </w:hyperlink>
     </w:p>
-    <w:bookmarkEnd w:id="70"/>
-    <w:bookmarkStart w:id="71" w:name="ref-uncocurzas2023"/>
+    <w:bookmarkEnd w:id="74"/>
+    <w:bookmarkStart w:id="75" w:name="ref-uncocurzas2023"/>
     <w:p>
       <w:pPr>
         <w:pStyle w:val="Bibliography"/>
@@ -8796,8 +9474,8 @@
         <w:t xml:space="preserve">. Universidad Nacional del Comahue.</w:t>
       </w:r>
     </w:p>
-    <w:bookmarkEnd w:id="71"/>
-    <w:bookmarkStart w:id="73" w:name="ref-delagarza2001"/>
+    <w:bookmarkEnd w:id="75"/>
+    <w:bookmarkStart w:id="77" w:name="ref-delagarza2001"/>
     <w:p>
       <w:pPr>
         <w:pStyle w:val="Bibliography"/>
@@ -8837,7 +9515,7 @@
       <w:r>
         <w:t xml:space="preserve"> </w:t>
       </w:r>
-      <w:hyperlink r:id="rId72">
+      <w:hyperlink r:id="rId76">
         <w:r>
           <w:rPr>
             <w:rStyle w:val="Hyperlink"/>
@@ -8846,8 +9524,8 @@
         </w:r>
       </w:hyperlink>
     </w:p>
-    <w:bookmarkEnd w:id="73"/>
-    <w:bookmarkStart w:id="74" w:name="ref-pen2015"/>
+    <w:bookmarkEnd w:id="77"/>
+    <w:bookmarkStart w:id="78" w:name="ref-pen2015"/>
     <w:p>
       <w:pPr>
         <w:pStyle w:val="Bibliography"/>
@@ -8859,8 +9537,8 @@
         <w:t xml:space="preserve">Decreto N° 1246/2015. Convenio Colectivo de Trabajo para los Docentes de las Instituciones Universitarias Nacionales (2015).</w:t>
       </w:r>
     </w:p>
-    <w:bookmarkEnd w:id="74"/>
-    <w:bookmarkStart w:id="75" w:name="ref-denzin1978"/>
+    <w:bookmarkEnd w:id="78"/>
+    <w:bookmarkStart w:id="79" w:name="ref-denzin1978"/>
     <w:p>
       <w:pPr>
         <w:pStyle w:val="Bibliography"/>
@@ -8888,8 +9566,8 @@
         <w:t xml:space="preserve">(2.ª ed.). McGraw-Hill.</w:t>
       </w:r>
     </w:p>
-    <w:bookmarkEnd w:id="75"/>
-    <w:bookmarkStart w:id="77" w:name="ref-flyvbjerg2005"/>
+    <w:bookmarkEnd w:id="79"/>
+    <w:bookmarkStart w:id="81" w:name="ref-flyvbjerg2005"/>
     <w:p>
       <w:pPr>
         <w:pStyle w:val="Bibliography"/>
@@ -8916,7 +9594,7 @@
       <w:r>
         <w:t xml:space="preserve"> </w:t>
       </w:r>
-      <w:hyperlink r:id="rId76">
+      <w:hyperlink r:id="rId80">
         <w:r>
           <w:rPr>
             <w:rStyle w:val="Hyperlink"/>
@@ -8925,8 +9603,8 @@
         </w:r>
       </w:hyperlink>
     </w:p>
-    <w:bookmarkEnd w:id="77"/>
-    <w:bookmarkStart w:id="78" w:name="ref-gimenez2012"/>
+    <w:bookmarkEnd w:id="81"/>
+    <w:bookmarkStart w:id="82" w:name="ref-gimenez2012"/>
     <w:p>
       <w:pPr>
         <w:pStyle w:val="Bibliography"/>
@@ -8964,8 +9642,8 @@
         <w:t xml:space="preserve">(13), 33-52.</w:t>
       </w:r>
     </w:p>
-    <w:bookmarkEnd w:id="78"/>
-    <w:bookmarkStart w:id="79" w:name="ref-glaser1967"/>
+    <w:bookmarkEnd w:id="82"/>
+    <w:bookmarkStart w:id="83" w:name="ref-glaser1967"/>
     <w:p>
       <w:pPr>
         <w:pStyle w:val="Bibliography"/>
@@ -8990,8 +9668,8 @@
         <w:t xml:space="preserve">. Aldine Publishing Company.</w:t>
       </w:r>
     </w:p>
-    <w:bookmarkEnd w:id="79"/>
-    <w:bookmarkStart w:id="80" w:name="ref-hernandezsampieri2014"/>
+    <w:bookmarkEnd w:id="83"/>
+    <w:bookmarkStart w:id="84" w:name="ref-hernandezsampieri2014"/>
     <w:p>
       <w:pPr>
         <w:pStyle w:val="Bibliography"/>
@@ -9019,8 +9697,8 @@
         <w:t xml:space="preserve">(6.ª ed.). McGraw-Hill Interamericana.</w:t>
       </w:r>
     </w:p>
-    <w:bookmarkEnd w:id="80"/>
-    <w:bookmarkStart w:id="81" w:name="ref-jimenez2008"/>
+    <w:bookmarkEnd w:id="84"/>
+    <w:bookmarkStart w:id="85" w:name="ref-jimenez2008"/>
     <w:p>
       <w:pPr>
         <w:pStyle w:val="Bibliography"/>
@@ -9048,8 +9726,8 @@
         <w:t xml:space="preserve">(pp. 27-42). Universidad Pedagógica Nacional / CLACSO.</w:t>
       </w:r>
     </w:p>
-    <w:bookmarkEnd w:id="81"/>
-    <w:bookmarkStart w:id="82" w:name="ref-lepsinger2009"/>
+    <w:bookmarkEnd w:id="85"/>
+    <w:bookmarkStart w:id="86" w:name="ref-lepsinger2009"/>
     <w:p>
       <w:pPr>
         <w:pStyle w:val="Bibliography"/>
@@ -9077,8 +9755,8 @@
         <w:t xml:space="preserve">(2.ª ed.). Pfeiffer.</w:t>
       </w:r>
     </w:p>
-    <w:bookmarkEnd w:id="82"/>
-    <w:bookmarkStart w:id="83" w:name="ref-ministerio1995"/>
+    <w:bookmarkEnd w:id="86"/>
+    <w:bookmarkStart w:id="87" w:name="ref-ministerio1995"/>
     <w:p>
       <w:pPr>
         <w:pStyle w:val="Bibliography"/>
@@ -9090,8 +9768,8 @@
         <w:t xml:space="preserve">Ley N° 24.521 de Educación Superior (1995).</w:t>
       </w:r>
     </w:p>
-    <w:bookmarkEnd w:id="83"/>
-    <w:bookmarkStart w:id="84" w:name="ref-ley25326"/>
+    <w:bookmarkEnd w:id="87"/>
+    <w:bookmarkStart w:id="88" w:name="ref-ley25326"/>
     <w:p>
       <w:pPr>
         <w:pStyle w:val="Bibliography"/>
@@ -9103,8 +9781,8 @@
         <w:t xml:space="preserve">Ley N° 25.326: Protección de los Datos Personales (2000).</w:t>
       </w:r>
     </w:p>
-    <w:bookmarkEnd w:id="84"/>
-    <w:bookmarkStart w:id="85" w:name="ref-longo2006"/>
+    <w:bookmarkEnd w:id="88"/>
+    <w:bookmarkStart w:id="89" w:name="ref-longo2006"/>
     <w:p>
       <w:pPr>
         <w:pStyle w:val="Bibliography"/>
@@ -9129,8 +9807,8 @@
         <w:t xml:space="preserve">. Paidós.</w:t>
       </w:r>
     </w:p>
-    <w:bookmarkEnd w:id="85"/>
-    <w:bookmarkStart w:id="86" w:name="ref-marquina2012"/>
+    <w:bookmarkEnd w:id="89"/>
+    <w:bookmarkStart w:id="90" w:name="ref-marquina2012"/>
     <w:p>
       <w:pPr>
         <w:pStyle w:val="Bibliography"/>
@@ -9168,8 +9846,8 @@
         <w:t xml:space="preserve">(15), 35-48.</w:t>
       </w:r>
     </w:p>
-    <w:bookmarkEnd w:id="86"/>
-    <w:bookmarkStart w:id="87" w:name="ref-matus1993"/>
+    <w:bookmarkEnd w:id="90"/>
+    <w:bookmarkStart w:id="91" w:name="ref-matus1993"/>
     <w:p>
       <w:pPr>
         <w:pStyle w:val="Bibliography"/>
@@ -9194,8 +9872,8 @@
         <w:t xml:space="preserve">. Fundación ALTIDIR.</w:t>
       </w:r>
     </w:p>
-    <w:bookmarkEnd w:id="87"/>
-    <w:bookmarkStart w:id="89" w:name="ref-obando2014"/>
+    <w:bookmarkEnd w:id="91"/>
+    <w:bookmarkStart w:id="93" w:name="ref-obando2014"/>
     <w:p>
       <w:pPr>
         <w:pStyle w:val="Bibliography"/>
@@ -9235,7 +9913,7 @@
       <w:r>
         <w:t xml:space="preserve"> </w:t>
       </w:r>
-      <w:hyperlink r:id="rId88">
+      <w:hyperlink r:id="rId92">
         <w:r>
           <w:rPr>
             <w:rStyle w:val="Hyperlink"/>
@@ -9244,8 +9922,8 @@
         </w:r>
       </w:hyperlink>
     </w:p>
-    <w:bookmarkEnd w:id="89"/>
-    <w:bookmarkStart w:id="90" w:name="ref-oszlak2020"/>
+    <w:bookmarkEnd w:id="93"/>
+    <w:bookmarkStart w:id="94" w:name="ref-oszlak2020"/>
     <w:p>
       <w:pPr>
         <w:pStyle w:val="Bibliography"/>
@@ -9270,8 +9948,8 @@
         <w:t xml:space="preserve">. Instituto Nacional de la Administración Pública.</w:t>
       </w:r>
     </w:p>
-    <w:bookmarkEnd w:id="90"/>
-    <w:bookmarkStart w:id="91" w:name="ref-perez2021"/>
+    <w:bookmarkEnd w:id="94"/>
+    <w:bookmarkStart w:id="95" w:name="ref-perez2021"/>
     <w:p>
       <w:pPr>
         <w:pStyle w:val="Bibliography"/>
@@ -9309,8 +9987,8 @@
         <w:t xml:space="preserve">(26), 45-58.</w:t>
       </w:r>
     </w:p>
-    <w:bookmarkEnd w:id="91"/>
-    <w:bookmarkStart w:id="93" w:name="ref-reyes2020"/>
+    <w:bookmarkEnd w:id="95"/>
+    <w:bookmarkStart w:id="97" w:name="ref-reyes2020"/>
     <w:p>
       <w:pPr>
         <w:pStyle w:val="Bibliography"/>
@@ -9350,7 +10028,7 @@
       <w:r>
         <w:t xml:space="preserve"> </w:t>
       </w:r>
-      <w:hyperlink r:id="rId92">
+      <w:hyperlink r:id="rId96">
         <w:r>
           <w:rPr>
             <w:rStyle w:val="Hyperlink"/>
@@ -9359,8 +10037,8 @@
         </w:r>
       </w:hyperlink>
     </w:p>
-    <w:bookmarkEnd w:id="93"/>
-    <w:bookmarkStart w:id="94" w:name="ref-sautu2005"/>
+    <w:bookmarkEnd w:id="97"/>
+    <w:bookmarkStart w:id="98" w:name="ref-sautu2005"/>
     <w:p>
       <w:pPr>
         <w:pStyle w:val="Bibliography"/>
@@ -9385,8 +10063,8 @@
         <w:t xml:space="preserve">. Lumiere.</w:t>
       </w:r>
     </w:p>
-    <w:bookmarkEnd w:id="94"/>
-    <w:bookmarkStart w:id="96" w:name="ref-sifuentes2016"/>
+    <w:bookmarkEnd w:id="98"/>
+    <w:bookmarkStart w:id="100" w:name="ref-sifuentes2016"/>
     <w:p>
       <w:pPr>
         <w:pStyle w:val="Bibliography"/>
@@ -9426,7 +10104,7 @@
       <w:r>
         <w:t xml:space="preserve"> </w:t>
       </w:r>
-      <w:hyperlink r:id="rId95">
+      <w:hyperlink r:id="rId99">
         <w:r>
           <w:rPr>
             <w:rStyle w:val="Hyperlink"/>
@@ -9435,8 +10113,8 @@
         </w:r>
       </w:hyperlink>
     </w:p>
-    <w:bookmarkEnd w:id="96"/>
-    <w:bookmarkStart w:id="98" w:name="ref-torraco2016"/>
+    <w:bookmarkEnd w:id="100"/>
+    <w:bookmarkStart w:id="102" w:name="ref-torraco2016"/>
     <w:p>
       <w:pPr>
         <w:pStyle w:val="Bibliography"/>
@@ -9476,7 +10154,7 @@
       <w:r>
         <w:t xml:space="preserve"> </w:t>
       </w:r>
-      <w:hyperlink r:id="rId97">
+      <w:hyperlink r:id="rId101">
         <w:r>
           <w:rPr>
             <w:rStyle w:val="Hyperlink"/>
@@ -9485,8 +10163,8 @@
         </w:r>
       </w:hyperlink>
     </w:p>
-    <w:bookmarkEnd w:id="98"/>
-    <w:bookmarkStart w:id="100" w:name="ref-unco1997"/>
+    <w:bookmarkEnd w:id="102"/>
+    <w:bookmarkStart w:id="104" w:name="ref-unco1997"/>
     <w:p>
       <w:pPr>
         <w:pStyle w:val="Bibliography"/>
@@ -9513,7 +10191,7 @@
       <w:r>
         <w:t xml:space="preserve"> </w:t>
       </w:r>
-      <w:hyperlink r:id="rId99">
+      <w:hyperlink r:id="rId103">
         <w:r>
           <w:rPr>
             <w:rStyle w:val="Hyperlink"/>
@@ -9522,8 +10200,8 @@
         </w:r>
       </w:hyperlink>
     </w:p>
-    <w:bookmarkEnd w:id="100"/>
-    <w:bookmarkStart w:id="102" w:name="ref-unco2025"/>
+    <w:bookmarkEnd w:id="104"/>
+    <w:bookmarkStart w:id="106" w:name="ref-unco2025"/>
     <w:p>
       <w:pPr>
         <w:pStyle w:val="Bibliography"/>
@@ -9550,7 +10228,7 @@
       <w:r>
         <w:t xml:space="preserve"> </w:t>
       </w:r>
-      <w:hyperlink r:id="rId101">
+      <w:hyperlink r:id="rId105">
         <w:r>
           <w:rPr>
             <w:rStyle w:val="Hyperlink"/>
@@ -9559,8 +10237,8 @@
         </w:r>
       </w:hyperlink>
     </w:p>
-    <w:bookmarkEnd w:id="102"/>
-    <w:bookmarkStart w:id="103" w:name="ref-wainerman2011"/>
+    <w:bookmarkEnd w:id="106"/>
+    <w:bookmarkStart w:id="107" w:name="ref-wainerman2011"/>
     <w:p>
       <w:pPr>
         <w:pStyle w:val="Bibliography"/>
@@ -9588,15 +10266,15 @@
         <w:t xml:space="preserve">(4.ª ed.). Manantial.</w:t>
       </w:r>
     </w:p>
-    <w:bookmarkEnd w:id="103"/>
-    <w:bookmarkEnd w:id="104"/>
+    <w:bookmarkEnd w:id="107"/>
+    <w:bookmarkEnd w:id="108"/>
     <w:p>
       <w:r>
         <w:br w:type="page"/>
       </w:r>
     </w:p>
-    <w:bookmarkEnd w:id="105"/>
-    <w:bookmarkStart w:id="113" w:name="anexos-metodológicos"/>
+    <w:bookmarkEnd w:id="109"/>
+    <w:bookmarkStart w:id="117" w:name="anexos-metodológicos"/>
     <w:p>
       <w:pPr>
         <w:pStyle w:val="Heading1"/>
@@ -9614,7 +10292,7 @@
         <w:t xml:space="preserve">Anexos Metodológicos</w:t>
       </w:r>
     </w:p>
-    <w:bookmarkStart w:id="109" w:name="X8a4bd6135b680293145e26a5b92e72f8957a555"/>
+    <w:bookmarkStart w:id="113" w:name="X8a4bd6135b680293145e26a5b92e72f8957a555"/>
     <w:p>
       <w:pPr>
         <w:pStyle w:val="Heading3"/>
@@ -9695,7 +10373,7 @@
         <w:t xml:space="preserve">Relevar opiniones, percepciones y juicios críticos sobre los mecanismos actuales de evaluación docente y las condiciones de factibilidad para un circuito formativo 360° adaptado a la singularidad institucional.</w:t>
       </w:r>
     </w:p>
-    <w:bookmarkStart w:id="106" w:name="X3d0159f788aeb954922d9917573028760542890"/>
+    <w:bookmarkStart w:id="110" w:name="X3d0159f788aeb954922d9917573028760542890"/>
     <w:p>
       <w:pPr>
         <w:pStyle w:val="Heading4"/>
@@ -9712,7 +10390,7 @@
         <w:pStyle w:val="Compact"/>
         <w:numPr>
           <w:ilvl w:val="0"/>
-          <w:numId w:val="1027"/>
+          <w:numId w:val="1032"/>
         </w:numPr>
         <w:spacing w:after="120"/>
         <w:ind w:left="720" w:hanging="720"/>
@@ -9737,7 +10415,7 @@
         <w:pStyle w:val="Compact"/>
         <w:numPr>
           <w:ilvl w:val="0"/>
-          <w:numId w:val="1027"/>
+          <w:numId w:val="1032"/>
         </w:numPr>
         <w:spacing w:after="120"/>
         <w:ind w:left="720" w:hanging="720"/>
@@ -9762,7 +10440,7 @@
         <w:pStyle w:val="Compact"/>
         <w:numPr>
           <w:ilvl w:val="0"/>
-          <w:numId w:val="1027"/>
+          <w:numId w:val="1032"/>
         </w:numPr>
         <w:spacing w:after="120"/>
         <w:ind w:left="720" w:hanging="720"/>
@@ -9787,7 +10465,7 @@
         <w:pStyle w:val="Compact"/>
         <w:numPr>
           <w:ilvl w:val="0"/>
-          <w:numId w:val="1027"/>
+          <w:numId w:val="1032"/>
         </w:numPr>
         <w:spacing w:after="120"/>
         <w:ind w:left="720" w:hanging="720"/>
@@ -9812,7 +10490,7 @@
         <w:pStyle w:val="Compact"/>
         <w:numPr>
           <w:ilvl w:val="0"/>
-          <w:numId w:val="1027"/>
+          <w:numId w:val="1032"/>
         </w:numPr>
         <w:spacing w:after="120"/>
         <w:ind w:left="720" w:hanging="720"/>
@@ -9837,7 +10515,7 @@
         <w:pStyle w:val="Compact"/>
         <w:numPr>
           <w:ilvl w:val="0"/>
-          <w:numId w:val="1027"/>
+          <w:numId w:val="1032"/>
         </w:numPr>
         <w:spacing w:after="120"/>
         <w:ind w:left="720" w:hanging="720"/>
@@ -9862,7 +10540,7 @@
         <w:pStyle w:val="Compact"/>
         <w:numPr>
           <w:ilvl w:val="0"/>
-          <w:numId w:val="1027"/>
+          <w:numId w:val="1032"/>
         </w:numPr>
         <w:spacing w:after="120"/>
         <w:ind w:left="720" w:hanging="720"/>
@@ -9882,8 +10560,8 @@
         <w:t xml:space="preserve">¿De qué forma deberían vincularse los resultados con el Programa Anual de Capacitación Docente (Art. 76 del Estatuto UNCo)?</w:t>
       </w:r>
     </w:p>
-    <w:bookmarkEnd w:id="106"/>
-    <w:bookmarkStart w:id="107" w:name="X0f5478bf378498a567f3b1fa4c8b45406ac87b1"/>
+    <w:bookmarkEnd w:id="110"/>
+    <w:bookmarkStart w:id="111" w:name="X0f5478bf378498a567f3b1fa4c8b45406ac87b1"/>
     <w:p>
       <w:pPr>
         <w:pStyle w:val="Heading4"/>
@@ -9900,7 +10578,7 @@
         <w:pStyle w:val="Compact"/>
         <w:numPr>
           <w:ilvl w:val="0"/>
-          <w:numId w:val="1028"/>
+          <w:numId w:val="1033"/>
         </w:numPr>
         <w:spacing w:after="120"/>
         <w:ind w:left="720" w:hanging="720"/>
@@ -9925,7 +10603,7 @@
         <w:pStyle w:val="Compact"/>
         <w:numPr>
           <w:ilvl w:val="0"/>
-          <w:numId w:val="1028"/>
+          <w:numId w:val="1033"/>
         </w:numPr>
         <w:spacing w:after="120"/>
         <w:ind w:left="720" w:hanging="720"/>
@@ -9945,8 +10623,8 @@
         <w:t xml:space="preserve">¿Qué mecanismos de veeduría y gobernanza gremial deberían incorporarse en la administración y custodia técnica de los formularios para otorgar plena certeza de que los datos diagnósticos no serán transferidos a legajos ni utilizados por jurados de permanencia o acreditación?</w:t>
       </w:r>
     </w:p>
-    <w:bookmarkEnd w:id="107"/>
-    <w:bookmarkStart w:id="108" w:name="Xd8dec2b8a7f90a67e87e467aa5930d6b0d4f51b"/>
+    <w:bookmarkEnd w:id="111"/>
+    <w:bookmarkStart w:id="112" w:name="Xd8dec2b8a7f90a67e87e467aa5930d6b0d4f51b"/>
     <w:p>
       <w:pPr>
         <w:pStyle w:val="Heading4"/>
@@ -9963,7 +10641,7 @@
         <w:pStyle w:val="Compact"/>
         <w:numPr>
           <w:ilvl w:val="0"/>
-          <w:numId w:val="1029"/>
+          <w:numId w:val="1034"/>
         </w:numPr>
         <w:spacing w:after="120"/>
         <w:ind w:left="720" w:hanging="720"/>
@@ -9988,7 +10666,7 @@
         <w:pStyle w:val="Compact"/>
         <w:numPr>
           <w:ilvl w:val="0"/>
-          <w:numId w:val="1029"/>
+          <w:numId w:val="1034"/>
         </w:numPr>
         <w:spacing w:after="120"/>
         <w:ind w:left="720" w:hanging="720"/>
@@ -10013,9 +10691,9 @@
         <w:br w:type="page"/>
       </w:r>
     </w:p>
-    <w:bookmarkEnd w:id="108"/>
-    <w:bookmarkEnd w:id="109"/>
-    <w:bookmarkStart w:id="110" w:name="Xed927c32308fb922173a9e4e6308883f42ff086"/>
+    <w:bookmarkEnd w:id="112"/>
+    <w:bookmarkEnd w:id="113"/>
+    <w:bookmarkStart w:id="114" w:name="Xed927c32308fb922173a9e4e6308883f42ff086"/>
     <w:p>
       <w:pPr>
         <w:pStyle w:val="Heading3"/>
@@ -11527,7 +12205,7 @@
       <w:pPr>
         <w:numPr>
           <w:ilvl w:val="0"/>
-          <w:numId w:val="1030"/>
+          <w:numId w:val="1035"/>
         </w:numPr>
         <w:spacing w:after="120"/>
         <w:ind w:left="720" w:hanging="720"/>
@@ -11579,7 +12257,7 @@
       <w:pPr>
         <w:numPr>
           <w:ilvl w:val="0"/>
-          <w:numId w:val="1030"/>
+          <w:numId w:val="1035"/>
         </w:numPr>
         <w:spacing w:after="120"/>
         <w:ind w:left="720" w:hanging="720"/>
@@ -11632,8 +12310,8 @@
         <w:br w:type="page"/>
       </w:r>
     </w:p>
-    <w:bookmarkEnd w:id="110"/>
-    <w:bookmarkStart w:id="111" w:name="X2fe5c967a6121280ba4c78ad136dc18f1f34381"/>
+    <w:bookmarkEnd w:id="114"/>
+    <w:bookmarkStart w:id="115" w:name="X2fe5c967a6121280ba4c78ad136dc18f1f34381"/>
     <w:p>
       <w:pPr>
         <w:pStyle w:val="Heading3"/>
@@ -11788,7 +12466,7 @@
         <w:pStyle w:val="Compact"/>
         <w:numPr>
           <w:ilvl w:val="0"/>
-          <w:numId w:val="1031"/>
+          <w:numId w:val="1036"/>
         </w:numPr>
         <w:spacing w:after="120"/>
         <w:ind w:left="720" w:hanging="720"/>
@@ -11806,7 +12484,7 @@
         <w:pStyle w:val="Compact"/>
         <w:numPr>
           <w:ilvl w:val="0"/>
-          <w:numId w:val="1031"/>
+          <w:numId w:val="1036"/>
         </w:numPr>
         <w:spacing w:after="120"/>
         <w:ind w:left="720" w:hanging="720"/>
@@ -11824,7 +12502,7 @@
         <w:pStyle w:val="Compact"/>
         <w:numPr>
           <w:ilvl w:val="0"/>
-          <w:numId w:val="1031"/>
+          <w:numId w:val="1036"/>
         </w:numPr>
         <w:spacing w:after="120"/>
         <w:ind w:left="720" w:hanging="720"/>
@@ -11914,8 +12592,8 @@
         <w:br w:type="page"/>
       </w:r>
     </w:p>
-    <w:bookmarkEnd w:id="111"/>
-    <w:bookmarkStart w:id="112" w:name="Xdd43486170bd3838ba53edb989ff446467f8d87"/>
+    <w:bookmarkEnd w:id="115"/>
+    <w:bookmarkStart w:id="116" w:name="Xdd43486170bd3838ba53edb989ff446467f8d87"/>
     <w:p>
       <w:pPr>
         <w:pStyle w:val="Heading3"/>
@@ -11953,7 +12631,7 @@
       <w:pPr>
         <w:numPr>
           <w:ilvl w:val="0"/>
-          <w:numId w:val="1032"/>
+          <w:numId w:val="1037"/>
         </w:numPr>
         <w:spacing w:after="120"/>
         <w:ind w:left="720" w:hanging="720"/>
@@ -11984,7 +12662,7 @@
       <w:pPr>
         <w:numPr>
           <w:ilvl w:val="0"/>
-          <w:numId w:val="1032"/>
+          <w:numId w:val="1037"/>
         </w:numPr>
         <w:spacing w:after="120"/>
         <w:ind w:left="720" w:hanging="720"/>
@@ -12008,7 +12686,7 @@
       <w:pPr>
         <w:numPr>
           <w:ilvl w:val="0"/>
-          <w:numId w:val="1032"/>
+          <w:numId w:val="1037"/>
         </w:numPr>
         <w:spacing w:after="120"/>
         <w:ind w:left="720" w:hanging="720"/>
@@ -12032,7 +12710,7 @@
       <w:pPr>
         <w:numPr>
           <w:ilvl w:val="0"/>
-          <w:numId w:val="1032"/>
+          <w:numId w:val="1037"/>
         </w:numPr>
         <w:spacing w:after="120"/>
         <w:ind w:left="720" w:hanging="720"/>
@@ -12051,7 +12729,7 @@
         <w:pStyle w:val="Compact"/>
         <w:numPr>
           <w:ilvl w:val="1"/>
-          <w:numId w:val="1033"/>
+          <w:numId w:val="1038"/>
         </w:numPr>
         <w:spacing w:after="120"/>
         <w:ind w:left="720" w:hanging="720"/>
@@ -12066,7 +12744,7 @@
         <w:pStyle w:val="Compact"/>
         <w:numPr>
           <w:ilvl w:val="1"/>
-          <w:numId w:val="1033"/>
+          <w:numId w:val="1038"/>
         </w:numPr>
         <w:spacing w:after="120"/>
         <w:ind w:left="720" w:hanging="720"/>
@@ -12081,7 +12759,7 @@
         <w:pStyle w:val="Compact"/>
         <w:numPr>
           <w:ilvl w:val="1"/>
-          <w:numId w:val="1033"/>
+          <w:numId w:val="1038"/>
         </w:numPr>
         <w:spacing w:after="120"/>
         <w:ind w:left="720" w:hanging="720"/>
@@ -12096,7 +12774,7 @@
         <w:pStyle w:val="Compact"/>
         <w:numPr>
           <w:ilvl w:val="1"/>
-          <w:numId w:val="1033"/>
+          <w:numId w:val="1038"/>
         </w:numPr>
         <w:spacing w:after="120"/>
         <w:ind w:left="720" w:hanging="720"/>
@@ -12291,8 +12969,8 @@
         </w:tc>
       </w:tr>
     </w:tbl>
-    <w:bookmarkEnd w:id="112"/>
-    <w:bookmarkEnd w:id="113"/>
+    <w:bookmarkEnd w:id="116"/>
+    <w:bookmarkEnd w:id="117"/>
     <w:sectPr>
       <w:footerReference w:type="default" r:id="rId11"/>
       <w:footnotePr>
@@ -12929,34 +13607,7 @@
     <w:abstractNumId w:val="991"/>
   </w:num>
   <w:num w:numId="1021">
-    <w:abstractNumId w:val="99411"/>
-    <w:lvlOverride w:ilvl="0">
-      <w:startOverride w:val="1"/>
-    </w:lvlOverride>
-    <w:lvlOverride w:ilvl="1">
-      <w:startOverride w:val="1"/>
-    </w:lvlOverride>
-    <w:lvlOverride w:ilvl="2">
-      <w:startOverride w:val="1"/>
-    </w:lvlOverride>
-    <w:lvlOverride w:ilvl="3">
-      <w:startOverride w:val="1"/>
-    </w:lvlOverride>
-    <w:lvlOverride w:ilvl="4">
-      <w:startOverride w:val="1"/>
-    </w:lvlOverride>
-    <w:lvlOverride w:ilvl="5">
-      <w:startOverride w:val="1"/>
-    </w:lvlOverride>
-    <w:lvlOverride w:ilvl="6">
-      <w:startOverride w:val="1"/>
-    </w:lvlOverride>
-    <w:lvlOverride w:ilvl="7">
-      <w:startOverride w:val="1"/>
-    </w:lvlOverride>
-    <w:lvlOverride w:ilvl="8">
-      <w:startOverride w:val="1"/>
-    </w:lvlOverride>
+    <w:abstractNumId w:val="991"/>
   </w:num>
   <w:num w:numId="1022">
     <w:abstractNumId w:val="991"/>
@@ -12995,12 +13646,6 @@
     </w:lvlOverride>
   </w:num>
   <w:num w:numId="1025">
-    <w:abstractNumId w:val="991"/>
-  </w:num>
-  <w:num w:numId="1026">
-    <w:abstractNumId w:val="991"/>
-  </w:num>
-  <w:num w:numId="1027">
     <w:abstractNumId w:val="99411"/>
     <w:lvlOverride w:ilvl="0">
       <w:startOverride w:val="1"/>
@@ -13030,7 +13675,7 @@
       <w:startOverride w:val="1"/>
     </w:lvlOverride>
   </w:num>
-  <w:num w:numId="1028">
+  <w:num w:numId="1026">
     <w:abstractNumId w:val="99411"/>
     <w:lvlOverride w:ilvl="0">
       <w:startOverride w:val="1"/>
@@ -13059,6 +13704,12 @@
     <w:lvlOverride w:ilvl="8">
       <w:startOverride w:val="1"/>
     </w:lvlOverride>
+  </w:num>
+  <w:num w:numId="1027">
+    <w:abstractNumId w:val="991"/>
+  </w:num>
+  <w:num w:numId="1028">
+    <w:abstractNumId w:val="991"/>
   </w:num>
   <w:num w:numId="1029">
     <w:abstractNumId w:val="99411"/>
@@ -13094,34 +13745,7 @@
     <w:abstractNumId w:val="991"/>
   </w:num>
   <w:num w:numId="1031">
-    <w:abstractNumId w:val="99721"/>
-    <w:lvlOverride w:ilvl="0">
-      <w:startOverride w:val="1"/>
-    </w:lvlOverride>
-    <w:lvlOverride w:ilvl="1">
-      <w:startOverride w:val="1"/>
-    </w:lvlOverride>
-    <w:lvlOverride w:ilvl="2">
-      <w:startOverride w:val="1"/>
-    </w:lvlOverride>
-    <w:lvlOverride w:ilvl="3">
-      <w:startOverride w:val="1"/>
-    </w:lvlOverride>
-    <w:lvlOverride w:ilvl="4">
-      <w:startOverride w:val="1"/>
-    </w:lvlOverride>
-    <w:lvlOverride w:ilvl="5">
-      <w:startOverride w:val="1"/>
-    </w:lvlOverride>
-    <w:lvlOverride w:ilvl="6">
-      <w:startOverride w:val="1"/>
-    </w:lvlOverride>
-    <w:lvlOverride w:ilvl="7">
-      <w:startOverride w:val="1"/>
-    </w:lvlOverride>
-    <w:lvlOverride w:ilvl="8">
-      <w:startOverride w:val="1"/>
-    </w:lvlOverride>
+    <w:abstractNumId w:val="991"/>
   </w:num>
   <w:num w:numId="1032">
     <w:abstractNumId w:val="99411"/>
@@ -13154,6 +13778,129 @@
     </w:lvlOverride>
   </w:num>
   <w:num w:numId="1033">
+    <w:abstractNumId w:val="99411"/>
+    <w:lvlOverride w:ilvl="0">
+      <w:startOverride w:val="1"/>
+    </w:lvlOverride>
+    <w:lvlOverride w:ilvl="1">
+      <w:startOverride w:val="1"/>
+    </w:lvlOverride>
+    <w:lvlOverride w:ilvl="2">
+      <w:startOverride w:val="1"/>
+    </w:lvlOverride>
+    <w:lvlOverride w:ilvl="3">
+      <w:startOverride w:val="1"/>
+    </w:lvlOverride>
+    <w:lvlOverride w:ilvl="4">
+      <w:startOverride w:val="1"/>
+    </w:lvlOverride>
+    <w:lvlOverride w:ilvl="5">
+      <w:startOverride w:val="1"/>
+    </w:lvlOverride>
+    <w:lvlOverride w:ilvl="6">
+      <w:startOverride w:val="1"/>
+    </w:lvlOverride>
+    <w:lvlOverride w:ilvl="7">
+      <w:startOverride w:val="1"/>
+    </w:lvlOverride>
+    <w:lvlOverride w:ilvl="8">
+      <w:startOverride w:val="1"/>
+    </w:lvlOverride>
+  </w:num>
+  <w:num w:numId="1034">
+    <w:abstractNumId w:val="99411"/>
+    <w:lvlOverride w:ilvl="0">
+      <w:startOverride w:val="1"/>
+    </w:lvlOverride>
+    <w:lvlOverride w:ilvl="1">
+      <w:startOverride w:val="1"/>
+    </w:lvlOverride>
+    <w:lvlOverride w:ilvl="2">
+      <w:startOverride w:val="1"/>
+    </w:lvlOverride>
+    <w:lvlOverride w:ilvl="3">
+      <w:startOverride w:val="1"/>
+    </w:lvlOverride>
+    <w:lvlOverride w:ilvl="4">
+      <w:startOverride w:val="1"/>
+    </w:lvlOverride>
+    <w:lvlOverride w:ilvl="5">
+      <w:startOverride w:val="1"/>
+    </w:lvlOverride>
+    <w:lvlOverride w:ilvl="6">
+      <w:startOverride w:val="1"/>
+    </w:lvlOverride>
+    <w:lvlOverride w:ilvl="7">
+      <w:startOverride w:val="1"/>
+    </w:lvlOverride>
+    <w:lvlOverride w:ilvl="8">
+      <w:startOverride w:val="1"/>
+    </w:lvlOverride>
+  </w:num>
+  <w:num w:numId="1035">
+    <w:abstractNumId w:val="991"/>
+  </w:num>
+  <w:num w:numId="1036">
+    <w:abstractNumId w:val="99721"/>
+    <w:lvlOverride w:ilvl="0">
+      <w:startOverride w:val="1"/>
+    </w:lvlOverride>
+    <w:lvlOverride w:ilvl="1">
+      <w:startOverride w:val="1"/>
+    </w:lvlOverride>
+    <w:lvlOverride w:ilvl="2">
+      <w:startOverride w:val="1"/>
+    </w:lvlOverride>
+    <w:lvlOverride w:ilvl="3">
+      <w:startOverride w:val="1"/>
+    </w:lvlOverride>
+    <w:lvlOverride w:ilvl="4">
+      <w:startOverride w:val="1"/>
+    </w:lvlOverride>
+    <w:lvlOverride w:ilvl="5">
+      <w:startOverride w:val="1"/>
+    </w:lvlOverride>
+    <w:lvlOverride w:ilvl="6">
+      <w:startOverride w:val="1"/>
+    </w:lvlOverride>
+    <w:lvlOverride w:ilvl="7">
+      <w:startOverride w:val="1"/>
+    </w:lvlOverride>
+    <w:lvlOverride w:ilvl="8">
+      <w:startOverride w:val="1"/>
+    </w:lvlOverride>
+  </w:num>
+  <w:num w:numId="1037">
+    <w:abstractNumId w:val="99411"/>
+    <w:lvlOverride w:ilvl="0">
+      <w:startOverride w:val="1"/>
+    </w:lvlOverride>
+    <w:lvlOverride w:ilvl="1">
+      <w:startOverride w:val="1"/>
+    </w:lvlOverride>
+    <w:lvlOverride w:ilvl="2">
+      <w:startOverride w:val="1"/>
+    </w:lvlOverride>
+    <w:lvlOverride w:ilvl="3">
+      <w:startOverride w:val="1"/>
+    </w:lvlOverride>
+    <w:lvlOverride w:ilvl="4">
+      <w:startOverride w:val="1"/>
+    </w:lvlOverride>
+    <w:lvlOverride w:ilvl="5">
+      <w:startOverride w:val="1"/>
+    </w:lvlOverride>
+    <w:lvlOverride w:ilvl="6">
+      <w:startOverride w:val="1"/>
+    </w:lvlOverride>
+    <w:lvlOverride w:ilvl="7">
+      <w:startOverride w:val="1"/>
+    </w:lvlOverride>
+    <w:lvlOverride w:ilvl="8">
+      <w:startOverride w:val="1"/>
+    </w:lvlOverride>
+  </w:num>
+  <w:num w:numId="1038">
     <w:abstractNumId w:val="991"/>
   </w:num>
 </w:numbering>

</xml_diff>

<commit_message>
feat: add integrated TFG research project document for Actividad 4
</commit_message>
<xml_diff>
--- a/Entregas/Actividad 4/TP4_Ayarachi_Fuentes.docx
+++ b/Entregas/Actividad 4/TP4_Ayarachi_Fuentes.docx
@@ -474,7 +474,7 @@
           <w:rFonts w:ascii="Arial" w:hAnsi="Arial"/>
           <w:sz w:val="22"/>
         </w:rPr>
-        <w:t>4</w:t>
+        <w:t>5</w:t>
       </w:r>
     </w:p>
     <w:p>
@@ -1247,7 +1247,7 @@
           <w:rFonts w:ascii="Arial" w:hAnsi="Arial"/>
           <w:sz w:val="22"/>
         </w:rPr>
-        <w:t>Muestra y Tipos de Muestreo (N)</w:t>
+        <w:t>Muestra y Tipos de Muestreo (n)</w:t>
       </w:r>
       <w:r>
         <w:tab/>
@@ -2461,7 +2461,7 @@
         <w:t xml:space="preserve"> </w:t>
       </w:r>
       <w:r>
-        <w:t xml:space="preserve">La unidad institucional es el Departamento de Administración Pública. Los actores involucrados comprenden docentes (regulares e interinos), estudiantes regulares y autoridades académicas (Dirección departamental y miembros del Consejo Departamental).</w:t>
+        <w:t xml:space="preserve">La unidad institucional es el Departamento de Administración Pública. Los actores involucrados comprenden docentes (regulares e interinos), estudiantes regulares, autoridades académicas (Dirección departamental y miembros del Consejo Departamental) y representantes gremiales paritarios (ADUNC).</w:t>
       </w:r>
     </w:p>
     <w:bookmarkEnd w:id="20"/>
@@ -5518,7 +5518,7 @@
           <w:i/>
           <w:iCs/>
         </w:rPr>
-        <w:t xml:space="preserve">N</w:t>
+        <w:t xml:space="preserve">n</w:t>
       </w:r>
       <w:r>
         <w:t xml:space="preserve">)</w:t>

</xml_diff>

<commit_message>
feat: add Actividad 4 deliverables and territorial network visualization artifacts
</commit_message>
<xml_diff>
--- a/Entregas/Actividad 4/TP4_Ayarachi_Fuentes.docx
+++ b/Entregas/Actividad 4/TP4_Ayarachi_Fuentes.docx
@@ -393,7 +393,7 @@
           <w:rFonts w:ascii="Arial" w:hAnsi="Arial"/>
           <w:sz w:val="22"/>
         </w:rPr>
-        <w:t>3</w:t>
+        <w:t>4</w:t>
       </w:r>
     </w:p>
     <w:p>
@@ -420,7 +420,7 @@
           <w:rFonts w:ascii="Arial" w:hAnsi="Arial"/>
           <w:sz w:val="22"/>
         </w:rPr>
-        <w:t>3</w:t>
+        <w:t>4</w:t>
       </w:r>
     </w:p>
     <w:p>
@@ -447,7 +447,7 @@
           <w:rFonts w:ascii="Arial" w:hAnsi="Arial"/>
           <w:sz w:val="22"/>
         </w:rPr>
-        <w:t>4</w:t>
+        <w:t>5</w:t>
       </w:r>
     </w:p>
     <w:p>
@@ -501,7 +501,7 @@
           <w:rFonts w:ascii="Arial" w:hAnsi="Arial"/>
           <w:sz w:val="22"/>
         </w:rPr>
-        <w:t>5</w:t>
+        <w:t>6</w:t>
       </w:r>
     </w:p>
     <w:p>
@@ -528,7 +528,7 @@
           <w:rFonts w:ascii="Arial" w:hAnsi="Arial"/>
           <w:sz w:val="22"/>
         </w:rPr>
-        <w:t>5</w:t>
+        <w:t>6</w:t>
       </w:r>
     </w:p>
     <w:p>
@@ -555,7 +555,7 @@
           <w:rFonts w:ascii="Arial" w:hAnsi="Arial"/>
           <w:sz w:val="22"/>
         </w:rPr>
-        <w:t>6</w:t>
+        <w:t>7</w:t>
       </w:r>
     </w:p>
     <w:p>
@@ -582,7 +582,7 @@
           <w:rFonts w:ascii="Arial" w:hAnsi="Arial"/>
           <w:sz w:val="22"/>
         </w:rPr>
-        <w:t>6</w:t>
+        <w:t>7</w:t>
       </w:r>
     </w:p>
     <w:p>
@@ -609,7 +609,7 @@
           <w:rFonts w:ascii="Arial" w:hAnsi="Arial"/>
           <w:sz w:val="22"/>
         </w:rPr>
-        <w:t>6</w:t>
+        <w:t>7</w:t>
       </w:r>
     </w:p>
     <w:p>
@@ -636,7 +636,7 @@
           <w:rFonts w:ascii="Arial" w:hAnsi="Arial"/>
           <w:sz w:val="22"/>
         </w:rPr>
-        <w:t>7</w:t>
+        <w:t>8</w:t>
       </w:r>
     </w:p>
     <w:p>
@@ -663,7 +663,7 @@
           <w:rFonts w:ascii="Arial" w:hAnsi="Arial"/>
           <w:sz w:val="22"/>
         </w:rPr>
-        <w:t>8</w:t>
+        <w:t>9</w:t>
       </w:r>
     </w:p>
     <w:p>
@@ -690,7 +690,7 @@
           <w:rFonts w:ascii="Arial" w:hAnsi="Arial"/>
           <w:sz w:val="22"/>
         </w:rPr>
-        <w:t>8</w:t>
+        <w:t>9</w:t>
       </w:r>
     </w:p>
     <w:p>
@@ -717,7 +717,7 @@
           <w:rFonts w:ascii="Arial" w:hAnsi="Arial"/>
           <w:sz w:val="22"/>
         </w:rPr>
-        <w:t>8</w:t>
+        <w:t>9</w:t>
       </w:r>
     </w:p>
     <w:p>
@@ -744,7 +744,7 @@
           <w:rFonts w:ascii="Arial" w:hAnsi="Arial"/>
           <w:sz w:val="22"/>
         </w:rPr>
-        <w:t>8</w:t>
+        <w:t>9</w:t>
       </w:r>
     </w:p>
     <w:p>
@@ -771,7 +771,7 @@
           <w:rFonts w:ascii="Arial" w:hAnsi="Arial"/>
           <w:sz w:val="22"/>
         </w:rPr>
-        <w:t>9</w:t>
+        <w:t>10</w:t>
       </w:r>
     </w:p>
     <w:p>
@@ -798,7 +798,7 @@
           <w:rFonts w:ascii="Arial" w:hAnsi="Arial"/>
           <w:sz w:val="22"/>
         </w:rPr>
-        <w:t>10</w:t>
+        <w:t>11</w:t>
       </w:r>
     </w:p>
     <w:p>
@@ -825,7 +825,7 @@
           <w:rFonts w:ascii="Arial" w:hAnsi="Arial"/>
           <w:sz w:val="22"/>
         </w:rPr>
-        <w:t>10</w:t>
+        <w:t>11</w:t>
       </w:r>
     </w:p>
     <w:p>
@@ -852,7 +852,7 @@
           <w:rFonts w:ascii="Arial" w:hAnsi="Arial"/>
           <w:sz w:val="22"/>
         </w:rPr>
-        <w:t>11</w:t>
+        <w:t>12</w:t>
       </w:r>
     </w:p>
     <w:p>
@@ -879,7 +879,7 @@
           <w:rFonts w:ascii="Arial" w:hAnsi="Arial"/>
           <w:sz w:val="22"/>
         </w:rPr>
-        <w:t>11</w:t>
+        <w:t>12</w:t>
       </w:r>
     </w:p>
     <w:p>
@@ -906,7 +906,7 @@
           <w:rFonts w:ascii="Arial" w:hAnsi="Arial"/>
           <w:sz w:val="22"/>
         </w:rPr>
-        <w:t>11</w:t>
+        <w:t>12</w:t>
       </w:r>
     </w:p>
     <w:p>
@@ -933,7 +933,7 @@
           <w:rFonts w:ascii="Arial" w:hAnsi="Arial"/>
           <w:sz w:val="22"/>
         </w:rPr>
-        <w:t>12</w:t>
+        <w:t>13</w:t>
       </w:r>
     </w:p>
     <w:p>
@@ -960,7 +960,7 @@
           <w:rFonts w:ascii="Arial" w:hAnsi="Arial"/>
           <w:sz w:val="22"/>
         </w:rPr>
-        <w:t>12</w:t>
+        <w:t>13</w:t>
       </w:r>
     </w:p>
     <w:p>
@@ -987,7 +987,7 @@
           <w:rFonts w:ascii="Arial" w:hAnsi="Arial"/>
           <w:sz w:val="22"/>
         </w:rPr>
-        <w:t>12</w:t>
+        <w:t>13</w:t>
       </w:r>
     </w:p>
     <w:p>
@@ -1014,7 +1014,7 @@
           <w:rFonts w:ascii="Arial" w:hAnsi="Arial"/>
           <w:sz w:val="22"/>
         </w:rPr>
-        <w:t>13</w:t>
+        <w:t>14</w:t>
       </w:r>
     </w:p>
     <w:p>
@@ -1041,7 +1041,7 @@
           <w:rFonts w:ascii="Arial" w:hAnsi="Arial"/>
           <w:sz w:val="22"/>
         </w:rPr>
-        <w:t>13</w:t>
+        <w:t>14</w:t>
       </w:r>
     </w:p>
     <w:p>
@@ -1068,7 +1068,7 @@
           <w:rFonts w:ascii="Arial" w:hAnsi="Arial"/>
           <w:sz w:val="22"/>
         </w:rPr>
-        <w:t>14</w:t>
+        <w:t>15</w:t>
       </w:r>
     </w:p>
     <w:p>
@@ -1095,7 +1095,7 @@
           <w:rFonts w:ascii="Arial" w:hAnsi="Arial"/>
           <w:sz w:val="22"/>
         </w:rPr>
-        <w:t>15</w:t>
+        <w:t>16</w:t>
       </w:r>
     </w:p>
     <w:p>
@@ -1122,7 +1122,7 @@
           <w:rFonts w:ascii="Arial" w:hAnsi="Arial"/>
           <w:sz w:val="22"/>
         </w:rPr>
-        <w:t>15</w:t>
+        <w:t>16</w:t>
       </w:r>
     </w:p>
     <w:p>
@@ -1149,7 +1149,7 @@
           <w:rFonts w:ascii="Arial" w:hAnsi="Arial"/>
           <w:sz w:val="22"/>
         </w:rPr>
-        <w:t>15</w:t>
+        <w:t>16</w:t>
       </w:r>
     </w:p>
     <w:p>
@@ -1176,7 +1176,7 @@
           <w:rFonts w:ascii="Arial" w:hAnsi="Arial"/>
           <w:sz w:val="22"/>
         </w:rPr>
-        <w:t>15</w:t>
+        <w:t>16</w:t>
       </w:r>
     </w:p>
     <w:p>
@@ -1203,7 +1203,7 @@
           <w:rFonts w:ascii="Arial" w:hAnsi="Arial"/>
           <w:sz w:val="22"/>
         </w:rPr>
-        <w:t>15</w:t>
+        <w:t>16</w:t>
       </w:r>
     </w:p>
     <w:p>
@@ -1230,7 +1230,7 @@
           <w:rFonts w:ascii="Arial" w:hAnsi="Arial"/>
           <w:sz w:val="22"/>
         </w:rPr>
-        <w:t>16</w:t>
+        <w:t>17</w:t>
       </w:r>
     </w:p>
     <w:p>
@@ -1257,7 +1257,7 @@
           <w:rFonts w:ascii="Arial" w:hAnsi="Arial"/>
           <w:sz w:val="22"/>
         </w:rPr>
-        <w:t>17</w:t>
+        <w:t>18</w:t>
       </w:r>
     </w:p>
     <w:p>
@@ -1284,7 +1284,7 @@
           <w:rFonts w:ascii="Arial" w:hAnsi="Arial"/>
           <w:sz w:val="22"/>
         </w:rPr>
-        <w:t>17</w:t>
+        <w:t>18</w:t>
       </w:r>
     </w:p>
     <w:p>
@@ -1311,7 +1311,7 @@
           <w:rFonts w:ascii="Arial" w:hAnsi="Arial"/>
           <w:sz w:val="22"/>
         </w:rPr>
-        <w:t>18</w:t>
+        <w:t>19</w:t>
       </w:r>
     </w:p>
     <w:p>
@@ -1338,7 +1338,7 @@
           <w:rFonts w:ascii="Arial" w:hAnsi="Arial"/>
           <w:sz w:val="22"/>
         </w:rPr>
-        <w:t>19</w:t>
+        <w:t>20</w:t>
       </w:r>
     </w:p>
     <w:p>
@@ -1365,7 +1365,7 @@
           <w:rFonts w:ascii="Arial" w:hAnsi="Arial"/>
           <w:sz w:val="22"/>
         </w:rPr>
-        <w:t>21</w:t>
+        <w:t>22</w:t>
       </w:r>
     </w:p>
     <w:p>
@@ -1392,7 +1392,7 @@
           <w:rFonts w:ascii="Arial" w:hAnsi="Arial"/>
           <w:sz w:val="22"/>
         </w:rPr>
-        <w:t>21</w:t>
+        <w:t>22</w:t>
       </w:r>
     </w:p>
     <w:p>
@@ -1419,7 +1419,7 @@
           <w:rFonts w:ascii="Arial" w:hAnsi="Arial"/>
           <w:sz w:val="22"/>
         </w:rPr>
-        <w:t>22</w:t>
+        <w:t>23</w:t>
       </w:r>
     </w:p>
     <w:p>
@@ -1446,7 +1446,7 @@
           <w:rFonts w:ascii="Arial" w:hAnsi="Arial"/>
           <w:sz w:val="22"/>
         </w:rPr>
-        <w:t>23</w:t>
+        <w:t>24</w:t>
       </w:r>
     </w:p>
     <w:p>
@@ -1473,7 +1473,7 @@
           <w:rFonts w:ascii="Arial" w:hAnsi="Arial"/>
           <w:sz w:val="22"/>
         </w:rPr>
-        <w:t>25</w:t>
+        <w:t>26</w:t>
       </w:r>
     </w:p>
     <w:p>
@@ -1500,7 +1500,7 @@
           <w:rFonts w:ascii="Arial" w:hAnsi="Arial"/>
           <w:sz w:val="22"/>
         </w:rPr>
-        <w:t>25</w:t>
+        <w:t>26</w:t>
       </w:r>
     </w:p>
     <w:p>
@@ -1527,7 +1527,7 @@
           <w:rFonts w:ascii="Arial" w:hAnsi="Arial"/>
           <w:sz w:val="22"/>
         </w:rPr>
-        <w:t>25</w:t>
+        <w:t>26</w:t>
       </w:r>
     </w:p>
     <w:p>
@@ -1554,7 +1554,7 @@
           <w:rFonts w:ascii="Arial" w:hAnsi="Arial"/>
           <w:sz w:val="22"/>
         </w:rPr>
-        <w:t>25</w:t>
+        <w:t>26</w:t>
       </w:r>
     </w:p>
     <w:p>
@@ -1581,7 +1581,7 @@
           <w:rFonts w:ascii="Arial" w:hAnsi="Arial"/>
           <w:sz w:val="22"/>
         </w:rPr>
-        <w:t>26</w:t>
+        <w:t>27</w:t>
       </w:r>
     </w:p>
     <w:p>
@@ -1608,7 +1608,7 @@
           <w:rFonts w:ascii="Arial" w:hAnsi="Arial"/>
           <w:sz w:val="22"/>
         </w:rPr>
-        <w:t>27</w:t>
+        <w:t>28</w:t>
       </w:r>
     </w:p>
     <w:p>
@@ -1635,7 +1635,7 @@
           <w:rFonts w:ascii="Arial" w:hAnsi="Arial"/>
           <w:sz w:val="22"/>
         </w:rPr>
-        <w:t>30</w:t>
+        <w:t>31</w:t>
       </w:r>
     </w:p>
     <w:p>
@@ -1662,7 +1662,7 @@
           <w:rFonts w:ascii="Arial" w:hAnsi="Arial"/>
           <w:sz w:val="22"/>
         </w:rPr>
-        <w:t>30</w:t>
+        <w:t>31</w:t>
       </w:r>
     </w:p>
     <w:p>
@@ -1689,7 +1689,7 @@
           <w:rFonts w:ascii="Arial" w:hAnsi="Arial"/>
           <w:sz w:val="22"/>
         </w:rPr>
-        <w:t>30</w:t>
+        <w:t>31</w:t>
       </w:r>
     </w:p>
     <w:p>
@@ -1716,7 +1716,7 @@
           <w:rFonts w:ascii="Arial" w:hAnsi="Arial"/>
           <w:sz w:val="22"/>
         </w:rPr>
-        <w:t>30</w:t>
+        <w:t>31</w:t>
       </w:r>
     </w:p>
     <w:p>
@@ -1743,7 +1743,7 @@
           <w:rFonts w:ascii="Arial" w:hAnsi="Arial"/>
           <w:sz w:val="22"/>
         </w:rPr>
-        <w:t>31</w:t>
+        <w:t>32</w:t>
       </w:r>
     </w:p>
     <w:p>
@@ -1770,7 +1770,7 @@
           <w:rFonts w:ascii="Arial" w:hAnsi="Arial"/>
           <w:sz w:val="22"/>
         </w:rPr>
-        <w:t>32</w:t>
+        <w:t>33</w:t>
       </w:r>
     </w:p>
     <w:p>
@@ -1797,7 +1797,7 @@
           <w:rFonts w:ascii="Arial" w:hAnsi="Arial"/>
           <w:sz w:val="22"/>
         </w:rPr>
-        <w:t>33</w:t>
+        <w:t>34</w:t>
       </w:r>
     </w:p>
     <w:p>
@@ -1824,7 +1824,7 @@
           <w:rFonts w:ascii="Arial" w:hAnsi="Arial"/>
           <w:sz w:val="22"/>
         </w:rPr>
-        <w:t>34</w:t>
+        <w:t>35</w:t>
       </w:r>
     </w:p>
     <w:p>
@@ -1888,7 +1888,7 @@
         <w:t xml:space="preserve">Primera parte de la estructura del Proyecto de investigación de TFG</w:t>
       </w:r>
     </w:p>
-    <w:bookmarkStart w:id="18" w:name="tema-de-investigación"/>
+    <w:bookmarkStart w:id="21" w:name="tema-de-investigación"/>
     <w:p>
       <w:pPr>
         <w:pStyle w:val="Heading2"/>
@@ -2147,7 +2147,7 @@
       </w:r>
     </w:p>
     <w:bookmarkEnd w:id="16"/>
-    <w:bookmarkStart w:id="17" w:name="contexto-institucional-y-normativo"/>
+    <w:bookmarkStart w:id="20" w:name="contexto-institucional-y-normativo"/>
     <w:p>
       <w:pPr>
         <w:pStyle w:val="Heading3"/>
@@ -2169,7 +2169,7 @@
         <w:pStyle w:val="FirstParagraph"/>
       </w:pPr>
       <w:r>
-        <w:t xml:space="preserve">El estudio se desarrolla en el Departamento de Administración Pública del CURZAS-UNCo, unidad académica con sede central en la ciudad de Viedma (Río Negro). El Departamento coordina la Licenciatura en Administración Pública, el Ciclo de Complementación Curricular de la Licenciatura en Gestión de Recursos Humanos y diversos trayectos formativos para el sector público provincial y municipal. Su población estudiantil comprende tanto jóvenes de la comarca Viedma-Patagones como trabajadores estatales insertos en administraciones públicas. A ello se suma la expansión territorial a través de la Red de Nodos Universitarios en localidades de la Línea Sur y la Costa Atlántica rionegrina (Sierra Grande, Valcheta, Los Menucos y Ramos Mexía), donde se implementan modalidades de cursada híbrida reguladas por la Resolución CD-CURZA N° 196/2022</w:t>
+        <w:t xml:space="preserve">El estudio se desarrolla en el Departamento de Administración Pública del CURZAS-UNCo, unidad académica con sede central en la ciudad de Viedma (Río Negro). El Departamento coordina la Licenciatura en Administración Pública, el Ciclo de Complementación Curricular de la Licenciatura en Gestión de Recursos Humanos y diversos trayectos formativos para el sector público provincial y municipal. Su población estudiantil comprende tanto jóvenes de la comarca Viedma-Patagones como trabajadores estatales insertos en administraciones públicas. A ello se suma la expansión territorial a través de la Red Territorial de Nodos Universitarios distribuida en 10 localidades rionegrinas (Valcheta, Ramos Mexía, Sierra Colorada, Los Menucos, Maquinchao, Ingeniero Jacobacci, San Antonio Oeste / Las Grutas, Sierra Grande, General Conesa y Río Colorado), articuladas desde la sede central de Viedma bajo modalidades de cursada híbrida reguladas por la Resolución CD-CURZA N° 196/2022</w:t>
       </w:r>
       <w:r>
         <w:t xml:space="preserve"> </w:t>
@@ -2178,7 +2178,78 @@
         <w:t xml:space="preserve">(Consejo Directivo del CURZAS, 2022)</w:t>
       </w:r>
       <w:r>
-        <w:t xml:space="preserve">.</w:t>
+        <w:t xml:space="preserve"> </w:t>
+      </w:r>
+      <w:r>
+        <w:t xml:space="preserve">(ver Figura 2).</w:t>
+      </w:r>
+    </w:p>
+    <w:p>
+      <w:pPr>
+        <w:pStyle w:val="CaptionedFigure"/>
+      </w:pPr>
+      <w:r>
+        <w:drawing>
+          <wp:inline>
+            <wp:extent cx="4907280" cy="3336844"/>
+            <wp:effectExtent b="0" l="0" r="0" t="0"/>
+            <wp:docPr descr="Red Territorial de Nodos Universitarios del CURZAS-UNCo (Resolución CD-CURZA N° 196/2022)." title="" id="18" name="Picture"/>
+            <a:graphic>
+              <a:graphicData uri="http://schemas.openxmlformats.org/drawingml/2006/picture">
+                <pic:pic>
+                  <pic:nvPicPr>
+                    <pic:cNvPr descr="assets/red_territorial.svg" id="19" name="Picture"/>
+                    <pic:cNvPicPr>
+                      <a:picLocks noChangeArrowheads="1" noChangeAspect="1"/>
+                    </pic:cNvPicPr>
+                  </pic:nvPicPr>
+                  <pic:blipFill>
+                    <a:blip>
+                      <a:extLst>
+                        <a:ext uri="{28A0092B-C50C-407E-A947-70E740481C1C}">
+                          <a14:useLocalDpi xmlns:a14="http://schemas.microsoft.com/office/drawing/2010/main" val="0"/>
+                        </a:ext>
+                        <a:ext uri="{96DAC541-7B7A-43D3-8B79-37D633B846F1}">
+                          <asvg:svgBlip xmlns:asvg="http://schemas.microsoft.com/office/drawing/2016/SVG/main" r:embed="rId17"/>
+                        </a:ext>
+                      </a:extLst>
+                    </a:blip>
+                    <a:stretch>
+                      <a:fillRect/>
+                    </a:stretch>
+                  </pic:blipFill>
+                  <pic:spPr bwMode="auto">
+                    <a:xfrm>
+                      <a:off x="0" y="0"/>
+                      <a:ext cx="4907280" cy="3336844"/>
+                    </a:xfrm>
+                    <a:prstGeom prst="rect">
+                      <a:avLst/>
+                    </a:prstGeom>
+                    <a:noFill/>
+                    <a:ln w="9525">
+                      <a:noFill/>
+                      <a:headEnd/>
+                      <a:tailEnd/>
+                    </a:ln>
+                  </pic:spPr>
+                </pic:pic>
+              </a:graphicData>
+            </a:graphic>
+          </wp:inline>
+        </w:drawing>
+      </w:r>
+    </w:p>
+    <w:p>
+      <w:pPr>
+        <w:pStyle w:val="ImageCaption"/>
+      </w:pPr>
+      <w:r>
+        <w:rPr>
+          <w:i/>
+          <w:iCs/>
+        </w:rPr>
+        <w:t xml:space="preserve">Red Territorial de Nodos Universitarios del CURZAS-UNCo (Resolución CD-CURZA N° 196/2022).</w:t>
       </w:r>
     </w:p>
     <w:p>
@@ -2272,9 +2343,9 @@
         <w:t xml:space="preserve">plantea que estos dispositivos operan prioritariamente bajo una lógica de control administrativo-sumativo orientado a la acreditación del cargo, existiendo un área de vacancia institucional respecto a instancias de retroalimentación formativa y colegiada para el perfeccionamiento pedagógico.</w:t>
       </w:r>
     </w:p>
-    <w:bookmarkEnd w:id="17"/>
-    <w:bookmarkEnd w:id="18"/>
-    <w:bookmarkStart w:id="23" w:name="delimitación-del-objeto-problema"/>
+    <w:bookmarkEnd w:id="20"/>
+    <w:bookmarkEnd w:id="21"/>
+    <w:bookmarkStart w:id="26" w:name="delimitación-del-objeto-problema"/>
     <w:p>
       <w:pPr>
         <w:pStyle w:val="Heading2"/>
@@ -2290,7 +2361,7 @@
         <w:t xml:space="preserve">Delimitación del Objeto Problema</w:t>
       </w:r>
     </w:p>
-    <w:bookmarkStart w:id="19" w:name="X980636a51acd85172d6d0208c80bd39d305601a"/>
+    <w:bookmarkStart w:id="22" w:name="X980636a51acd85172d6d0208c80bd39d305601a"/>
     <w:p>
       <w:pPr>
         <w:pStyle w:val="Heading3"/>
@@ -2341,8 +2412,8 @@
         <w:t xml:space="preserve">. La singularidad de esta investigación radica en indagar la factibilidad de este dispositivo en una unidad académica signada por el cogobierno colegiado, la negociación paritaria y la dispersión territorial en entornos híbridos.</w:t>
       </w:r>
     </w:p>
-    <w:bookmarkEnd w:id="19"/>
-    <w:bookmarkStart w:id="20" w:name="delimitaciones-metodológicas"/>
+    <w:bookmarkEnd w:id="22"/>
+    <w:bookmarkStart w:id="23" w:name="delimitaciones-metodológicas"/>
     <w:p>
       <w:pPr>
         <w:pStyle w:val="Heading3"/>
@@ -2417,7 +2488,7 @@
         <w:t xml:space="preserve"> </w:t>
       </w:r>
       <w:r>
-        <w:t xml:space="preserve">Sede central del CURZAS (Viedma) y Red de Nodos Universitarios (Sierra Grande, Valcheta, Los Menucos y Ramos Mexía) donde el Departamento dicta asignaturas con mediación tecnológica y presencialidad distribuida.</w:t>
+        <w:t xml:space="preserve">Sede central del CURZAS (Viedma) y Red Territorial de Nodos Universitarios en sus 10 localidades (Valcheta, Ramos Mexía, Sierra Colorada, Los Menucos, Maquinchao, Ingeniero Jacobacci, San Antonio Oeste / Las Grutas, Sierra Grande, General Conesa y Río Colorado), donde el Departamento dicta asignaturas bajo modalidades presenciales e híbridas con mediación tecnológica y presencialidad distribuida.</w:t>
       </w:r>
     </w:p>
     <w:p>
@@ -2464,8 +2535,8 @@
         <w:t xml:space="preserve">La unidad institucional es el Departamento de Administración Pública. Los actores involucrados comprenden docentes (regulares e interinos), estudiantes regulares, autoridades académicas (Dirección departamental y miembros del Consejo Departamental) y representantes gremiales paritarios (ADUNC).</w:t>
       </w:r>
     </w:p>
-    <w:bookmarkEnd w:id="20"/>
-    <w:bookmarkStart w:id="21" w:name="X34b8878ee35a59a32f57e99ffb922f09a66d9ea"/>
+    <w:bookmarkEnd w:id="23"/>
+    <w:bookmarkStart w:id="24" w:name="X34b8878ee35a59a32f57e99ffb922f09a66d9ea"/>
     <w:p>
       <w:pPr>
         <w:pStyle w:val="Heading3"/>
@@ -2609,8 +2680,8 @@
         <w:t xml:space="preserve">Viabilidad política para deliberar y consensuar la propuesta en los órganos colegiados de gobierno y con la representación gremial docente (ADUNC).</w:t>
       </w:r>
     </w:p>
-    <w:bookmarkEnd w:id="21"/>
-    <w:bookmarkStart w:id="22" w:name="pregunta-general-de-investigación"/>
+    <w:bookmarkEnd w:id="24"/>
+    <w:bookmarkStart w:id="25" w:name="pregunta-general-de-investigación"/>
     <w:p>
       <w:pPr>
         <w:pStyle w:val="Heading3"/>
@@ -2635,9 +2706,9 @@
         <w:t xml:space="preserve">¿Cuáles son las condiciones de factibilidad organizacional, técnica, normativa y de gobernanza multinivel para la implementación de un modelo de retroalimentación multiactoral (360°) en la evaluación del desempeño docente en el Departamento de Administración Pública del CURZAS-UNCo durante el año 2027?</w:t>
       </w:r>
     </w:p>
-    <w:bookmarkEnd w:id="22"/>
-    <w:bookmarkEnd w:id="23"/>
-    <w:bookmarkStart w:id="24" w:name="X681cec084bc0b6c304e32f87344fd4265dfa7e1"/>
+    <w:bookmarkEnd w:id="25"/>
+    <w:bookmarkEnd w:id="26"/>
+    <w:bookmarkStart w:id="27" w:name="X681cec084bc0b6c304e32f87344fd4265dfa7e1"/>
     <w:p>
       <w:pPr>
         <w:pStyle w:val="Heading2"/>
@@ -2745,8 +2816,8 @@
         <w:t xml:space="preserve">Consolida la trayectoria del tesista integrando la formación de base como Técnico Superior en Recursos Humanos con el Ciclo de Complementación Curricular de la Licenciatura en Gestión de Recursos Humanos, aplicando herramientas de diagnóstico organizacional al fortalecimiento de la educación pública regional.</w:t>
       </w:r>
     </w:p>
-    <w:bookmarkEnd w:id="24"/>
-    <w:bookmarkStart w:id="28" w:name="definición-de-objetivos-del-tfg"/>
+    <w:bookmarkEnd w:id="27"/>
+    <w:bookmarkStart w:id="31" w:name="definición-de-objetivos-del-tfg"/>
     <w:p>
       <w:pPr>
         <w:pStyle w:val="Heading2"/>
@@ -2762,7 +2833,7 @@
         <w:t xml:space="preserve">Definición de Objetivos del TFG</w:t>
       </w:r>
     </w:p>
-    <w:bookmarkStart w:id="25" w:name="objetivo-general"/>
+    <w:bookmarkStart w:id="28" w:name="objetivo-general"/>
     <w:p>
       <w:pPr>
         <w:pStyle w:val="Heading3"/>
@@ -2791,8 +2862,8 @@
         <w:t xml:space="preserve">Determinar las condiciones de factibilidad organizacional, técnica, normativa y de gobernanza multinivel para la implementación de un modelo de retroalimentación multiactoral (360°) en la evaluación del desempeño docente en el Departamento de Administración Pública del CURZAS-UNCo (2027).</w:t>
       </w:r>
     </w:p>
-    <w:bookmarkEnd w:id="25"/>
-    <w:bookmarkStart w:id="26" w:name="objetivos-específicos"/>
+    <w:bookmarkEnd w:id="28"/>
+    <w:bookmarkStart w:id="29" w:name="objetivos-específicos"/>
     <w:p>
       <w:pPr>
         <w:pStyle w:val="Heading3"/>
@@ -2862,8 +2933,8 @@
         <w:br w:type="page"/>
       </w:r>
     </w:p>
-    <w:bookmarkEnd w:id="26"/>
-    <w:bookmarkStart w:id="27" w:name="X296c76344d338238a09b1d3109b3b1ec06ec08f"/>
+    <w:bookmarkEnd w:id="29"/>
+    <w:bookmarkStart w:id="30" w:name="X296c76344d338238a09b1d3109b3b1ec06ec08f"/>
     <w:p>
       <w:pPr>
         <w:pStyle w:val="Heading3"/>
@@ -3454,10 +3525,10 @@
         <w:br w:type="page"/>
       </w:r>
     </w:p>
-    <w:bookmarkEnd w:id="27"/>
-    <w:bookmarkEnd w:id="28"/>
-    <w:bookmarkEnd w:id="29"/>
-    <w:bookmarkStart w:id="45" w:name="Xef007dd282ae18f13df7a545a4430773f008bd7"/>
+    <w:bookmarkEnd w:id="30"/>
+    <w:bookmarkEnd w:id="31"/>
+    <w:bookmarkEnd w:id="32"/>
+    <w:bookmarkStart w:id="48" w:name="Xef007dd282ae18f13df7a545a4430773f008bd7"/>
     <w:p>
       <w:pPr>
         <w:pStyle w:val="Heading1"/>
@@ -3473,7 +3544,7 @@
         <w:t xml:space="preserve">Segunda parte de la estructura del Proyecto de investigación de TFG</w:t>
       </w:r>
     </w:p>
-    <w:bookmarkStart w:id="39" w:name="X26fd7edd3045b8a76e95745d23dedb33f2c164e"/>
+    <w:bookmarkStart w:id="42" w:name="X26fd7edd3045b8a76e95745d23dedb33f2c164e"/>
     <w:p>
       <w:pPr>
         <w:pStyle w:val="Heading2"/>
@@ -3489,7 +3560,7 @@
         <w:t xml:space="preserve">Marco Teórico: Posicionamiento Teórico y Conceptos Centrales</w:t>
       </w:r>
     </w:p>
-    <w:bookmarkStart w:id="30" w:name="Xb18223e7ab7e266bae13897adec2a6fe4848c02"/>
+    <w:bookmarkStart w:id="33" w:name="Xb18223e7ab7e266bae13897adec2a6fe4848c02"/>
     <w:p>
       <w:pPr>
         <w:pStyle w:val="Heading3"/>
@@ -3643,8 +3714,8 @@
         <w:t xml:space="preserve">hacia los conceptos específicos sobre evaluación multiactoral y gobernanza universitaria.</w:t>
       </w:r>
     </w:p>
-    <w:bookmarkEnd w:id="30"/>
-    <w:bookmarkStart w:id="31" w:name="Xb8875c50f8cca48579b6c9183d92a2c8c162b10"/>
+    <w:bookmarkEnd w:id="33"/>
+    <w:bookmarkStart w:id="34" w:name="Xb8875c50f8cca48579b6c9183d92a2c8c162b10"/>
     <w:p>
       <w:pPr>
         <w:pStyle w:val="Heading3"/>
@@ -3817,8 +3888,8 @@
         <w:t xml:space="preserve">Analiza el clima institucional, la confianza intersubjetiva y los canales de diálogo paritario docente. En instituciones cogobernadas, la evaluación incide en la percepción de estabilidad en el empleo; por ende, los acuerdos paritarios y los resguardos éticos de confidencialidad resultan indispensables para habilitar una disposición favorable hacia la coevaluación formativa.</w:t>
       </w:r>
     </w:p>
-    <w:bookmarkEnd w:id="31"/>
-    <w:bookmarkStart w:id="32" w:name="Xbe717e7d4a9ec277373b323803583edbc62981a"/>
+    <w:bookmarkEnd w:id="34"/>
+    <w:bookmarkStart w:id="35" w:name="Xbe717e7d4a9ec277373b323803583edbc62981a"/>
     <w:p>
       <w:pPr>
         <w:pStyle w:val="Heading3"/>
@@ -4025,8 +4096,8 @@
         <w:t xml:space="preserve">.</w:t>
       </w:r>
     </w:p>
-    <w:bookmarkEnd w:id="32"/>
-    <w:bookmarkStart w:id="36" w:name="Xd97e498e3d88442da002e9050d2761475d79c3a"/>
+    <w:bookmarkEnd w:id="35"/>
+    <w:bookmarkStart w:id="39" w:name="Xd97e498e3d88442da002e9050d2761475d79c3a"/>
     <w:p>
       <w:pPr>
         <w:pStyle w:val="Heading3"/>
@@ -4051,7 +4122,7 @@
         <w:t xml:space="preserve">La incorporación de un dispositivo 360° en una universidad pública no constituye un desafío meramente instrumental; requiere comprender la dinámica de la gobernanza universitaria en el Estado argentino:</w:t>
       </w:r>
     </w:p>
-    <w:bookmarkStart w:id="33" w:name="X441a00c0d254351c9a332b2c631a0519d33222b"/>
+    <w:bookmarkStart w:id="36" w:name="X441a00c0d254351c9a332b2c631a0519d33222b"/>
     <w:p>
       <w:pPr>
         <w:pStyle w:val="Heading4"/>
@@ -4174,8 +4245,8 @@
         <w:t xml:space="preserve">. En el CURZAS, implica superar las encuestas genéricas estandarizadas para captar las realidades específicas de cada cátedra y modalidad de cursada.</w:t>
       </w:r>
     </w:p>
-    <w:bookmarkEnd w:id="33"/>
-    <w:bookmarkStart w:id="34" w:name="X3b7f0cca9a35347f8fa298fc8173bc4a1360520"/>
+    <w:bookmarkEnd w:id="36"/>
+    <w:bookmarkStart w:id="37" w:name="X3b7f0cca9a35347f8fa298fc8173bc4a1360520"/>
     <w:p>
       <w:pPr>
         <w:pStyle w:val="Heading4"/>
@@ -4276,7 +4347,7 @@
         <w:t xml:space="preserve"> </w:t>
       </w:r>
       <w:r>
-        <w:t xml:space="preserve">La Red de Nodos Universitarios (Sierra Grande, Valcheta, Los Menucos y Ramos Mexía), donde las prácticas híbridas demandan acompañamiento tutorial virtual específico</w:t>
+        <w:t xml:space="preserve">La Red Territorial de Nodos Universitarios (10 localidades distribuidas en la Línea Sur, Valle Medio y Costa Atlántica), donde las prácticas híbridas demandan acompañamiento tutorial virtual específico</w:t>
       </w:r>
       <w:r>
         <w:t xml:space="preserve"> </w:t>
@@ -4310,8 +4381,8 @@
         <w:t xml:space="preserve">La representación paritaria docente (ADUNC), encargada de salvaguardar las condiciones laborales y la estabilidad en el marco del Convenio Colectivo de Trabajo (Decreto N° 1246/2015).</w:t>
       </w:r>
     </w:p>
-    <w:bookmarkEnd w:id="34"/>
-    <w:bookmarkStart w:id="35" w:name="X06fb08f7e444eef45b7a0765efa6c79209c7fab"/>
+    <w:bookmarkEnd w:id="37"/>
+    <w:bookmarkStart w:id="38" w:name="X06fb08f7e444eef45b7a0765efa6c79209c7fab"/>
     <w:p>
       <w:pPr>
         <w:pStyle w:val="Heading4"/>
@@ -4399,9 +4470,9 @@
         <w:t xml:space="preserve">, evitando la fiscalización tecno-burocrática y garantizando el procesamiento anónimo de información para nutrir la capacitación continua.</w:t>
       </w:r>
     </w:p>
-    <w:bookmarkEnd w:id="35"/>
-    <w:bookmarkEnd w:id="36"/>
-    <w:bookmarkStart w:id="37" w:name="X120ce32e3a55bf3a66f31e165867e06e6d73a60"/>
+    <w:bookmarkEnd w:id="38"/>
+    <w:bookmarkEnd w:id="39"/>
+    <w:bookmarkStart w:id="40" w:name="X120ce32e3a55bf3a66f31e165867e06e6d73a60"/>
     <w:p>
       <w:pPr>
         <w:pStyle w:val="Heading3"/>
@@ -4536,8 +4607,8 @@
         <w:t xml:space="preserve">Sujetos concretos que experimentan cotidianamente la práctica formativa: docentes de cátedra y tutores de nodos, estudiantes de diversas trayectorias, equipos de conducción académica y representantes gremiales paritarios. La evaluación formativa interpela a los actores en sus dinámicas reales de enseñanza y aprendizaje, más allá de la abstracción de los estamentos jurídicos formales.</w:t>
       </w:r>
     </w:p>
-    <w:bookmarkEnd w:id="37"/>
-    <w:bookmarkStart w:id="38" w:name="Xe4682b0903028e640f5cdf6dae8165b743875f4"/>
+    <w:bookmarkEnd w:id="40"/>
+    <w:bookmarkStart w:id="41" w:name="Xe4682b0903028e640f5cdf6dae8165b743875f4"/>
     <w:p>
       <w:pPr>
         <w:pStyle w:val="Heading3"/>
@@ -4562,9 +4633,9 @@
         <w:t xml:space="preserve">La investigación evita postular deductivamente las condiciones definitivas de viabilidad. Por el contrario, se formulan como hipótesis preliminares abiertas a contrastación empírica: corresponderá al trabajo de campo relevar en qué medida las garantías de voluntariedad, anonimato y finalidad formativa son valoradas como indispensables por la comunidad del CURZAS, o si emergen otros condicionantes culturales (como la visibilidad en cátedras unipersonales) o técnicos (fatiga evaluativa) que deban considerarse en la formulación de los lineamientos finales.</w:t>
       </w:r>
     </w:p>
-    <w:bookmarkEnd w:id="38"/>
-    <w:bookmarkEnd w:id="39"/>
-    <w:bookmarkStart w:id="44" w:name="X77155299af2def8333549b16a82948e9810ead2"/>
+    <w:bookmarkEnd w:id="41"/>
+    <w:bookmarkEnd w:id="42"/>
+    <w:bookmarkStart w:id="47" w:name="X77155299af2def8333549b16a82948e9810ead2"/>
     <w:p>
       <w:pPr>
         <w:pStyle w:val="Heading2"/>
@@ -4609,7 +4680,7 @@
         <w:t xml:space="preserve">, el relevamiento de antecedentes sistematiza la evidencia empírica acumulada y delimita la vacancia de conocimiento que justifica el proyecto, organizándose en tres escalas geográficas:</w:t>
       </w:r>
     </w:p>
-    <w:bookmarkStart w:id="40" w:name="antecedentes-internacionales"/>
+    <w:bookmarkStart w:id="43" w:name="antecedentes-internacionales"/>
     <w:p>
       <w:pPr>
         <w:pStyle w:val="Heading3"/>
@@ -4714,8 +4785,8 @@
         <w:t xml:space="preserve">desarrollaron en la UNAM una propuesta 360° que pondera docencia, tutoría y gestión institucional, aportando criterios para operacionalizar cuestionarios estructurados y articularlos con planes de actualización pedagógica.</w:t>
       </w:r>
     </w:p>
-    <w:bookmarkEnd w:id="40"/>
-    <w:bookmarkStart w:id="41" w:name="antecedentes-nacionales"/>
+    <w:bookmarkEnd w:id="43"/>
+    <w:bookmarkStart w:id="44" w:name="antecedentes-nacionales"/>
     <w:p>
       <w:pPr>
         <w:pStyle w:val="Heading3"/>
@@ -4776,8 +4847,8 @@
         <w:t xml:space="preserve">evaluaron la aplicación de la metodología 360° en tutorías presenciales y virtuales de universidades públicas. Concluyeron que el modelo multidireccional capta competencias pedagógicas y tutoriales (comunicación asertiva, acompañamiento digital) con mayor precisión que las rúbricas estandarizadas, aportando un antecedente relevante para entornos de enseñanza híbridos.</w:t>
       </w:r>
     </w:p>
-    <w:bookmarkEnd w:id="41"/>
-    <w:bookmarkStart w:id="42" w:name="Xd9ab4c3fa3d27cdc1a70efec5c56f421e0bf059"/>
+    <w:bookmarkEnd w:id="44"/>
+    <w:bookmarkStart w:id="45" w:name="Xd9ab4c3fa3d27cdc1a70efec5c56f421e0bf059"/>
     <w:p>
       <w:pPr>
         <w:pStyle w:val="Heading3"/>
@@ -4875,7 +4946,7 @@
         <w:t xml:space="preserve"> </w:t>
       </w:r>
       <w:r>
-        <w:t xml:space="preserve">Valida las mediaciones pedagógicas híbridas en las localidades de la Línea Sur y Costa Atlántica rionegrina</w:t>
+        <w:t xml:space="preserve">Valida las mediaciones pedagógicas híbridas en las 10 localidades que integran la red territorial en la Línea Sur, Valle Medio y Costa Atlántica rionegrina</w:t>
       </w:r>
       <w:r>
         <w:t xml:space="preserve"> </w:t>
@@ -4887,8 +4958,8 @@
         <w:t xml:space="preserve">, demandando competencias de tutoría virtual que actualmente no son ponderadas formativamente por los instrumentos evaluativos vigentes.</w:t>
       </w:r>
     </w:p>
-    <w:bookmarkEnd w:id="42"/>
-    <w:bookmarkStart w:id="43" w:name="Xdd2f1928b167b346feb3db91e0e80e813fe5a54"/>
+    <w:bookmarkEnd w:id="45"/>
+    <w:bookmarkStart w:id="46" w:name="Xdd2f1928b167b346feb3db91e0e80e813fe5a54"/>
     <w:p>
       <w:pPr>
         <w:pStyle w:val="Heading3"/>
@@ -4931,10 +5002,10 @@
         <w:br w:type="page"/>
       </w:r>
     </w:p>
-    <w:bookmarkEnd w:id="43"/>
-    <w:bookmarkEnd w:id="44"/>
-    <w:bookmarkEnd w:id="45"/>
-    <w:bookmarkStart w:id="64" w:name="X939220d599d9f2e6ec6ec3fcbd9b7f02ab2b703"/>
+    <w:bookmarkEnd w:id="46"/>
+    <w:bookmarkEnd w:id="47"/>
+    <w:bookmarkEnd w:id="48"/>
+    <w:bookmarkStart w:id="67" w:name="X939220d599d9f2e6ec6ec3fcbd9b7f02ab2b703"/>
     <w:p>
       <w:pPr>
         <w:pStyle w:val="Heading1"/>
@@ -4950,7 +5021,7 @@
         <w:t xml:space="preserve">Tercera parte de la estructura del Proyecto de investigación de TFG</w:t>
       </w:r>
     </w:p>
-    <w:bookmarkStart w:id="57" w:name="X22c16082f4fb76f7871fc247d0300beb3151369"/>
+    <w:bookmarkStart w:id="60" w:name="X22c16082f4fb76f7871fc247d0300beb3151369"/>
     <w:p>
       <w:pPr>
         <w:pStyle w:val="Heading2"/>
@@ -4974,7 +5045,7 @@
         <w:t xml:space="preserve">Este capítulo define el diseño metodológico, la muestra, los instrumentos de recolección y los procedimientos analíticos para evaluar las condiciones de factibilidad en el Departamento de Administración Pública del CURZAS-UNCo.</w:t>
       </w:r>
     </w:p>
-    <w:bookmarkStart w:id="46" w:name="enfoque-y-diseño-de-la-investigación"/>
+    <w:bookmarkStart w:id="49" w:name="enfoque-y-diseño-de-la-investigación"/>
     <w:p>
       <w:pPr>
         <w:pStyle w:val="Heading3"/>
@@ -5143,8 +5214,8 @@
         <w:t xml:space="preserve">, delimitado temporalmente al ciclo lectivo 2027.</w:t>
       </w:r>
     </w:p>
-    <w:bookmarkEnd w:id="46"/>
-    <w:bookmarkStart w:id="51" w:name="población-muestra-y-unidades-de-análisis"/>
+    <w:bookmarkEnd w:id="49"/>
+    <w:bookmarkStart w:id="54" w:name="población-muestra-y-unidades-de-análisis"/>
     <w:p>
       <w:pPr>
         <w:pStyle w:val="Heading3"/>
@@ -5190,7 +5261,7 @@
         <w:t xml:space="preserve">, los componentes empíricos del estudio se definen de manera taxativa y cuantitativamente delimitada:</w:t>
       </w:r>
     </w:p>
-    <w:bookmarkStart w:id="47" w:name="población-o-universo-de-estudio-n"/>
+    <w:bookmarkStart w:id="50" w:name="población-o-universo-de-estudio-n"/>
     <w:p>
       <w:pPr>
         <w:pStyle w:val="Heading4"/>
@@ -5267,7 +5338,7 @@
         <w:t xml:space="preserve"> </w:t>
       </w:r>
       <w:r>
-        <w:t xml:space="preserve">Totalidad de los profesores y auxiliares docentes (regulares e interinos) con designación activa frente a cátedra en el Departamento de Administración Pública, distribuidos entre las asignaturas presenciales de sede Viedma y los espacios con mediación tecnológica y tutoría en la Red de Nodos Universitarios (Sierra Grande, Valcheta, Los Menucos y Ramos Mexía).</w:t>
+        <w:t xml:space="preserve">Totalidad de los profesores y auxiliares docentes (regulares e interinos) con designación activa frente a cátedra en el Departamento de Administración Pública, distribuidos entre las asignaturas presenciales de sede Viedma y los espacios con mediación tecnológica y tutoría en los 10 Nodos Universitarios de la red territorial (Valcheta, Ramos Mexía, Sierra Colorada, Los Menucos, Maquinchao, Ingeniero Jacobacci, San Antonio Oeste / Las Grutas, Sierra Grande, General Conesa y Río Colorado).</w:t>
       </w:r>
     </w:p>
     <w:p>
@@ -5433,8 +5504,8 @@
         <w:t xml:space="preserve">(Mayo 2027), mediante el acceso a los registros oficiales del Departamento de Alumnos, la Secretaría Académica del CURZAS y las actas de cursada del sistema SIU-Guaraní, previa autorización formal de las autoridades departamentales a través de la solicitud de aval académico (Anexo III).</w:t>
       </w:r>
     </w:p>
-    <w:bookmarkEnd w:id="47"/>
-    <w:bookmarkStart w:id="48" w:name="Xc8ab29830eeae3f4bf036160f98f9333e6ab7f4"/>
+    <w:bookmarkEnd w:id="50"/>
+    <w:bookmarkStart w:id="51" w:name="Xc8ab29830eeae3f4bf036160f98f9333e6ab7f4"/>
     <w:p>
       <w:pPr>
         <w:pStyle w:val="Heading4"/>
@@ -5504,8 +5575,8 @@
         <w:t xml:space="preserve">Los actores situados individuales y colectivos que experimentan cotidianamente la práctica formativa y de gestión (docentes en ejercicio, directivos académicos, estudiantes avanzados y dirigentes paritarios).</w:t>
       </w:r>
     </w:p>
-    <w:bookmarkEnd w:id="48"/>
-    <w:bookmarkStart w:id="49" w:name="muestra-y-tipos-de-muestreo-n"/>
+    <w:bookmarkEnd w:id="51"/>
+    <w:bookmarkStart w:id="52" w:name="muestra-y-tipos-de-muestreo-n"/>
     <w:p>
       <w:pPr>
         <w:pStyle w:val="Heading4"/>
@@ -5749,8 +5820,8 @@
         <w:t xml:space="preserve">30 estudiantes regulares de tramos avanzados (representa cerca del 23% de la matrícula activa de ciclos superiores).</w:t>
       </w:r>
     </w:p>
-    <w:bookmarkEnd w:id="49"/>
-    <w:bookmarkStart w:id="50" w:name="X998a09b61a83e90f29025d20db168181e35de2d"/>
+    <w:bookmarkEnd w:id="52"/>
+    <w:bookmarkStart w:id="53" w:name="X998a09b61a83e90f29025d20db168181e35de2d"/>
     <w:p>
       <w:pPr>
         <w:pStyle w:val="Heading4"/>
@@ -5901,9 +5972,9 @@
         <w:t xml:space="preserve">Aquellos con licencia total (año sabático, maternidad o enfermedad prolongada) durante todo el período del relevamiento de campo.</w:t>
       </w:r>
     </w:p>
-    <w:bookmarkEnd w:id="50"/>
-    <w:bookmarkEnd w:id="51"/>
-    <w:bookmarkStart w:id="52" w:name="X8096e9b2347bf8942081b47ccb7c360d1ea8f9f"/>
+    <w:bookmarkEnd w:id="53"/>
+    <w:bookmarkEnd w:id="54"/>
+    <w:bookmarkStart w:id="55" w:name="X8096e9b2347bf8942081b47ccb7c360d1ea8f9f"/>
     <w:p>
       <w:pPr>
         <w:pStyle w:val="Heading3"/>
@@ -6076,8 +6147,8 @@
         <w:br w:type="page"/>
       </w:r>
     </w:p>
-    <w:bookmarkEnd w:id="52"/>
-    <w:bookmarkStart w:id="53" w:name="matriz-de-operacionalización"/>
+    <w:bookmarkEnd w:id="55"/>
+    <w:bookmarkStart w:id="56" w:name="matriz-de-operacionalización"/>
     <w:p>
       <w:pPr>
         <w:pStyle w:val="Heading3"/>
@@ -7165,8 +7236,8 @@
         <w:br w:type="page"/>
       </w:r>
     </w:p>
-    <w:bookmarkEnd w:id="53"/>
-    <w:bookmarkStart w:id="54" w:name="X9c80af5c4be12b01258364981172ba0e73926b7"/>
+    <w:bookmarkEnd w:id="56"/>
+    <w:bookmarkStart w:id="57" w:name="X9c80af5c4be12b01258364981172ba0e73926b7"/>
     <w:p>
       <w:pPr>
         <w:pStyle w:val="Heading3"/>
@@ -7419,8 +7490,8 @@
         <w:t xml:space="preserve">Trabajo Final de Graduación aprobado.</w:t>
       </w:r>
     </w:p>
-    <w:bookmarkEnd w:id="54"/>
-    <w:bookmarkStart w:id="55" w:name="procesamiento-y-análisis-de-datos"/>
+    <w:bookmarkEnd w:id="57"/>
+    <w:bookmarkStart w:id="58" w:name="procesamiento-y-análisis-de-datos"/>
     <w:p>
       <w:pPr>
         <w:pStyle w:val="Heading3"/>
@@ -7533,8 +7604,8 @@
         <w:t xml:space="preserve">, se contrastan de manera sistemática los tres corpus de datos: las prescripciones estatutarias, los testimonios en profundidad y las frecuencias del sondeo. El propósito consiste en ponderar la coherencia entre lo normado, lo viable técnicamente y lo aceptado culturalmente por la comunidad académica.</w:t>
       </w:r>
     </w:p>
-    <w:bookmarkEnd w:id="55"/>
-    <w:bookmarkStart w:id="56" w:name="consideraciones-éticas"/>
+    <w:bookmarkEnd w:id="58"/>
+    <w:bookmarkStart w:id="59" w:name="consideraciones-éticas"/>
     <w:p>
       <w:pPr>
         <w:pStyle w:val="Heading3"/>
@@ -7655,9 +7726,9 @@
         <w:br w:type="page"/>
       </w:r>
     </w:p>
-    <w:bookmarkEnd w:id="56"/>
-    <w:bookmarkEnd w:id="57"/>
-    <w:bookmarkStart w:id="58" w:name="cronograma-de-actividades"/>
+    <w:bookmarkEnd w:id="59"/>
+    <w:bookmarkEnd w:id="60"/>
+    <w:bookmarkStart w:id="61" w:name="cronograma-de-actividades"/>
     <w:p>
       <w:pPr>
         <w:pStyle w:val="Heading2"/>
@@ -8495,8 +8566,8 @@
         <w:br w:type="page"/>
       </w:r>
     </w:p>
-    <w:bookmarkEnd w:id="58"/>
-    <w:bookmarkStart w:id="63" w:name="viabilidad-del-proyecto"/>
+    <w:bookmarkEnd w:id="61"/>
+    <w:bookmarkStart w:id="66" w:name="viabilidad-del-proyecto"/>
     <w:p>
       <w:pPr>
         <w:pStyle w:val="Heading2"/>
@@ -8520,7 +8591,7 @@
         <w:t xml:space="preserve">Conforme a la Resolución CD-CURZAS N° 266/23, se especifican los recursos económicos, humanos y técnicos requeridos:</w:t>
       </w:r>
     </w:p>
-    <w:bookmarkStart w:id="59" w:name="recursos-económicos-y-presupuesto"/>
+    <w:bookmarkStart w:id="62" w:name="recursos-económicos-y-presupuesto"/>
     <w:p>
       <w:pPr>
         <w:pStyle w:val="Heading3"/>
@@ -8987,11 +9058,11 @@
         <w:t xml:space="preserve"> </w:t>
       </w:r>
       <w:r>
-        <w:t xml:space="preserve">El relevamiento en los Nodos Universitarios (Sierra Grande, Valcheta, Los Menucos y Ramos Mexía) se realizará mediante formularios digitales y salas de videoconferencia institucionales, sin generar costos extraordinarios de traslado físico.</w:t>
-      </w:r>
-    </w:p>
-    <w:bookmarkEnd w:id="59"/>
-    <w:bookmarkStart w:id="60" w:name="recursos-humanos-y-dedicación"/>
+        <w:t xml:space="preserve">El relevamiento en los 10 Nodos Universitarios de la red territorial se realizará mediante formularios digitales autoadministrados y salas de videoconferencia institucionales, sin generar costos extraordinarios de traslado físico.</w:t>
+      </w:r>
+    </w:p>
+    <w:bookmarkEnd w:id="62"/>
+    <w:bookmarkStart w:id="63" w:name="recursos-humanos-y-dedicación"/>
     <w:p>
       <w:pPr>
         <w:pStyle w:val="Heading3"/>
@@ -9096,8 +9167,8 @@
         <w:t xml:space="preserve">Docentes, autoridades de departamento, consejeros y estudiantes que colaboren voluntariamente en entrevistas y sondeos.</w:t>
       </w:r>
     </w:p>
-    <w:bookmarkEnd w:id="60"/>
-    <w:bookmarkStart w:id="61" w:name="recursos-técnicos-y-materiales"/>
+    <w:bookmarkEnd w:id="63"/>
+    <w:bookmarkStart w:id="64" w:name="recursos-técnicos-y-materiales"/>
     <w:p>
       <w:pPr>
         <w:pStyle w:val="Heading3"/>
@@ -9166,8 +9237,8 @@
         <w:t xml:space="preserve">(Quarto, Typst, Pandoc) con estándares de formato APA 7ma Edición.</w:t>
       </w:r>
     </w:p>
-    <w:bookmarkEnd w:id="61"/>
-    <w:bookmarkStart w:id="62" w:name="X1839fa070b0cddb93485950ba93c69de9c2c78d"/>
+    <w:bookmarkEnd w:id="64"/>
+    <w:bookmarkStart w:id="65" w:name="X1839fa070b0cddb93485950ba93c69de9c2c78d"/>
     <w:p>
       <w:pPr>
         <w:pStyle w:val="Heading3"/>
@@ -9197,10 +9268,10 @@
         <w:br w:type="page"/>
       </w:r>
     </w:p>
-    <w:bookmarkEnd w:id="62"/>
-    <w:bookmarkEnd w:id="63"/>
-    <w:bookmarkEnd w:id="64"/>
-    <w:bookmarkStart w:id="109" w:name="referencias-bibliográficas"/>
+    <w:bookmarkEnd w:id="65"/>
+    <w:bookmarkEnd w:id="66"/>
+    <w:bookmarkEnd w:id="67"/>
+    <w:bookmarkStart w:id="112" w:name="referencias-bibliográficas"/>
     <w:p>
       <w:pPr>
         <w:pStyle w:val="Heading1"/>
@@ -9217,8 +9288,8 @@
         <w:t xml:space="preserve">Referencias Bibliográficas</w:t>
       </w:r>
     </w:p>
-    <w:bookmarkStart w:id="108" w:name="refs"/>
-    <w:bookmarkStart w:id="65" w:name="ref-aguilar2006"/>
+    <w:bookmarkStart w:id="111" w:name="refs"/>
+    <w:bookmarkStart w:id="68" w:name="ref-aguilar2006"/>
     <w:p>
       <w:pPr>
         <w:pStyle w:val="Bibliography"/>
@@ -9243,8 +9314,8 @@
         <w:t xml:space="preserve">. Fondo de Cultura Económica.</w:t>
       </w:r>
     </w:p>
-    <w:bookmarkEnd w:id="65"/>
-    <w:bookmarkStart w:id="67" w:name="ref-alvarado2019"/>
+    <w:bookmarkEnd w:id="68"/>
+    <w:bookmarkStart w:id="70" w:name="ref-alvarado2019"/>
     <w:p>
       <w:pPr>
         <w:pStyle w:val="Bibliography"/>
@@ -9271,7 +9342,7 @@
       <w:r>
         <w:t xml:space="preserve"> </w:t>
       </w:r>
-      <w:hyperlink r:id="rId66">
+      <w:hyperlink r:id="rId69">
         <w:r>
           <w:rPr>
             <w:rStyle w:val="Hyperlink"/>
@@ -9280,8 +9351,8 @@
         </w:r>
       </w:hyperlink>
     </w:p>
-    <w:bookmarkEnd w:id="67"/>
-    <w:bookmarkStart w:id="68" w:name="ref-bardin2002"/>
+    <w:bookmarkEnd w:id="70"/>
+    <w:bookmarkStart w:id="71" w:name="ref-bardin2002"/>
     <w:p>
       <w:pPr>
         <w:pStyle w:val="Bibliography"/>
@@ -9306,8 +9377,8 @@
         <w:t xml:space="preserve">. Ediciones Akal.</w:t>
       </w:r>
     </w:p>
-    <w:bookmarkEnd w:id="68"/>
-    <w:bookmarkStart w:id="69" w:name="ref-cao2021"/>
+    <w:bookmarkEnd w:id="71"/>
+    <w:bookmarkStart w:id="72" w:name="ref-cao2021"/>
     <w:p>
       <w:pPr>
         <w:pStyle w:val="Bibliography"/>
@@ -9332,8 +9403,8 @@
         <w:t xml:space="preserve">. Instituto Nacional de la Administración Pública (INAP).</w:t>
       </w:r>
     </w:p>
-    <w:bookmarkEnd w:id="69"/>
-    <w:bookmarkStart w:id="71" w:name="ref-cao2023"/>
+    <w:bookmarkEnd w:id="72"/>
+    <w:bookmarkStart w:id="74" w:name="ref-cao2023"/>
     <w:p>
       <w:pPr>
         <w:pStyle w:val="Bibliography"/>
@@ -9373,7 +9444,7 @@
       <w:r>
         <w:t xml:space="preserve"> </w:t>
       </w:r>
-      <w:hyperlink r:id="rId70">
+      <w:hyperlink r:id="rId73">
         <w:r>
           <w:rPr>
             <w:rStyle w:val="Hyperlink"/>
@@ -9382,8 +9453,8 @@
         </w:r>
       </w:hyperlink>
     </w:p>
-    <w:bookmarkEnd w:id="71"/>
-    <w:bookmarkStart w:id="72" w:name="ref-chiavenato2020"/>
+    <w:bookmarkEnd w:id="74"/>
+    <w:bookmarkStart w:id="75" w:name="ref-chiavenato2020"/>
     <w:p>
       <w:pPr>
         <w:pStyle w:val="Bibliography"/>
@@ -9411,8 +9482,8 @@
         <w:t xml:space="preserve">(5.ª ed.). McGraw-Hill Interamericana.</w:t>
       </w:r>
     </w:p>
-    <w:bookmarkEnd w:id="72"/>
-    <w:bookmarkStart w:id="74" w:name="ref-curza2022"/>
+    <w:bookmarkEnd w:id="75"/>
+    <w:bookmarkStart w:id="77" w:name="ref-curza2022"/>
     <w:p>
       <w:pPr>
         <w:pStyle w:val="Bibliography"/>
@@ -9439,7 +9510,7 @@
       <w:r>
         <w:t xml:space="preserve"> </w:t>
       </w:r>
-      <w:hyperlink r:id="rId73">
+      <w:hyperlink r:id="rId76">
         <w:r>
           <w:rPr>
             <w:rStyle w:val="Hyperlink"/>
@@ -9448,8 +9519,8 @@
         </w:r>
       </w:hyperlink>
     </w:p>
-    <w:bookmarkEnd w:id="74"/>
-    <w:bookmarkStart w:id="75" w:name="ref-uncocurzas2023"/>
+    <w:bookmarkEnd w:id="77"/>
+    <w:bookmarkStart w:id="78" w:name="ref-uncocurzas2023"/>
     <w:p>
       <w:pPr>
         <w:pStyle w:val="Bibliography"/>
@@ -9474,8 +9545,8 @@
         <w:t xml:space="preserve">. Universidad Nacional del Comahue.</w:t>
       </w:r>
     </w:p>
-    <w:bookmarkEnd w:id="75"/>
-    <w:bookmarkStart w:id="77" w:name="ref-delagarza2001"/>
+    <w:bookmarkEnd w:id="78"/>
+    <w:bookmarkStart w:id="80" w:name="ref-delagarza2001"/>
     <w:p>
       <w:pPr>
         <w:pStyle w:val="Bibliography"/>
@@ -9515,7 +9586,7 @@
       <w:r>
         <w:t xml:space="preserve"> </w:t>
       </w:r>
-      <w:hyperlink r:id="rId76">
+      <w:hyperlink r:id="rId79">
         <w:r>
           <w:rPr>
             <w:rStyle w:val="Hyperlink"/>
@@ -9524,8 +9595,8 @@
         </w:r>
       </w:hyperlink>
     </w:p>
-    <w:bookmarkEnd w:id="77"/>
-    <w:bookmarkStart w:id="78" w:name="ref-pen2015"/>
+    <w:bookmarkEnd w:id="80"/>
+    <w:bookmarkStart w:id="81" w:name="ref-pen2015"/>
     <w:p>
       <w:pPr>
         <w:pStyle w:val="Bibliography"/>
@@ -9537,8 +9608,8 @@
         <w:t xml:space="preserve">Decreto N° 1246/2015. Convenio Colectivo de Trabajo para los Docentes de las Instituciones Universitarias Nacionales (2015).</w:t>
       </w:r>
     </w:p>
-    <w:bookmarkEnd w:id="78"/>
-    <w:bookmarkStart w:id="79" w:name="ref-denzin1978"/>
+    <w:bookmarkEnd w:id="81"/>
+    <w:bookmarkStart w:id="82" w:name="ref-denzin1978"/>
     <w:p>
       <w:pPr>
         <w:pStyle w:val="Bibliography"/>
@@ -9566,8 +9637,8 @@
         <w:t xml:space="preserve">(2.ª ed.). McGraw-Hill.</w:t>
       </w:r>
     </w:p>
-    <w:bookmarkEnd w:id="79"/>
-    <w:bookmarkStart w:id="81" w:name="ref-flyvbjerg2005"/>
+    <w:bookmarkEnd w:id="82"/>
+    <w:bookmarkStart w:id="84" w:name="ref-flyvbjerg2005"/>
     <w:p>
       <w:pPr>
         <w:pStyle w:val="Bibliography"/>
@@ -9594,7 +9665,7 @@
       <w:r>
         <w:t xml:space="preserve"> </w:t>
       </w:r>
-      <w:hyperlink r:id="rId80">
+      <w:hyperlink r:id="rId83">
         <w:r>
           <w:rPr>
             <w:rStyle w:val="Hyperlink"/>
@@ -9603,8 +9674,8 @@
         </w:r>
       </w:hyperlink>
     </w:p>
-    <w:bookmarkEnd w:id="81"/>
-    <w:bookmarkStart w:id="82" w:name="ref-gimenez2012"/>
+    <w:bookmarkEnd w:id="84"/>
+    <w:bookmarkStart w:id="85" w:name="ref-gimenez2012"/>
     <w:p>
       <w:pPr>
         <w:pStyle w:val="Bibliography"/>
@@ -9642,8 +9713,8 @@
         <w:t xml:space="preserve">(13), 33-52.</w:t>
       </w:r>
     </w:p>
-    <w:bookmarkEnd w:id="82"/>
-    <w:bookmarkStart w:id="83" w:name="ref-glaser1967"/>
+    <w:bookmarkEnd w:id="85"/>
+    <w:bookmarkStart w:id="86" w:name="ref-glaser1967"/>
     <w:p>
       <w:pPr>
         <w:pStyle w:val="Bibliography"/>
@@ -9668,8 +9739,8 @@
         <w:t xml:space="preserve">. Aldine Publishing Company.</w:t>
       </w:r>
     </w:p>
-    <w:bookmarkEnd w:id="83"/>
-    <w:bookmarkStart w:id="84" w:name="ref-hernandezsampieri2014"/>
+    <w:bookmarkEnd w:id="86"/>
+    <w:bookmarkStart w:id="87" w:name="ref-hernandezsampieri2014"/>
     <w:p>
       <w:pPr>
         <w:pStyle w:val="Bibliography"/>
@@ -9697,8 +9768,8 @@
         <w:t xml:space="preserve">(6.ª ed.). McGraw-Hill Interamericana.</w:t>
       </w:r>
     </w:p>
-    <w:bookmarkEnd w:id="84"/>
-    <w:bookmarkStart w:id="85" w:name="ref-jimenez2008"/>
+    <w:bookmarkEnd w:id="87"/>
+    <w:bookmarkStart w:id="88" w:name="ref-jimenez2008"/>
     <w:p>
       <w:pPr>
         <w:pStyle w:val="Bibliography"/>
@@ -9726,8 +9797,8 @@
         <w:t xml:space="preserve">(pp. 27-42). Universidad Pedagógica Nacional / CLACSO.</w:t>
       </w:r>
     </w:p>
-    <w:bookmarkEnd w:id="85"/>
-    <w:bookmarkStart w:id="86" w:name="ref-lepsinger2009"/>
+    <w:bookmarkEnd w:id="88"/>
+    <w:bookmarkStart w:id="89" w:name="ref-lepsinger2009"/>
     <w:p>
       <w:pPr>
         <w:pStyle w:val="Bibliography"/>
@@ -9755,8 +9826,8 @@
         <w:t xml:space="preserve">(2.ª ed.). Pfeiffer.</w:t>
       </w:r>
     </w:p>
-    <w:bookmarkEnd w:id="86"/>
-    <w:bookmarkStart w:id="87" w:name="ref-ministerio1995"/>
+    <w:bookmarkEnd w:id="89"/>
+    <w:bookmarkStart w:id="90" w:name="ref-ministerio1995"/>
     <w:p>
       <w:pPr>
         <w:pStyle w:val="Bibliography"/>
@@ -9768,8 +9839,8 @@
         <w:t xml:space="preserve">Ley N° 24.521 de Educación Superior (1995).</w:t>
       </w:r>
     </w:p>
-    <w:bookmarkEnd w:id="87"/>
-    <w:bookmarkStart w:id="88" w:name="ref-ley25326"/>
+    <w:bookmarkEnd w:id="90"/>
+    <w:bookmarkStart w:id="91" w:name="ref-ley25326"/>
     <w:p>
       <w:pPr>
         <w:pStyle w:val="Bibliography"/>
@@ -9781,8 +9852,8 @@
         <w:t xml:space="preserve">Ley N° 25.326: Protección de los Datos Personales (2000).</w:t>
       </w:r>
     </w:p>
-    <w:bookmarkEnd w:id="88"/>
-    <w:bookmarkStart w:id="89" w:name="ref-longo2006"/>
+    <w:bookmarkEnd w:id="91"/>
+    <w:bookmarkStart w:id="92" w:name="ref-longo2006"/>
     <w:p>
       <w:pPr>
         <w:pStyle w:val="Bibliography"/>
@@ -9807,8 +9878,8 @@
         <w:t xml:space="preserve">. Paidós.</w:t>
       </w:r>
     </w:p>
-    <w:bookmarkEnd w:id="89"/>
-    <w:bookmarkStart w:id="90" w:name="ref-marquina2012"/>
+    <w:bookmarkEnd w:id="92"/>
+    <w:bookmarkStart w:id="93" w:name="ref-marquina2012"/>
     <w:p>
       <w:pPr>
         <w:pStyle w:val="Bibliography"/>
@@ -9846,8 +9917,8 @@
         <w:t xml:space="preserve">(15), 35-48.</w:t>
       </w:r>
     </w:p>
-    <w:bookmarkEnd w:id="90"/>
-    <w:bookmarkStart w:id="91" w:name="ref-matus1993"/>
+    <w:bookmarkEnd w:id="93"/>
+    <w:bookmarkStart w:id="94" w:name="ref-matus1993"/>
     <w:p>
       <w:pPr>
         <w:pStyle w:val="Bibliography"/>
@@ -9872,8 +9943,8 @@
         <w:t xml:space="preserve">. Fundación ALTIDIR.</w:t>
       </w:r>
     </w:p>
-    <w:bookmarkEnd w:id="91"/>
-    <w:bookmarkStart w:id="93" w:name="ref-obando2014"/>
+    <w:bookmarkEnd w:id="94"/>
+    <w:bookmarkStart w:id="96" w:name="ref-obando2014"/>
     <w:p>
       <w:pPr>
         <w:pStyle w:val="Bibliography"/>
@@ -9913,7 +9984,7 @@
       <w:r>
         <w:t xml:space="preserve"> </w:t>
       </w:r>
-      <w:hyperlink r:id="rId92">
+      <w:hyperlink r:id="rId95">
         <w:r>
           <w:rPr>
             <w:rStyle w:val="Hyperlink"/>
@@ -9922,8 +9993,8 @@
         </w:r>
       </w:hyperlink>
     </w:p>
-    <w:bookmarkEnd w:id="93"/>
-    <w:bookmarkStart w:id="94" w:name="ref-oszlak2020"/>
+    <w:bookmarkEnd w:id="96"/>
+    <w:bookmarkStart w:id="97" w:name="ref-oszlak2020"/>
     <w:p>
       <w:pPr>
         <w:pStyle w:val="Bibliography"/>
@@ -9948,8 +10019,8 @@
         <w:t xml:space="preserve">. Instituto Nacional de la Administración Pública.</w:t>
       </w:r>
     </w:p>
-    <w:bookmarkEnd w:id="94"/>
-    <w:bookmarkStart w:id="95" w:name="ref-perez2021"/>
+    <w:bookmarkEnd w:id="97"/>
+    <w:bookmarkStart w:id="98" w:name="ref-perez2021"/>
     <w:p>
       <w:pPr>
         <w:pStyle w:val="Bibliography"/>
@@ -9987,8 +10058,8 @@
         <w:t xml:space="preserve">(26), 45-58.</w:t>
       </w:r>
     </w:p>
-    <w:bookmarkEnd w:id="95"/>
-    <w:bookmarkStart w:id="97" w:name="ref-reyes2020"/>
+    <w:bookmarkEnd w:id="98"/>
+    <w:bookmarkStart w:id="100" w:name="ref-reyes2020"/>
     <w:p>
       <w:pPr>
         <w:pStyle w:val="Bibliography"/>
@@ -10028,7 +10099,7 @@
       <w:r>
         <w:t xml:space="preserve"> </w:t>
       </w:r>
-      <w:hyperlink r:id="rId96">
+      <w:hyperlink r:id="rId99">
         <w:r>
           <w:rPr>
             <w:rStyle w:val="Hyperlink"/>
@@ -10037,8 +10108,8 @@
         </w:r>
       </w:hyperlink>
     </w:p>
-    <w:bookmarkEnd w:id="97"/>
-    <w:bookmarkStart w:id="98" w:name="ref-sautu2005"/>
+    <w:bookmarkEnd w:id="100"/>
+    <w:bookmarkStart w:id="101" w:name="ref-sautu2005"/>
     <w:p>
       <w:pPr>
         <w:pStyle w:val="Bibliography"/>
@@ -10063,8 +10134,8 @@
         <w:t xml:space="preserve">. Lumiere.</w:t>
       </w:r>
     </w:p>
-    <w:bookmarkEnd w:id="98"/>
-    <w:bookmarkStart w:id="100" w:name="ref-sifuentes2016"/>
+    <w:bookmarkEnd w:id="101"/>
+    <w:bookmarkStart w:id="103" w:name="ref-sifuentes2016"/>
     <w:p>
       <w:pPr>
         <w:pStyle w:val="Bibliography"/>
@@ -10104,7 +10175,7 @@
       <w:r>
         <w:t xml:space="preserve"> </w:t>
       </w:r>
-      <w:hyperlink r:id="rId99">
+      <w:hyperlink r:id="rId102">
         <w:r>
           <w:rPr>
             <w:rStyle w:val="Hyperlink"/>
@@ -10113,8 +10184,8 @@
         </w:r>
       </w:hyperlink>
     </w:p>
-    <w:bookmarkEnd w:id="100"/>
-    <w:bookmarkStart w:id="102" w:name="ref-torraco2016"/>
+    <w:bookmarkEnd w:id="103"/>
+    <w:bookmarkStart w:id="105" w:name="ref-torraco2016"/>
     <w:p>
       <w:pPr>
         <w:pStyle w:val="Bibliography"/>
@@ -10154,7 +10225,7 @@
       <w:r>
         <w:t xml:space="preserve"> </w:t>
       </w:r>
-      <w:hyperlink r:id="rId101">
+      <w:hyperlink r:id="rId104">
         <w:r>
           <w:rPr>
             <w:rStyle w:val="Hyperlink"/>
@@ -10163,8 +10234,8 @@
         </w:r>
       </w:hyperlink>
     </w:p>
-    <w:bookmarkEnd w:id="102"/>
-    <w:bookmarkStart w:id="104" w:name="ref-unco1997"/>
+    <w:bookmarkEnd w:id="105"/>
+    <w:bookmarkStart w:id="107" w:name="ref-unco1997"/>
     <w:p>
       <w:pPr>
         <w:pStyle w:val="Bibliography"/>
@@ -10191,7 +10262,7 @@
       <w:r>
         <w:t xml:space="preserve"> </w:t>
       </w:r>
-      <w:hyperlink r:id="rId103">
+      <w:hyperlink r:id="rId106">
         <w:r>
           <w:rPr>
             <w:rStyle w:val="Hyperlink"/>
@@ -10200,8 +10271,8 @@
         </w:r>
       </w:hyperlink>
     </w:p>
-    <w:bookmarkEnd w:id="104"/>
-    <w:bookmarkStart w:id="106" w:name="ref-unco2025"/>
+    <w:bookmarkEnd w:id="107"/>
+    <w:bookmarkStart w:id="109" w:name="ref-unco2025"/>
     <w:p>
       <w:pPr>
         <w:pStyle w:val="Bibliography"/>
@@ -10228,7 +10299,7 @@
       <w:r>
         <w:t xml:space="preserve"> </w:t>
       </w:r>
-      <w:hyperlink r:id="rId105">
+      <w:hyperlink r:id="rId108">
         <w:r>
           <w:rPr>
             <w:rStyle w:val="Hyperlink"/>
@@ -10237,8 +10308,8 @@
         </w:r>
       </w:hyperlink>
     </w:p>
-    <w:bookmarkEnd w:id="106"/>
-    <w:bookmarkStart w:id="107" w:name="ref-wainerman2011"/>
+    <w:bookmarkEnd w:id="109"/>
+    <w:bookmarkStart w:id="110" w:name="ref-wainerman2011"/>
     <w:p>
       <w:pPr>
         <w:pStyle w:val="Bibliography"/>
@@ -10266,15 +10337,15 @@
         <w:t xml:space="preserve">(4.ª ed.). Manantial.</w:t>
       </w:r>
     </w:p>
-    <w:bookmarkEnd w:id="107"/>
-    <w:bookmarkEnd w:id="108"/>
+    <w:bookmarkEnd w:id="110"/>
+    <w:bookmarkEnd w:id="111"/>
     <w:p>
       <w:r>
         <w:br w:type="page"/>
       </w:r>
     </w:p>
-    <w:bookmarkEnd w:id="109"/>
-    <w:bookmarkStart w:id="117" w:name="anexos-metodológicos"/>
+    <w:bookmarkEnd w:id="112"/>
+    <w:bookmarkStart w:id="120" w:name="anexos-metodológicos"/>
     <w:p>
       <w:pPr>
         <w:pStyle w:val="Heading1"/>
@@ -10292,7 +10363,7 @@
         <w:t xml:space="preserve">Anexos Metodológicos</w:t>
       </w:r>
     </w:p>
-    <w:bookmarkStart w:id="113" w:name="X8a4bd6135b680293145e26a5b92e72f8957a555"/>
+    <w:bookmarkStart w:id="116" w:name="X8a4bd6135b680293145e26a5b92e72f8957a555"/>
     <w:p>
       <w:pPr>
         <w:pStyle w:val="Heading3"/>
@@ -10373,7 +10444,7 @@
         <w:t xml:space="preserve">Relevar opiniones, percepciones y juicios críticos sobre los mecanismos actuales de evaluación docente y las condiciones de factibilidad para un circuito formativo 360° adaptado a la singularidad institucional.</w:t>
       </w:r>
     </w:p>
-    <w:bookmarkStart w:id="110" w:name="X3d0159f788aeb954922d9917573028760542890"/>
+    <w:bookmarkStart w:id="113" w:name="X3d0159f788aeb954922d9917573028760542890"/>
     <w:p>
       <w:pPr>
         <w:pStyle w:val="Heading4"/>
@@ -10560,8 +10631,8 @@
         <w:t xml:space="preserve">¿De qué forma deberían vincularse los resultados con el Programa Anual de Capacitación Docente (Art. 76 del Estatuto UNCo)?</w:t>
       </w:r>
     </w:p>
-    <w:bookmarkEnd w:id="110"/>
-    <w:bookmarkStart w:id="111" w:name="X0f5478bf378498a567f3b1fa4c8b45406ac87b1"/>
+    <w:bookmarkEnd w:id="113"/>
+    <w:bookmarkStart w:id="114" w:name="X0f5478bf378498a567f3b1fa4c8b45406ac87b1"/>
     <w:p>
       <w:pPr>
         <w:pStyle w:val="Heading4"/>
@@ -10623,8 +10694,8 @@
         <w:t xml:space="preserve">¿Qué mecanismos de veeduría y gobernanza gremial deberían incorporarse en la administración y custodia técnica de los formularios para otorgar plena certeza de que los datos diagnósticos no serán transferidos a legajos ni utilizados por jurados de permanencia o acreditación?</w:t>
       </w:r>
     </w:p>
-    <w:bookmarkEnd w:id="111"/>
-    <w:bookmarkStart w:id="112" w:name="Xd8dec2b8a7f90a67e87e467aa5930d6b0d4f51b"/>
+    <w:bookmarkEnd w:id="114"/>
+    <w:bookmarkStart w:id="115" w:name="Xd8dec2b8a7f90a67e87e467aa5930d6b0d4f51b"/>
     <w:p>
       <w:pPr>
         <w:pStyle w:val="Heading4"/>
@@ -10691,9 +10762,9 @@
         <w:br w:type="page"/>
       </w:r>
     </w:p>
-    <w:bookmarkEnd w:id="112"/>
-    <w:bookmarkEnd w:id="113"/>
-    <w:bookmarkStart w:id="114" w:name="Xed927c32308fb922173a9e4e6308883f42ff086"/>
+    <w:bookmarkEnd w:id="115"/>
+    <w:bookmarkEnd w:id="116"/>
+    <w:bookmarkStart w:id="117" w:name="Xed927c32308fb922173a9e4e6308883f42ff086"/>
     <w:p>
       <w:pPr>
         <w:pStyle w:val="Heading3"/>
@@ -12310,8 +12381,8 @@
         <w:br w:type="page"/>
       </w:r>
     </w:p>
-    <w:bookmarkEnd w:id="114"/>
-    <w:bookmarkStart w:id="115" w:name="X2fe5c967a6121280ba4c78ad136dc18f1f34381"/>
+    <w:bookmarkEnd w:id="117"/>
+    <w:bookmarkStart w:id="118" w:name="X2fe5c967a6121280ba4c78ad136dc18f1f34381"/>
     <w:p>
       <w:pPr>
         <w:pStyle w:val="Heading3"/>
@@ -12592,8 +12663,8 @@
         <w:br w:type="page"/>
       </w:r>
     </w:p>
-    <w:bookmarkEnd w:id="115"/>
-    <w:bookmarkStart w:id="116" w:name="Xdd43486170bd3838ba53edb989ff446467f8d87"/>
+    <w:bookmarkEnd w:id="118"/>
+    <w:bookmarkStart w:id="119" w:name="Xdd43486170bd3838ba53edb989ff446467f8d87"/>
     <w:p>
       <w:pPr>
         <w:pStyle w:val="Heading3"/>
@@ -12969,8 +13040,8 @@
         </w:tc>
       </w:tr>
     </w:tbl>
-    <w:bookmarkEnd w:id="116"/>
-    <w:bookmarkEnd w:id="117"/>
+    <w:bookmarkEnd w:id="119"/>
+    <w:bookmarkEnd w:id="120"/>
     <w:sectPr>
       <w:footerReference w:type="default" r:id="rId11"/>
       <w:footnotePr>

</xml_diff>

<commit_message>
feat: add territorial map SVG asset and preliminary test scripts
</commit_message>
<xml_diff>
--- a/Entregas/Actividad 4/TP4_Ayarachi_Fuentes.docx
+++ b/Entregas/Actividad 4/TP4_Ayarachi_Fuentes.docx
@@ -2191,9 +2191,9 @@
       <w:r>
         <w:drawing>
           <wp:inline>
-            <wp:extent cx="4907280" cy="3336844"/>
+            <wp:extent cx="4907280" cy="3154680"/>
             <wp:effectExtent b="0" l="0" r="0" t="0"/>
-            <wp:docPr descr="Red Territorial de Nodos Universitarios del CURZAS-UNCo (Resolución CD-CURZA N° 196/2022)." title="" id="18" name="Picture"/>
+            <wp:docPr descr="Red Territorial de Nodos Universitarios del CURZAS-UNCo (Resolución CD-CURZA N° 196/2022). Elaboración propia." title="" id="18" name="Picture"/>
             <a:graphic>
               <a:graphicData uri="http://schemas.openxmlformats.org/drawingml/2006/picture">
                 <pic:pic>
@@ -2221,7 +2221,7 @@
                   <pic:spPr bwMode="auto">
                     <a:xfrm>
                       <a:off x="0" y="0"/>
-                      <a:ext cx="4907280" cy="3336844"/>
+                      <a:ext cx="4907280" cy="3154680"/>
                     </a:xfrm>
                     <a:prstGeom prst="rect">
                       <a:avLst/>
@@ -2249,7 +2249,7 @@
           <w:i/>
           <w:iCs/>
         </w:rPr>
-        <w:t xml:space="preserve">Red Territorial de Nodos Universitarios del CURZAS-UNCo (Resolución CD-CURZA N° 196/2022).</w:t>
+        <w:t xml:space="preserve">Red Territorial de Nodos Universitarios del CURZAS-UNCo (Resolución CD-CURZA N° 196/2022). Elaboración propia.</w:t>
       </w:r>
     </w:p>
     <w:p>

</xml_diff>